<commit_message>
some file changes and notes update
</commit_message>
<xml_diff>
--- a/JAVASCRIPT NOTES/JAVASCRIPT NOTES (2) AFTER BASICS.docx
+++ b/JAVASCRIPT NOTES/JAVASCRIPT NOTES (2) AFTER BASICS.docx
@@ -31,6 +31,2294 @@
           <w:u w:val="single"/>
         </w:rPr>
         <w:t>35)</w:t>
+      </w:r>
+    </w:p>
+    <w:p>
+      <w:pPr>
+        <w:rPr>
+          <w:b/>
+          <w:bCs/>
+        </w:rPr>
+      </w:pPr>
+      <w:r>
+        <w:rPr>
+          <w:b/>
+          <w:bCs/>
+        </w:rPr>
+        <w:t xml:space="preserve">1. DOM </w:t>
+      </w:r>
+      <w:proofErr w:type="spellStart"/>
+      <w:r>
+        <w:rPr>
+          <w:b/>
+          <w:bCs/>
+        </w:rPr>
+        <w:t>kya</w:t>
+      </w:r>
+      <w:proofErr w:type="spellEnd"/>
+      <w:r>
+        <w:rPr>
+          <w:b/>
+          <w:bCs/>
+        </w:rPr>
+        <w:t xml:space="preserve"> </w:t>
+      </w:r>
+      <w:proofErr w:type="spellStart"/>
+      <w:r>
+        <w:rPr>
+          <w:b/>
+          <w:bCs/>
+        </w:rPr>
+        <w:t>hai</w:t>
+      </w:r>
+      <w:proofErr w:type="spellEnd"/>
+      <w:r>
+        <w:rPr>
+          <w:b/>
+          <w:bCs/>
+        </w:rPr>
+        <w:t>? (Document Object Model)</w:t>
+      </w:r>
+    </w:p>
+    <w:p>
+      <w:r>
+        <w:t xml:space="preserve">Technical terms </w:t>
+      </w:r>
+      <w:proofErr w:type="spellStart"/>
+      <w:r>
+        <w:t>mein</w:t>
+      </w:r>
+      <w:proofErr w:type="spellEnd"/>
+      <w:r>
+        <w:t xml:space="preserve">, DOM ek </w:t>
+      </w:r>
+      <w:r>
+        <w:rPr>
+          <w:b/>
+          <w:bCs/>
+        </w:rPr>
+        <w:t>Programming Interface</w:t>
+      </w:r>
+      <w:r>
+        <w:t xml:space="preserve"> </w:t>
+      </w:r>
+      <w:proofErr w:type="spellStart"/>
+      <w:r>
+        <w:t>hai</w:t>
+      </w:r>
+      <w:proofErr w:type="spellEnd"/>
+      <w:r>
+        <w:t xml:space="preserve">. Jab browser </w:t>
+      </w:r>
+      <w:proofErr w:type="spellStart"/>
+      <w:r>
+        <w:t>kisi</w:t>
+      </w:r>
+      <w:proofErr w:type="spellEnd"/>
+      <w:r>
+        <w:t xml:space="preserve"> HTML page ko load </w:t>
+      </w:r>
+      <w:proofErr w:type="spellStart"/>
+      <w:r>
+        <w:t>karta</w:t>
+      </w:r>
+      <w:proofErr w:type="spellEnd"/>
+      <w:r>
+        <w:t xml:space="preserve"> </w:t>
+      </w:r>
+      <w:proofErr w:type="spellStart"/>
+      <w:r>
+        <w:t>hai</w:t>
+      </w:r>
+      <w:proofErr w:type="spellEnd"/>
+      <w:r>
+        <w:t xml:space="preserve">, </w:t>
+      </w:r>
+      <w:proofErr w:type="spellStart"/>
+      <w:r>
+        <w:t>toh</w:t>
+      </w:r>
+      <w:proofErr w:type="spellEnd"/>
+      <w:r>
+        <w:t xml:space="preserve"> wo </w:t>
+      </w:r>
+      <w:proofErr w:type="spellStart"/>
+      <w:r>
+        <w:t>uska</w:t>
+      </w:r>
+      <w:proofErr w:type="spellEnd"/>
+      <w:r>
+        <w:t xml:space="preserve"> ek "Tree Structure" </w:t>
+      </w:r>
+      <w:proofErr w:type="spellStart"/>
+      <w:r>
+        <w:t>bana</w:t>
+      </w:r>
+      <w:proofErr w:type="spellEnd"/>
+      <w:r>
+        <w:t xml:space="preserve"> </w:t>
+      </w:r>
+      <w:proofErr w:type="spellStart"/>
+      <w:r>
+        <w:t>leta</w:t>
+      </w:r>
+      <w:proofErr w:type="spellEnd"/>
+      <w:r>
+        <w:t xml:space="preserve"> </w:t>
+      </w:r>
+      <w:proofErr w:type="spellStart"/>
+      <w:r>
+        <w:t>hai</w:t>
+      </w:r>
+      <w:proofErr w:type="spellEnd"/>
+      <w:r>
+        <w:t>.</w:t>
+      </w:r>
+    </w:p>
+    <w:p>
+      <w:pPr>
+        <w:numPr>
+          <w:ilvl w:val="0"/>
+          <w:numId w:val="1"/>
+        </w:numPr>
+      </w:pPr>
+      <w:r>
+        <w:rPr>
+          <w:b/>
+          <w:bCs/>
+        </w:rPr>
+        <w:t>The Logic:</w:t>
+      </w:r>
+      <w:r>
+        <w:t xml:space="preserve"> Browser </w:t>
+      </w:r>
+      <w:proofErr w:type="spellStart"/>
+      <w:r>
+        <w:t>tumhare</w:t>
+      </w:r>
+      <w:proofErr w:type="spellEnd"/>
+      <w:r>
+        <w:t xml:space="preserve"> HTML code ko ek </w:t>
+      </w:r>
+      <w:r>
+        <w:rPr>
+          <w:b/>
+          <w:bCs/>
+        </w:rPr>
+        <w:t>Object</w:t>
+      </w:r>
+      <w:r>
+        <w:t xml:space="preserve"> </w:t>
+      </w:r>
+      <w:proofErr w:type="spellStart"/>
+      <w:r>
+        <w:t>mein</w:t>
+      </w:r>
+      <w:proofErr w:type="spellEnd"/>
+      <w:r>
+        <w:t xml:space="preserve"> </w:t>
+      </w:r>
+      <w:proofErr w:type="spellStart"/>
+      <w:r>
+        <w:t>badal</w:t>
+      </w:r>
+      <w:proofErr w:type="spellEnd"/>
+      <w:r>
+        <w:t xml:space="preserve"> </w:t>
+      </w:r>
+      <w:proofErr w:type="spellStart"/>
+      <w:r>
+        <w:t>deta</w:t>
+      </w:r>
+      <w:proofErr w:type="spellEnd"/>
+      <w:r>
+        <w:t xml:space="preserve"> </w:t>
+      </w:r>
+      <w:proofErr w:type="spellStart"/>
+      <w:r>
+        <w:t>hai</w:t>
+      </w:r>
+      <w:proofErr w:type="spellEnd"/>
+      <w:r>
+        <w:t xml:space="preserve"> </w:t>
+      </w:r>
+      <w:proofErr w:type="spellStart"/>
+      <w:r>
+        <w:t>jise</w:t>
+      </w:r>
+      <w:proofErr w:type="spellEnd"/>
+      <w:r>
+        <w:t xml:space="preserve"> hum </w:t>
+      </w:r>
+      <w:proofErr w:type="spellStart"/>
+      <w:proofErr w:type="gramStart"/>
+      <w:r>
+        <w:t>window.document</w:t>
+      </w:r>
+      <w:proofErr w:type="spellEnd"/>
+      <w:proofErr w:type="gramEnd"/>
+      <w:r>
+        <w:t xml:space="preserve"> </w:t>
+      </w:r>
+      <w:proofErr w:type="spellStart"/>
+      <w:r>
+        <w:t>kehte</w:t>
+      </w:r>
+      <w:proofErr w:type="spellEnd"/>
+      <w:r>
+        <w:t xml:space="preserve"> hain.</w:t>
+      </w:r>
+    </w:p>
+    <w:p>
+      <w:pPr>
+        <w:numPr>
+          <w:ilvl w:val="0"/>
+          <w:numId w:val="1"/>
+        </w:numPr>
+      </w:pPr>
+      <w:r>
+        <w:rPr>
+          <w:b/>
+          <w:bCs/>
+        </w:rPr>
+        <w:t>Deep Concept:</w:t>
+      </w:r>
+      <w:r>
+        <w:t xml:space="preserve"> Is structure </w:t>
+      </w:r>
+      <w:proofErr w:type="spellStart"/>
+      <w:r>
+        <w:t>mein</w:t>
+      </w:r>
+      <w:proofErr w:type="spellEnd"/>
+      <w:r>
+        <w:t xml:space="preserve"> harr ek HTML tag (h1, div, p) ek </w:t>
+      </w:r>
+      <w:r>
+        <w:rPr>
+          <w:b/>
+          <w:bCs/>
+        </w:rPr>
+        <w:t>Node</w:t>
+      </w:r>
+      <w:r>
+        <w:t xml:space="preserve"> </w:t>
+      </w:r>
+      <w:proofErr w:type="spellStart"/>
+      <w:r>
+        <w:t>hota</w:t>
+      </w:r>
+      <w:proofErr w:type="spellEnd"/>
+      <w:r>
+        <w:t xml:space="preserve"> </w:t>
+      </w:r>
+      <w:proofErr w:type="spellStart"/>
+      <w:r>
+        <w:t>hai</w:t>
+      </w:r>
+      <w:proofErr w:type="spellEnd"/>
+      <w:r>
+        <w:t xml:space="preserve">. JavaScript </w:t>
+      </w:r>
+      <w:proofErr w:type="spellStart"/>
+      <w:r>
+        <w:t>isi</w:t>
+      </w:r>
+      <w:proofErr w:type="spellEnd"/>
+      <w:r>
+        <w:t xml:space="preserve"> "Object" ka </w:t>
+      </w:r>
+      <w:proofErr w:type="gramStart"/>
+      <w:r>
+        <w:t>use</w:t>
+      </w:r>
+      <w:proofErr w:type="gramEnd"/>
+      <w:r>
+        <w:t xml:space="preserve"> </w:t>
+      </w:r>
+      <w:proofErr w:type="spellStart"/>
+      <w:r>
+        <w:t>karke</w:t>
+      </w:r>
+      <w:proofErr w:type="spellEnd"/>
+      <w:r>
+        <w:t xml:space="preserve"> </w:t>
+      </w:r>
+      <w:proofErr w:type="spellStart"/>
+      <w:r>
+        <w:t>kisi</w:t>
+      </w:r>
+      <w:proofErr w:type="spellEnd"/>
+      <w:r>
+        <w:t xml:space="preserve"> </w:t>
+      </w:r>
+      <w:proofErr w:type="spellStart"/>
+      <w:r>
+        <w:t>bhi</w:t>
+      </w:r>
+      <w:proofErr w:type="spellEnd"/>
+      <w:r>
+        <w:t xml:space="preserve"> element ka rang </w:t>
+      </w:r>
+      <w:proofErr w:type="spellStart"/>
+      <w:r>
+        <w:t>badal</w:t>
+      </w:r>
+      <w:proofErr w:type="spellEnd"/>
+      <w:r>
+        <w:t xml:space="preserve"> </w:t>
+      </w:r>
+      <w:proofErr w:type="spellStart"/>
+      <w:r>
+        <w:t>sakti</w:t>
+      </w:r>
+      <w:proofErr w:type="spellEnd"/>
+      <w:r>
+        <w:t xml:space="preserve"> </w:t>
+      </w:r>
+      <w:proofErr w:type="spellStart"/>
+      <w:r>
+        <w:t>hai</w:t>
+      </w:r>
+      <w:proofErr w:type="spellEnd"/>
+      <w:r>
+        <w:t xml:space="preserve">, text change </w:t>
+      </w:r>
+      <w:proofErr w:type="spellStart"/>
+      <w:r>
+        <w:t>kar</w:t>
+      </w:r>
+      <w:proofErr w:type="spellEnd"/>
+      <w:r>
+        <w:t xml:space="preserve"> </w:t>
+      </w:r>
+      <w:proofErr w:type="spellStart"/>
+      <w:r>
+        <w:t>sakti</w:t>
+      </w:r>
+      <w:proofErr w:type="spellEnd"/>
+      <w:r>
+        <w:t xml:space="preserve"> </w:t>
+      </w:r>
+      <w:proofErr w:type="spellStart"/>
+      <w:r>
+        <w:t>hai</w:t>
+      </w:r>
+      <w:proofErr w:type="spellEnd"/>
+      <w:r>
+        <w:t xml:space="preserve">, </w:t>
+      </w:r>
+      <w:proofErr w:type="spellStart"/>
+      <w:r>
+        <w:t>ya</w:t>
+      </w:r>
+      <w:proofErr w:type="spellEnd"/>
+      <w:r>
+        <w:t xml:space="preserve"> use delete </w:t>
+      </w:r>
+      <w:proofErr w:type="spellStart"/>
+      <w:r>
+        <w:t>bhi</w:t>
+      </w:r>
+      <w:proofErr w:type="spellEnd"/>
+      <w:r>
+        <w:t xml:space="preserve"> </w:t>
+      </w:r>
+      <w:proofErr w:type="spellStart"/>
+      <w:r>
+        <w:t>kar</w:t>
+      </w:r>
+      <w:proofErr w:type="spellEnd"/>
+      <w:r>
+        <w:t xml:space="preserve"> </w:t>
+      </w:r>
+      <w:proofErr w:type="spellStart"/>
+      <w:r>
+        <w:t>sakti</w:t>
+      </w:r>
+      <w:proofErr w:type="spellEnd"/>
+      <w:r>
+        <w:t xml:space="preserve"> </w:t>
+      </w:r>
+      <w:proofErr w:type="spellStart"/>
+      <w:r>
+        <w:t>hai</w:t>
+      </w:r>
+      <w:proofErr w:type="spellEnd"/>
+      <w:r>
+        <w:t>.</w:t>
+      </w:r>
+    </w:p>
+    <w:p>
+      <w:r>
+        <w:pict w14:anchorId="53DA1AC0">
+          <v:rect id="_x0000_i1055" style="width:0;height:1.5pt" o:hralign="center" o:hrstd="t" o:hr="t" fillcolor="#a0a0a0" stroked="f"/>
+        </w:pict>
+      </w:r>
+    </w:p>
+    <w:p>
+      <w:pPr>
+        <w:rPr>
+          <w:b/>
+          <w:bCs/>
+        </w:rPr>
+      </w:pPr>
+      <w:r>
+        <w:rPr>
+          <w:b/>
+          <w:bCs/>
+        </w:rPr>
+        <w:t>2. Window vs Document (The Hierarchy)</w:t>
+      </w:r>
+    </w:p>
+    <w:p>
+      <w:r>
+        <w:t xml:space="preserve">Hitesh sir ne ek bahut important </w:t>
+      </w:r>
+      <w:proofErr w:type="spellStart"/>
+      <w:r>
+        <w:t>farq</w:t>
+      </w:r>
+      <w:proofErr w:type="spellEnd"/>
+      <w:r>
+        <w:t xml:space="preserve"> </w:t>
+      </w:r>
+      <w:proofErr w:type="spellStart"/>
+      <w:r>
+        <w:t>samjhaya</w:t>
+      </w:r>
+      <w:proofErr w:type="spellEnd"/>
+      <w:r>
+        <w:t xml:space="preserve"> </w:t>
+      </w:r>
+      <w:proofErr w:type="spellStart"/>
+      <w:r>
+        <w:t>hai</w:t>
+      </w:r>
+      <w:proofErr w:type="spellEnd"/>
+      <w:r>
+        <w:t xml:space="preserve"> jo beginners ko confuse </w:t>
+      </w:r>
+      <w:proofErr w:type="spellStart"/>
+      <w:r>
+        <w:t>karta</w:t>
+      </w:r>
+      <w:proofErr w:type="spellEnd"/>
+      <w:r>
+        <w:t xml:space="preserve"> </w:t>
+      </w:r>
+      <w:proofErr w:type="spellStart"/>
+      <w:r>
+        <w:t>hai</w:t>
+      </w:r>
+      <w:proofErr w:type="spellEnd"/>
+      <w:r>
+        <w:t>:</w:t>
+      </w:r>
+    </w:p>
+    <w:p>
+      <w:pPr>
+        <w:numPr>
+          <w:ilvl w:val="0"/>
+          <w:numId w:val="2"/>
+        </w:numPr>
+      </w:pPr>
+      <w:r>
+        <w:rPr>
+          <w:b/>
+          <w:bCs/>
+        </w:rPr>
+        <w:t>Window Object:</w:t>
+      </w:r>
+      <w:r>
+        <w:t xml:space="preserve"> Ye browser ka </w:t>
+      </w:r>
+      <w:proofErr w:type="spellStart"/>
+      <w:r>
+        <w:t>sabse</w:t>
+      </w:r>
+      <w:proofErr w:type="spellEnd"/>
+      <w:r>
+        <w:t xml:space="preserve"> </w:t>
+      </w:r>
+      <w:proofErr w:type="spellStart"/>
+      <w:r>
+        <w:t>bada</w:t>
+      </w:r>
+      <w:proofErr w:type="spellEnd"/>
+      <w:r>
+        <w:t xml:space="preserve"> "Baap" object </w:t>
+      </w:r>
+      <w:proofErr w:type="spellStart"/>
+      <w:r>
+        <w:t>hai</w:t>
+      </w:r>
+      <w:proofErr w:type="spellEnd"/>
+      <w:r>
+        <w:t xml:space="preserve">. Isme sab </w:t>
+      </w:r>
+      <w:proofErr w:type="spellStart"/>
+      <w:r>
+        <w:t>kuch</w:t>
+      </w:r>
+      <w:proofErr w:type="spellEnd"/>
+      <w:r>
+        <w:t xml:space="preserve"> </w:t>
+      </w:r>
+      <w:proofErr w:type="spellStart"/>
+      <w:r>
+        <w:t>aata</w:t>
+      </w:r>
+      <w:proofErr w:type="spellEnd"/>
+      <w:r>
+        <w:t xml:space="preserve"> </w:t>
+      </w:r>
+      <w:proofErr w:type="spellStart"/>
+      <w:r>
+        <w:t>hai</w:t>
+      </w:r>
+      <w:proofErr w:type="spellEnd"/>
+      <w:r>
+        <w:t xml:space="preserve"> (location, history, storage, and document).</w:t>
+      </w:r>
+    </w:p>
+    <w:p>
+      <w:pPr>
+        <w:numPr>
+          <w:ilvl w:val="0"/>
+          <w:numId w:val="2"/>
+        </w:numPr>
+      </w:pPr>
+      <w:r>
+        <w:rPr>
+          <w:b/>
+          <w:bCs/>
+        </w:rPr>
+        <w:t>Document Object:</w:t>
+      </w:r>
+      <w:r>
+        <w:t xml:space="preserve"> Ye window </w:t>
+      </w:r>
+      <w:proofErr w:type="spellStart"/>
+      <w:r>
+        <w:t>ke</w:t>
+      </w:r>
+      <w:proofErr w:type="spellEnd"/>
+      <w:r>
+        <w:t xml:space="preserve"> </w:t>
+      </w:r>
+      <w:proofErr w:type="spellStart"/>
+      <w:r>
+        <w:t>andar</w:t>
+      </w:r>
+      <w:proofErr w:type="spellEnd"/>
+      <w:r>
+        <w:t xml:space="preserve"> </w:t>
+      </w:r>
+      <w:proofErr w:type="spellStart"/>
+      <w:r>
+        <w:t>hota</w:t>
+      </w:r>
+      <w:proofErr w:type="spellEnd"/>
+      <w:r>
+        <w:t xml:space="preserve"> </w:t>
+      </w:r>
+      <w:proofErr w:type="spellStart"/>
+      <w:r>
+        <w:t>hai</w:t>
+      </w:r>
+      <w:proofErr w:type="spellEnd"/>
+      <w:r>
+        <w:t xml:space="preserve">. Iska </w:t>
+      </w:r>
+      <w:proofErr w:type="spellStart"/>
+      <w:r>
+        <w:t>kaam</w:t>
+      </w:r>
+      <w:proofErr w:type="spellEnd"/>
+      <w:r>
+        <w:t xml:space="preserve"> </w:t>
+      </w:r>
+      <w:proofErr w:type="spellStart"/>
+      <w:r>
+        <w:t>sirf</w:t>
+      </w:r>
+      <w:proofErr w:type="spellEnd"/>
+      <w:r>
+        <w:t xml:space="preserve"> aur </w:t>
+      </w:r>
+      <w:proofErr w:type="spellStart"/>
+      <w:r>
+        <w:t>sirf</w:t>
+      </w:r>
+      <w:proofErr w:type="spellEnd"/>
+      <w:r>
+        <w:t xml:space="preserve"> </w:t>
+      </w:r>
+      <w:proofErr w:type="spellStart"/>
+      <w:r>
+        <w:t>tumhare</w:t>
+      </w:r>
+      <w:proofErr w:type="spellEnd"/>
+      <w:r>
+        <w:t xml:space="preserve"> </w:t>
+      </w:r>
+      <w:r>
+        <w:rPr>
+          <w:b/>
+          <w:bCs/>
+        </w:rPr>
+        <w:t>HTML Page</w:t>
+      </w:r>
+      <w:r>
+        <w:t xml:space="preserve"> ko handle </w:t>
+      </w:r>
+      <w:proofErr w:type="spellStart"/>
+      <w:r>
+        <w:t>karna</w:t>
+      </w:r>
+      <w:proofErr w:type="spellEnd"/>
+      <w:r>
+        <w:t xml:space="preserve"> </w:t>
+      </w:r>
+      <w:proofErr w:type="spellStart"/>
+      <w:r>
+        <w:t>hai</w:t>
+      </w:r>
+      <w:proofErr w:type="spellEnd"/>
+      <w:r>
+        <w:t>.</w:t>
+      </w:r>
+    </w:p>
+    <w:p>
+      <w:pPr>
+        <w:numPr>
+          <w:ilvl w:val="1"/>
+          <w:numId w:val="2"/>
+        </w:numPr>
+      </w:pPr>
+      <w:proofErr w:type="spellStart"/>
+      <w:r>
+        <w:rPr>
+          <w:i/>
+          <w:iCs/>
+        </w:rPr>
+        <w:t>Shortcode</w:t>
+      </w:r>
+      <w:proofErr w:type="spellEnd"/>
+      <w:r>
+        <w:rPr>
+          <w:i/>
+          <w:iCs/>
+        </w:rPr>
+        <w:t>:</w:t>
+      </w:r>
+      <w:r>
+        <w:t xml:space="preserve"> Jab </w:t>
+      </w:r>
+      <w:proofErr w:type="spellStart"/>
+      <w:r>
+        <w:t>bhi</w:t>
+      </w:r>
+      <w:proofErr w:type="spellEnd"/>
+      <w:r>
+        <w:t xml:space="preserve"> </w:t>
+      </w:r>
+      <w:proofErr w:type="spellStart"/>
+      <w:r>
+        <w:t>tumhe</w:t>
+      </w:r>
+      <w:proofErr w:type="spellEnd"/>
+      <w:r>
+        <w:t xml:space="preserve"> HTML se </w:t>
+      </w:r>
+      <w:proofErr w:type="spellStart"/>
+      <w:r>
+        <w:t>kuch</w:t>
+      </w:r>
+      <w:proofErr w:type="spellEnd"/>
+      <w:r>
+        <w:t xml:space="preserve"> </w:t>
+      </w:r>
+      <w:proofErr w:type="spellStart"/>
+      <w:r>
+        <w:t>karna</w:t>
+      </w:r>
+      <w:proofErr w:type="spellEnd"/>
+      <w:r>
+        <w:t xml:space="preserve"> </w:t>
+      </w:r>
+      <w:proofErr w:type="spellStart"/>
+      <w:r>
+        <w:t>ho</w:t>
+      </w:r>
+      <w:proofErr w:type="spellEnd"/>
+      <w:r>
+        <w:t xml:space="preserve">, tum document se </w:t>
+      </w:r>
+      <w:proofErr w:type="spellStart"/>
+      <w:r>
+        <w:t>shuru</w:t>
+      </w:r>
+      <w:proofErr w:type="spellEnd"/>
+      <w:r>
+        <w:t xml:space="preserve"> </w:t>
+      </w:r>
+      <w:proofErr w:type="spellStart"/>
+      <w:r>
+        <w:t>karte</w:t>
+      </w:r>
+      <w:proofErr w:type="spellEnd"/>
+      <w:r>
+        <w:t xml:space="preserve"> ho.</w:t>
+      </w:r>
+    </w:p>
+    <w:p>
+      <w:r>
+        <w:pict w14:anchorId="7141133C">
+          <v:rect id="_x0000_i1056" style="width:0;height:1.5pt" o:hralign="center" o:hrstd="t" o:hr="t" fillcolor="#a0a0a0" stroked="f"/>
+        </w:pict>
+      </w:r>
+    </w:p>
+    <w:p>
+      <w:pPr>
+        <w:rPr>
+          <w:b/>
+          <w:bCs/>
+        </w:rPr>
+      </w:pPr>
+      <w:r>
+        <w:rPr>
+          <w:b/>
+          <w:bCs/>
+        </w:rPr>
+        <w:t>3. DOM Tree Structure (The Family Relationship)</w:t>
+      </w:r>
+    </w:p>
+    <w:p>
+      <w:r>
+        <w:t xml:space="preserve">Browser HTML ko </w:t>
+      </w:r>
+      <w:proofErr w:type="spellStart"/>
+      <w:r>
+        <w:t>aise</w:t>
+      </w:r>
+      <w:proofErr w:type="spellEnd"/>
+      <w:r>
+        <w:t xml:space="preserve"> </w:t>
+      </w:r>
+      <w:proofErr w:type="spellStart"/>
+      <w:r>
+        <w:t>dekhta</w:t>
+      </w:r>
+      <w:proofErr w:type="spellEnd"/>
+      <w:r>
+        <w:t xml:space="preserve"> </w:t>
+      </w:r>
+      <w:proofErr w:type="spellStart"/>
+      <w:r>
+        <w:t>hai</w:t>
+      </w:r>
+      <w:proofErr w:type="spellEnd"/>
+      <w:r>
+        <w:t xml:space="preserve"> </w:t>
+      </w:r>
+      <w:proofErr w:type="spellStart"/>
+      <w:r>
+        <w:t>jaise</w:t>
+      </w:r>
+      <w:proofErr w:type="spellEnd"/>
+      <w:r>
+        <w:t xml:space="preserve"> wo ek family tree </w:t>
+      </w:r>
+      <w:proofErr w:type="spellStart"/>
+      <w:r>
+        <w:t>ho</w:t>
+      </w:r>
+      <w:proofErr w:type="spellEnd"/>
+      <w:r>
+        <w:t>:</w:t>
+      </w:r>
+    </w:p>
+    <w:p>
+      <w:pPr>
+        <w:numPr>
+          <w:ilvl w:val="0"/>
+          <w:numId w:val="3"/>
+        </w:numPr>
+      </w:pPr>
+      <w:r>
+        <w:rPr>
+          <w:b/>
+          <w:bCs/>
+        </w:rPr>
+        <w:t>Window</w:t>
+      </w:r>
+      <w:r>
+        <w:t xml:space="preserve"> (Top level)</w:t>
+      </w:r>
+    </w:p>
+    <w:p>
+      <w:pPr>
+        <w:numPr>
+          <w:ilvl w:val="0"/>
+          <w:numId w:val="3"/>
+        </w:numPr>
+      </w:pPr>
+      <w:r>
+        <w:rPr>
+          <w:b/>
+          <w:bCs/>
+        </w:rPr>
+        <w:t>Document</w:t>
+      </w:r>
+      <w:r>
+        <w:t xml:space="preserve"> (Child of Window)</w:t>
+      </w:r>
+    </w:p>
+    <w:p>
+      <w:pPr>
+        <w:numPr>
+          <w:ilvl w:val="0"/>
+          <w:numId w:val="3"/>
+        </w:numPr>
+      </w:pPr>
+      <w:r>
+        <w:rPr>
+          <w:b/>
+          <w:bCs/>
+        </w:rPr>
+        <w:t>HTML</w:t>
+      </w:r>
+      <w:r>
+        <w:t xml:space="preserve"> (Root element)</w:t>
+      </w:r>
+    </w:p>
+    <w:p>
+      <w:pPr>
+        <w:numPr>
+          <w:ilvl w:val="1"/>
+          <w:numId w:val="3"/>
+        </w:numPr>
+      </w:pPr>
+      <w:r>
+        <w:rPr>
+          <w:b/>
+          <w:bCs/>
+        </w:rPr>
+        <w:t>Head</w:t>
+      </w:r>
+      <w:r>
+        <w:t xml:space="preserve"> (Child of HTML)</w:t>
+      </w:r>
+    </w:p>
+    <w:p>
+      <w:pPr>
+        <w:numPr>
+          <w:ilvl w:val="2"/>
+          <w:numId w:val="3"/>
+        </w:numPr>
+      </w:pPr>
+      <w:r>
+        <w:t>Title, Meta tags</w:t>
+      </w:r>
+    </w:p>
+    <w:p>
+      <w:pPr>
+        <w:numPr>
+          <w:ilvl w:val="1"/>
+          <w:numId w:val="3"/>
+        </w:numPr>
+      </w:pPr>
+      <w:r>
+        <w:rPr>
+          <w:b/>
+          <w:bCs/>
+        </w:rPr>
+        <w:t>Body</w:t>
+      </w:r>
+      <w:r>
+        <w:t xml:space="preserve"> (Child of HTML)</w:t>
+      </w:r>
+    </w:p>
+    <w:p>
+      <w:pPr>
+        <w:numPr>
+          <w:ilvl w:val="2"/>
+          <w:numId w:val="3"/>
+        </w:numPr>
+      </w:pPr>
+      <w:r>
+        <w:t>h1, div, ul, li (Children of Body)</w:t>
+      </w:r>
+    </w:p>
+    <w:p>
+      <w:r>
+        <w:pict w14:anchorId="688BDCAE">
+          <v:rect id="_x0000_i1057" style="width:0;height:1.5pt" o:hralign="center" o:hrstd="t" o:hr="t" fillcolor="#a0a0a0" stroked="f"/>
+        </w:pict>
+      </w:r>
+    </w:p>
+    <w:p>
+      <w:pPr>
+        <w:rPr>
+          <w:b/>
+          <w:bCs/>
+        </w:rPr>
+      </w:pPr>
+    </w:p>
+    <w:p>
+      <w:pPr>
+        <w:rPr>
+          <w:b/>
+          <w:bCs/>
+        </w:rPr>
+      </w:pPr>
+      <w:r>
+        <w:rPr>
+          <w:b/>
+          <w:bCs/>
+        </w:rPr>
+        <w:lastRenderedPageBreak/>
+        <w:t>4. Key Concepts &amp; Selectors (Accessing Elements)</w:t>
+      </w:r>
+    </w:p>
+    <w:p>
+      <w:r>
+        <w:t xml:space="preserve">Video </w:t>
+      </w:r>
+      <w:proofErr w:type="spellStart"/>
+      <w:r>
+        <w:t>mein</w:t>
+      </w:r>
+      <w:proofErr w:type="spellEnd"/>
+      <w:r>
+        <w:t xml:space="preserve"> </w:t>
+      </w:r>
+      <w:proofErr w:type="spellStart"/>
+      <w:r>
+        <w:t>bataya</w:t>
+      </w:r>
+      <w:proofErr w:type="spellEnd"/>
+      <w:r>
+        <w:t xml:space="preserve"> </w:t>
+      </w:r>
+      <w:proofErr w:type="spellStart"/>
+      <w:r>
+        <w:t>gaya</w:t>
+      </w:r>
+      <w:proofErr w:type="spellEnd"/>
+      <w:r>
+        <w:t xml:space="preserve"> </w:t>
+      </w:r>
+      <w:proofErr w:type="spellStart"/>
+      <w:r>
+        <w:t>hai</w:t>
+      </w:r>
+      <w:proofErr w:type="spellEnd"/>
+      <w:r>
+        <w:t xml:space="preserve"> ki </w:t>
+      </w:r>
+      <w:proofErr w:type="spellStart"/>
+      <w:r>
+        <w:t>kisi</w:t>
+      </w:r>
+      <w:proofErr w:type="spellEnd"/>
+      <w:r>
+        <w:t xml:space="preserve"> </w:t>
+      </w:r>
+      <w:proofErr w:type="spellStart"/>
+      <w:r>
+        <w:t>bhi</w:t>
+      </w:r>
+      <w:proofErr w:type="spellEnd"/>
+      <w:r>
+        <w:t xml:space="preserve"> element ko JavaScript </w:t>
+      </w:r>
+      <w:proofErr w:type="spellStart"/>
+      <w:r>
+        <w:t>mein</w:t>
+      </w:r>
+      <w:proofErr w:type="spellEnd"/>
+      <w:r>
+        <w:t xml:space="preserve"> "</w:t>
+      </w:r>
+      <w:proofErr w:type="spellStart"/>
+      <w:r>
+        <w:t>Pakadne</w:t>
+      </w:r>
+      <w:proofErr w:type="spellEnd"/>
+      <w:r>
+        <w:t xml:space="preserve">" (Select </w:t>
+      </w:r>
+      <w:proofErr w:type="spellStart"/>
+      <w:r>
+        <w:t>karne</w:t>
+      </w:r>
+      <w:proofErr w:type="spellEnd"/>
+      <w:r>
+        <w:t xml:space="preserve">) </w:t>
+      </w:r>
+      <w:proofErr w:type="spellStart"/>
+      <w:r>
+        <w:t>ke</w:t>
+      </w:r>
+      <w:proofErr w:type="spellEnd"/>
+      <w:r>
+        <w:t xml:space="preserve"> </w:t>
+      </w:r>
+      <w:proofErr w:type="spellStart"/>
+      <w:r>
+        <w:t>liye</w:t>
+      </w:r>
+      <w:proofErr w:type="spellEnd"/>
+      <w:r>
+        <w:t xml:space="preserve"> </w:t>
+      </w:r>
+      <w:proofErr w:type="spellStart"/>
+      <w:r>
+        <w:t>kuch</w:t>
+      </w:r>
+      <w:proofErr w:type="spellEnd"/>
+      <w:r>
+        <w:t xml:space="preserve"> methods </w:t>
+      </w:r>
+      <w:proofErr w:type="spellStart"/>
+      <w:r>
+        <w:t>hote</w:t>
+      </w:r>
+      <w:proofErr w:type="spellEnd"/>
+      <w:r>
+        <w:t xml:space="preserve"> hain:</w:t>
+      </w:r>
+    </w:p>
+    <w:p>
+      <w:pPr>
+        <w:numPr>
+          <w:ilvl w:val="0"/>
+          <w:numId w:val="4"/>
+        </w:numPr>
+      </w:pPr>
+      <w:proofErr w:type="spellStart"/>
+      <w:r>
+        <w:rPr>
+          <w:b/>
+          <w:bCs/>
+        </w:rPr>
+        <w:t>innerHTML</w:t>
+      </w:r>
+      <w:proofErr w:type="spellEnd"/>
+      <w:r>
+        <w:rPr>
+          <w:b/>
+          <w:bCs/>
+        </w:rPr>
+        <w:t xml:space="preserve"> vs </w:t>
+      </w:r>
+      <w:proofErr w:type="spellStart"/>
+      <w:r>
+        <w:rPr>
+          <w:b/>
+          <w:bCs/>
+        </w:rPr>
+        <w:t>innerText</w:t>
+      </w:r>
+      <w:proofErr w:type="spellEnd"/>
+      <w:r>
+        <w:rPr>
+          <w:b/>
+          <w:bCs/>
+        </w:rPr>
+        <w:t xml:space="preserve"> vs </w:t>
+      </w:r>
+      <w:proofErr w:type="spellStart"/>
+      <w:r>
+        <w:rPr>
+          <w:b/>
+          <w:bCs/>
+        </w:rPr>
+        <w:t>textContent</w:t>
+      </w:r>
+      <w:proofErr w:type="spellEnd"/>
+      <w:r>
+        <w:rPr>
+          <w:b/>
+          <w:bCs/>
+        </w:rPr>
+        <w:t>:</w:t>
+      </w:r>
+      <w:r>
+        <w:t xml:space="preserve"> * </w:t>
+      </w:r>
+      <w:proofErr w:type="spellStart"/>
+      <w:r>
+        <w:t>innerText</w:t>
+      </w:r>
+      <w:proofErr w:type="spellEnd"/>
+      <w:r>
+        <w:t xml:space="preserve">: </w:t>
+      </w:r>
+      <w:proofErr w:type="spellStart"/>
+      <w:r>
+        <w:t>Sirf</w:t>
+      </w:r>
+      <w:proofErr w:type="spellEnd"/>
+      <w:r>
+        <w:t xml:space="preserve"> </w:t>
+      </w:r>
+      <w:proofErr w:type="spellStart"/>
+      <w:r>
+        <w:t>wahi</w:t>
+      </w:r>
+      <w:proofErr w:type="spellEnd"/>
+      <w:r>
+        <w:t xml:space="preserve"> </w:t>
+      </w:r>
+      <w:proofErr w:type="spellStart"/>
+      <w:r>
+        <w:t>dikhayega</w:t>
+      </w:r>
+      <w:proofErr w:type="spellEnd"/>
+      <w:r>
+        <w:t xml:space="preserve"> jo screen par visible </w:t>
+      </w:r>
+      <w:proofErr w:type="spellStart"/>
+      <w:r>
+        <w:t>hai</w:t>
+      </w:r>
+      <w:proofErr w:type="spellEnd"/>
+      <w:r>
+        <w:t xml:space="preserve"> (CSS display: none </w:t>
+      </w:r>
+      <w:proofErr w:type="spellStart"/>
+      <w:r>
+        <w:t>wala</w:t>
+      </w:r>
+      <w:proofErr w:type="spellEnd"/>
+      <w:r>
+        <w:t xml:space="preserve"> </w:t>
+      </w:r>
+      <w:proofErr w:type="spellStart"/>
+      <w:r>
+        <w:t>chupa</w:t>
+      </w:r>
+      <w:proofErr w:type="spellEnd"/>
+      <w:r>
+        <w:t xml:space="preserve"> </w:t>
+      </w:r>
+      <w:proofErr w:type="spellStart"/>
+      <w:r>
+        <w:t>dega</w:t>
+      </w:r>
+      <w:proofErr w:type="spellEnd"/>
+      <w:r>
+        <w:t>).</w:t>
+      </w:r>
+    </w:p>
+    <w:p>
+      <w:pPr>
+        <w:numPr>
+          <w:ilvl w:val="1"/>
+          <w:numId w:val="4"/>
+        </w:numPr>
+      </w:pPr>
+      <w:proofErr w:type="spellStart"/>
+      <w:r>
+        <w:t>textContent</w:t>
+      </w:r>
+      <w:proofErr w:type="spellEnd"/>
+      <w:r>
+        <w:t xml:space="preserve">: Saara text </w:t>
+      </w:r>
+      <w:proofErr w:type="spellStart"/>
+      <w:r>
+        <w:t>dikha</w:t>
+      </w:r>
+      <w:proofErr w:type="spellEnd"/>
+      <w:r>
+        <w:t xml:space="preserve"> </w:t>
+      </w:r>
+      <w:proofErr w:type="spellStart"/>
+      <w:r>
+        <w:t>dega</w:t>
+      </w:r>
+      <w:proofErr w:type="spellEnd"/>
+      <w:r>
+        <w:t xml:space="preserve">, </w:t>
+      </w:r>
+      <w:proofErr w:type="spellStart"/>
+      <w:r>
+        <w:t>chahe</w:t>
+      </w:r>
+      <w:proofErr w:type="spellEnd"/>
+      <w:r>
+        <w:t xml:space="preserve"> wo </w:t>
+      </w:r>
+      <w:proofErr w:type="spellStart"/>
+      <w:r>
+        <w:t>chupa</w:t>
+      </w:r>
+      <w:proofErr w:type="spellEnd"/>
+      <w:r>
+        <w:t xml:space="preserve"> </w:t>
+      </w:r>
+      <w:proofErr w:type="spellStart"/>
+      <w:r>
+        <w:t>ho</w:t>
+      </w:r>
+      <w:proofErr w:type="spellEnd"/>
+      <w:r>
+        <w:t xml:space="preserve"> </w:t>
+      </w:r>
+      <w:proofErr w:type="spellStart"/>
+      <w:r>
+        <w:t>ya</w:t>
+      </w:r>
+      <w:proofErr w:type="spellEnd"/>
+      <w:r>
+        <w:t xml:space="preserve"> </w:t>
+      </w:r>
+      <w:proofErr w:type="spellStart"/>
+      <w:r>
+        <w:t>nahi</w:t>
+      </w:r>
+      <w:proofErr w:type="spellEnd"/>
+      <w:r>
+        <w:t>.</w:t>
+      </w:r>
+    </w:p>
+    <w:p>
+      <w:pPr>
+        <w:numPr>
+          <w:ilvl w:val="1"/>
+          <w:numId w:val="4"/>
+        </w:numPr>
+      </w:pPr>
+      <w:proofErr w:type="spellStart"/>
+      <w:r>
+        <w:t>innerHTML</w:t>
+      </w:r>
+      <w:proofErr w:type="spellEnd"/>
+      <w:r>
+        <w:t xml:space="preserve">: Text </w:t>
+      </w:r>
+      <w:proofErr w:type="spellStart"/>
+      <w:r>
+        <w:t>ke</w:t>
+      </w:r>
+      <w:proofErr w:type="spellEnd"/>
+      <w:r>
+        <w:t xml:space="preserve"> </w:t>
+      </w:r>
+      <w:proofErr w:type="spellStart"/>
+      <w:r>
+        <w:t>saath-saath</w:t>
+      </w:r>
+      <w:proofErr w:type="spellEnd"/>
+      <w:r>
+        <w:t xml:space="preserve"> </w:t>
+      </w:r>
+      <w:proofErr w:type="spellStart"/>
+      <w:r>
+        <w:t>uske</w:t>
+      </w:r>
+      <w:proofErr w:type="spellEnd"/>
+      <w:r>
+        <w:t xml:space="preserve"> </w:t>
+      </w:r>
+      <w:proofErr w:type="spellStart"/>
+      <w:r>
+        <w:t>andar</w:t>
+      </w:r>
+      <w:proofErr w:type="spellEnd"/>
+      <w:r>
+        <w:t xml:space="preserve"> </w:t>
+      </w:r>
+      <w:proofErr w:type="spellStart"/>
+      <w:r>
+        <w:t>ke</w:t>
+      </w:r>
+      <w:proofErr w:type="spellEnd"/>
+      <w:r>
+        <w:t xml:space="preserve"> HTML tags </w:t>
+      </w:r>
+      <w:proofErr w:type="spellStart"/>
+      <w:r>
+        <w:t>bhi</w:t>
+      </w:r>
+      <w:proofErr w:type="spellEnd"/>
+      <w:r>
+        <w:t xml:space="preserve"> </w:t>
+      </w:r>
+      <w:proofErr w:type="spellStart"/>
+      <w:r>
+        <w:t>dikha</w:t>
+      </w:r>
+      <w:proofErr w:type="spellEnd"/>
+      <w:r>
+        <w:t xml:space="preserve"> </w:t>
+      </w:r>
+      <w:proofErr w:type="spellStart"/>
+      <w:r>
+        <w:t>dega</w:t>
+      </w:r>
+      <w:proofErr w:type="spellEnd"/>
+      <w:r>
+        <w:t>.</w:t>
+      </w:r>
+    </w:p>
+    <w:p>
+      <w:pPr>
+        <w:numPr>
+          <w:ilvl w:val="0"/>
+          <w:numId w:val="4"/>
+        </w:numPr>
+      </w:pPr>
+      <w:r>
+        <w:rPr>
+          <w:b/>
+          <w:bCs/>
+        </w:rPr>
+        <w:t>Selectors:</w:t>
+      </w:r>
+    </w:p>
+    <w:p>
+      <w:pPr>
+        <w:numPr>
+          <w:ilvl w:val="1"/>
+          <w:numId w:val="5"/>
+        </w:numPr>
+      </w:pPr>
+      <w:proofErr w:type="spellStart"/>
+      <w:r>
+        <w:t>getElementById</w:t>
+      </w:r>
+      <w:proofErr w:type="spellEnd"/>
+      <w:r>
+        <w:t xml:space="preserve">('id'): Id se element </w:t>
+      </w:r>
+      <w:proofErr w:type="spellStart"/>
+      <w:r>
+        <w:t>uthana</w:t>
+      </w:r>
+      <w:proofErr w:type="spellEnd"/>
+      <w:r>
+        <w:t>.</w:t>
+      </w:r>
+    </w:p>
+    <w:p>
+      <w:pPr>
+        <w:numPr>
+          <w:ilvl w:val="1"/>
+          <w:numId w:val="5"/>
+        </w:numPr>
+      </w:pPr>
+      <w:proofErr w:type="spellStart"/>
+      <w:r>
+        <w:t>getElementsByClassName</w:t>
+      </w:r>
+      <w:proofErr w:type="spellEnd"/>
+      <w:r>
+        <w:t>('</w:t>
+      </w:r>
+      <w:proofErr w:type="spellStart"/>
+      <w:r>
+        <w:t>class'</w:t>
+      </w:r>
+      <w:proofErr w:type="spellEnd"/>
+      <w:r>
+        <w:t xml:space="preserve">): Class se </w:t>
+      </w:r>
+      <w:proofErr w:type="spellStart"/>
+      <w:r>
+        <w:t>uthana</w:t>
+      </w:r>
+      <w:proofErr w:type="spellEnd"/>
+      <w:r>
+        <w:t xml:space="preserve"> (ye ek </w:t>
+      </w:r>
+      <w:proofErr w:type="spellStart"/>
+      <w:r>
+        <w:t>HTMLCollection</w:t>
+      </w:r>
+      <w:proofErr w:type="spellEnd"/>
+      <w:r>
+        <w:t xml:space="preserve"> </w:t>
+      </w:r>
+      <w:proofErr w:type="spellStart"/>
+      <w:r>
+        <w:t>deta</w:t>
+      </w:r>
+      <w:proofErr w:type="spellEnd"/>
+      <w:r>
+        <w:t xml:space="preserve"> </w:t>
+      </w:r>
+      <w:proofErr w:type="spellStart"/>
+      <w:r>
+        <w:t>hai</w:t>
+      </w:r>
+      <w:proofErr w:type="spellEnd"/>
+      <w:r>
+        <w:t>).</w:t>
+      </w:r>
+    </w:p>
+    <w:p>
+      <w:pPr>
+        <w:numPr>
+          <w:ilvl w:val="1"/>
+          <w:numId w:val="5"/>
+        </w:numPr>
+      </w:pPr>
+      <w:proofErr w:type="spellStart"/>
+      <w:proofErr w:type="gramStart"/>
+      <w:r>
+        <w:t>querySelector</w:t>
+      </w:r>
+      <w:proofErr w:type="spellEnd"/>
+      <w:r>
+        <w:t>(</w:t>
+      </w:r>
+      <w:proofErr w:type="gramEnd"/>
+      <w:r>
+        <w:t xml:space="preserve">'.class / #id / tag'): Ye </w:t>
+      </w:r>
+      <w:proofErr w:type="spellStart"/>
+      <w:r>
+        <w:t>sabse</w:t>
+      </w:r>
+      <w:proofErr w:type="spellEnd"/>
+      <w:r>
+        <w:t xml:space="preserve"> smart </w:t>
+      </w:r>
+      <w:proofErr w:type="spellStart"/>
+      <w:r>
+        <w:t>hai</w:t>
+      </w:r>
+      <w:proofErr w:type="spellEnd"/>
+      <w:r>
+        <w:t xml:space="preserve">, CSS selectors ki </w:t>
+      </w:r>
+      <w:proofErr w:type="spellStart"/>
+      <w:r>
+        <w:t>tarah</w:t>
+      </w:r>
+      <w:proofErr w:type="spellEnd"/>
+      <w:r>
+        <w:t xml:space="preserve"> </w:t>
+      </w:r>
+      <w:proofErr w:type="spellStart"/>
+      <w:r>
+        <w:t>kaam</w:t>
+      </w:r>
+      <w:proofErr w:type="spellEnd"/>
+      <w:r>
+        <w:t xml:space="preserve"> </w:t>
+      </w:r>
+      <w:proofErr w:type="spellStart"/>
+      <w:r>
+        <w:t>karta</w:t>
+      </w:r>
+      <w:proofErr w:type="spellEnd"/>
+      <w:r>
+        <w:t xml:space="preserve"> </w:t>
+      </w:r>
+      <w:proofErr w:type="spellStart"/>
+      <w:r>
+        <w:t>hai</w:t>
+      </w:r>
+      <w:proofErr w:type="spellEnd"/>
+      <w:r>
+        <w:t xml:space="preserve"> (</w:t>
+      </w:r>
+      <w:proofErr w:type="spellStart"/>
+      <w:r>
+        <w:t>pehla</w:t>
+      </w:r>
+      <w:proofErr w:type="spellEnd"/>
+      <w:r>
+        <w:t xml:space="preserve"> match </w:t>
+      </w:r>
+      <w:proofErr w:type="spellStart"/>
+      <w:r>
+        <w:t>uthata</w:t>
+      </w:r>
+      <w:proofErr w:type="spellEnd"/>
+      <w:r>
+        <w:t xml:space="preserve"> </w:t>
+      </w:r>
+      <w:proofErr w:type="spellStart"/>
+      <w:r>
+        <w:t>hai</w:t>
+      </w:r>
+      <w:proofErr w:type="spellEnd"/>
+      <w:r>
+        <w:t>).</w:t>
+      </w:r>
+    </w:p>
+    <w:p>
+      <w:pPr>
+        <w:numPr>
+          <w:ilvl w:val="1"/>
+          <w:numId w:val="5"/>
+        </w:numPr>
+      </w:pPr>
+      <w:proofErr w:type="spellStart"/>
+      <w:proofErr w:type="gramStart"/>
+      <w:r>
+        <w:t>querySelectorAll</w:t>
+      </w:r>
+      <w:proofErr w:type="spellEnd"/>
+      <w:r>
+        <w:t>(</w:t>
+      </w:r>
+      <w:proofErr w:type="gramEnd"/>
+      <w:r>
+        <w:t xml:space="preserve">): Saare matching elements </w:t>
+      </w:r>
+      <w:proofErr w:type="spellStart"/>
+      <w:r>
+        <w:t>uthata</w:t>
+      </w:r>
+      <w:proofErr w:type="spellEnd"/>
+      <w:r>
+        <w:t xml:space="preserve"> </w:t>
+      </w:r>
+      <w:proofErr w:type="spellStart"/>
+      <w:r>
+        <w:t>hai</w:t>
+      </w:r>
+      <w:proofErr w:type="spellEnd"/>
+      <w:r>
+        <w:t xml:space="preserve"> (ye ek </w:t>
+      </w:r>
+      <w:proofErr w:type="spellStart"/>
+      <w:r>
+        <w:rPr>
+          <w:b/>
+          <w:bCs/>
+        </w:rPr>
+        <w:t>NodeList</w:t>
+      </w:r>
+      <w:proofErr w:type="spellEnd"/>
+      <w:r>
+        <w:t xml:space="preserve"> </w:t>
+      </w:r>
+      <w:proofErr w:type="spellStart"/>
+      <w:r>
+        <w:t>deta</w:t>
+      </w:r>
+      <w:proofErr w:type="spellEnd"/>
+      <w:r>
+        <w:t xml:space="preserve"> </w:t>
+      </w:r>
+      <w:proofErr w:type="spellStart"/>
+      <w:r>
+        <w:t>hai</w:t>
+      </w:r>
+      <w:proofErr w:type="spellEnd"/>
+      <w:r>
+        <w:t>).</w:t>
+      </w:r>
+    </w:p>
+    <w:p>
+      <w:r>
+        <w:pict w14:anchorId="589DF107">
+          <v:rect id="_x0000_i1058" style="width:0;height:1.5pt" o:hralign="center" o:hrstd="t" o:hr="t" fillcolor="#a0a0a0" stroked="f"/>
+        </w:pict>
+      </w:r>
+    </w:p>
+    <w:p>
+      <w:pPr>
+        <w:rPr>
+          <w:b/>
+          <w:bCs/>
+        </w:rPr>
+      </w:pPr>
+      <w:r>
+        <w:rPr>
+          <w:b/>
+          <w:bCs/>
+        </w:rPr>
+        <w:t xml:space="preserve">5. </w:t>
+      </w:r>
+      <w:proofErr w:type="spellStart"/>
+      <w:r>
+        <w:rPr>
+          <w:b/>
+          <w:bCs/>
+        </w:rPr>
+        <w:t>NodeList</w:t>
+      </w:r>
+      <w:proofErr w:type="spellEnd"/>
+      <w:r>
+        <w:rPr>
+          <w:b/>
+          <w:bCs/>
+        </w:rPr>
+        <w:t xml:space="preserve"> vs </w:t>
+      </w:r>
+      <w:proofErr w:type="spellStart"/>
+      <w:r>
+        <w:rPr>
+          <w:b/>
+          <w:bCs/>
+        </w:rPr>
+        <w:t>HTMLCollection</w:t>
+      </w:r>
+      <w:proofErr w:type="spellEnd"/>
+      <w:r>
+        <w:rPr>
+          <w:b/>
+          <w:bCs/>
+        </w:rPr>
+        <w:t xml:space="preserve"> (Deep Insight)</w:t>
+      </w:r>
+    </w:p>
+    <w:p>
+      <w:r>
+        <w:t xml:space="preserve">Ye </w:t>
+      </w:r>
+      <w:proofErr w:type="spellStart"/>
+      <w:r>
+        <w:t>sabse</w:t>
+      </w:r>
+      <w:proofErr w:type="spellEnd"/>
+      <w:r>
+        <w:t xml:space="preserve"> "Interviewer </w:t>
+      </w:r>
+      <w:proofErr w:type="spellStart"/>
+      <w:r>
+        <w:t>Favorite</w:t>
+      </w:r>
+      <w:proofErr w:type="spellEnd"/>
+      <w:r>
+        <w:t xml:space="preserve">" </w:t>
+      </w:r>
+      <w:proofErr w:type="spellStart"/>
+      <w:r>
+        <w:t>sawal</w:t>
+      </w:r>
+      <w:proofErr w:type="spellEnd"/>
+      <w:r>
+        <w:t xml:space="preserve"> </w:t>
+      </w:r>
+      <w:proofErr w:type="spellStart"/>
+      <w:r>
+        <w:t>hai</w:t>
+      </w:r>
+      <w:proofErr w:type="spellEnd"/>
+      <w:r>
+        <w:t>:</w:t>
+      </w:r>
+    </w:p>
+    <w:p>
+      <w:pPr>
+        <w:numPr>
+          <w:ilvl w:val="0"/>
+          <w:numId w:val="6"/>
+        </w:numPr>
+      </w:pPr>
+      <w:proofErr w:type="spellStart"/>
+      <w:r>
+        <w:rPr>
+          <w:b/>
+          <w:bCs/>
+        </w:rPr>
+        <w:t>HTMLCollection</w:t>
+      </w:r>
+      <w:proofErr w:type="spellEnd"/>
+      <w:r>
+        <w:rPr>
+          <w:b/>
+          <w:bCs/>
+        </w:rPr>
+        <w:t>:</w:t>
+      </w:r>
+      <w:r>
+        <w:t xml:space="preserve"> Ye array </w:t>
+      </w:r>
+      <w:proofErr w:type="spellStart"/>
+      <w:r>
+        <w:t>jaisa</w:t>
+      </w:r>
+      <w:proofErr w:type="spellEnd"/>
+      <w:r>
+        <w:t xml:space="preserve"> </w:t>
+      </w:r>
+      <w:proofErr w:type="spellStart"/>
+      <w:r>
+        <w:t>dikhta</w:t>
+      </w:r>
+      <w:proofErr w:type="spellEnd"/>
+      <w:r>
+        <w:t xml:space="preserve"> </w:t>
+      </w:r>
+      <w:proofErr w:type="spellStart"/>
+      <w:r>
+        <w:t>hai</w:t>
+      </w:r>
+      <w:proofErr w:type="spellEnd"/>
+      <w:r>
+        <w:t xml:space="preserve"> par array </w:t>
+      </w:r>
+      <w:proofErr w:type="spellStart"/>
+      <w:r>
+        <w:t>nahi</w:t>
+      </w:r>
+      <w:proofErr w:type="spellEnd"/>
+      <w:r>
+        <w:t xml:space="preserve"> </w:t>
+      </w:r>
+      <w:proofErr w:type="spellStart"/>
+      <w:r>
+        <w:t>hai</w:t>
+      </w:r>
+      <w:proofErr w:type="spellEnd"/>
+      <w:r>
+        <w:t xml:space="preserve">. </w:t>
+      </w:r>
+      <w:proofErr w:type="spellStart"/>
+      <w:r>
+        <w:t>Ispe</w:t>
+      </w:r>
+      <w:proofErr w:type="spellEnd"/>
+      <w:r>
+        <w:t xml:space="preserve"> tum direct </w:t>
+      </w:r>
+      <w:proofErr w:type="spellStart"/>
+      <w:r>
+        <w:t>forEach</w:t>
+      </w:r>
+      <w:proofErr w:type="spellEnd"/>
+      <w:r>
+        <w:t xml:space="preserve"> loop </w:t>
+      </w:r>
+      <w:proofErr w:type="spellStart"/>
+      <w:r>
+        <w:t>nahi</w:t>
+      </w:r>
+      <w:proofErr w:type="spellEnd"/>
+      <w:r>
+        <w:t xml:space="preserve"> </w:t>
+      </w:r>
+      <w:proofErr w:type="spellStart"/>
+      <w:r>
+        <w:t>chala</w:t>
+      </w:r>
+      <w:proofErr w:type="spellEnd"/>
+      <w:r>
+        <w:t xml:space="preserve"> </w:t>
+      </w:r>
+      <w:proofErr w:type="spellStart"/>
+      <w:r>
+        <w:t>sakte</w:t>
+      </w:r>
+      <w:proofErr w:type="spellEnd"/>
+      <w:r>
+        <w:t xml:space="preserve"> (</w:t>
+      </w:r>
+      <w:proofErr w:type="spellStart"/>
+      <w:r>
+        <w:t>ise</w:t>
+      </w:r>
+      <w:proofErr w:type="spellEnd"/>
+      <w:r>
+        <w:t xml:space="preserve"> </w:t>
+      </w:r>
+      <w:proofErr w:type="spellStart"/>
+      <w:r>
+        <w:t>pehle</w:t>
+      </w:r>
+      <w:proofErr w:type="spellEnd"/>
+      <w:r>
+        <w:t xml:space="preserve"> </w:t>
+      </w:r>
+      <w:proofErr w:type="spellStart"/>
+      <w:r>
+        <w:t>Array.from</w:t>
+      </w:r>
+      <w:proofErr w:type="spellEnd"/>
+      <w:r>
+        <w:t xml:space="preserve">() se convert </w:t>
+      </w:r>
+      <w:proofErr w:type="spellStart"/>
+      <w:r>
+        <w:t>karna</w:t>
+      </w:r>
+      <w:proofErr w:type="spellEnd"/>
+      <w:r>
+        <w:t xml:space="preserve"> </w:t>
+      </w:r>
+      <w:proofErr w:type="spellStart"/>
+      <w:r>
+        <w:t>padta</w:t>
+      </w:r>
+      <w:proofErr w:type="spellEnd"/>
+      <w:r>
+        <w:t xml:space="preserve"> </w:t>
+      </w:r>
+      <w:proofErr w:type="spellStart"/>
+      <w:r>
+        <w:t>hai</w:t>
+      </w:r>
+      <w:proofErr w:type="spellEnd"/>
+      <w:r>
+        <w:t>).</w:t>
+      </w:r>
+    </w:p>
+    <w:p>
+      <w:pPr>
+        <w:numPr>
+          <w:ilvl w:val="0"/>
+          <w:numId w:val="6"/>
+        </w:numPr>
+      </w:pPr>
+      <w:proofErr w:type="spellStart"/>
+      <w:r>
+        <w:rPr>
+          <w:b/>
+          <w:bCs/>
+        </w:rPr>
+        <w:t>NodeList</w:t>
+      </w:r>
+      <w:proofErr w:type="spellEnd"/>
+      <w:r>
+        <w:rPr>
+          <w:b/>
+          <w:bCs/>
+        </w:rPr>
+        <w:t>:</w:t>
+      </w:r>
+      <w:r>
+        <w:t xml:space="preserve"> Ye </w:t>
+      </w:r>
+      <w:proofErr w:type="spellStart"/>
+      <w:r>
+        <w:t>bhi</w:t>
+      </w:r>
+      <w:proofErr w:type="spellEnd"/>
+      <w:r>
+        <w:t xml:space="preserve"> array </w:t>
+      </w:r>
+      <w:proofErr w:type="spellStart"/>
+      <w:r>
+        <w:t>jaisa</w:t>
+      </w:r>
+      <w:proofErr w:type="spellEnd"/>
+      <w:r>
+        <w:t xml:space="preserve"> </w:t>
+      </w:r>
+      <w:proofErr w:type="spellStart"/>
+      <w:r>
+        <w:t>hai</w:t>
+      </w:r>
+      <w:proofErr w:type="spellEnd"/>
+      <w:r>
+        <w:t xml:space="preserve">, par modern browsers </w:t>
+      </w:r>
+      <w:proofErr w:type="spellStart"/>
+      <w:r>
+        <w:t>mein</w:t>
+      </w:r>
+      <w:proofErr w:type="spellEnd"/>
+      <w:r>
+        <w:t xml:space="preserve"> </w:t>
+      </w:r>
+      <w:proofErr w:type="spellStart"/>
+      <w:r>
+        <w:t>ispar</w:t>
+      </w:r>
+      <w:proofErr w:type="spellEnd"/>
+      <w:r>
+        <w:t xml:space="preserve"> </w:t>
+      </w:r>
+      <w:proofErr w:type="spellStart"/>
+      <w:r>
+        <w:t>forEach</w:t>
+      </w:r>
+      <w:proofErr w:type="spellEnd"/>
+      <w:r>
+        <w:t xml:space="preserve"> loop </w:t>
+      </w:r>
+      <w:proofErr w:type="spellStart"/>
+      <w:r>
+        <w:t>chalta</w:t>
+      </w:r>
+      <w:proofErr w:type="spellEnd"/>
+      <w:r>
+        <w:t xml:space="preserve"> </w:t>
+      </w:r>
+      <w:proofErr w:type="spellStart"/>
+      <w:r>
+        <w:t>hai</w:t>
+      </w:r>
+      <w:proofErr w:type="spellEnd"/>
+      <w:r>
+        <w:t xml:space="preserve">. </w:t>
+      </w:r>
+      <w:proofErr w:type="gramStart"/>
+      <w:r>
+        <w:t>Lekin</w:t>
+      </w:r>
+      <w:proofErr w:type="gramEnd"/>
+      <w:r>
+        <w:t xml:space="preserve"> map </w:t>
+      </w:r>
+      <w:proofErr w:type="spellStart"/>
+      <w:r>
+        <w:t>ya</w:t>
+      </w:r>
+      <w:proofErr w:type="spellEnd"/>
+      <w:r>
+        <w:t xml:space="preserve"> filter </w:t>
+      </w:r>
+      <w:proofErr w:type="spellStart"/>
+      <w:r>
+        <w:t>ispar</w:t>
+      </w:r>
+      <w:proofErr w:type="spellEnd"/>
+      <w:r>
+        <w:t xml:space="preserve"> </w:t>
+      </w:r>
+      <w:proofErr w:type="spellStart"/>
+      <w:r>
+        <w:t>bhi</w:t>
+      </w:r>
+      <w:proofErr w:type="spellEnd"/>
+      <w:r>
+        <w:t xml:space="preserve"> </w:t>
+      </w:r>
+      <w:proofErr w:type="spellStart"/>
+      <w:r>
+        <w:t>nahi</w:t>
+      </w:r>
+      <w:proofErr w:type="spellEnd"/>
+      <w:r>
+        <w:t xml:space="preserve"> </w:t>
+      </w:r>
+      <w:proofErr w:type="spellStart"/>
+      <w:r>
+        <w:t>chalta</w:t>
+      </w:r>
+      <w:proofErr w:type="spellEnd"/>
+      <w:r>
+        <w:t>.</w:t>
+      </w:r>
+    </w:p>
+    <w:p>
+      <w:r>
+        <w:pict w14:anchorId="3E347003">
+          <v:rect id="_x0000_i1059" style="width:0;height:1.5pt" o:hralign="center" o:hrstd="t" o:hr="t" fillcolor="#a0a0a0" stroked="f"/>
+        </w:pict>
+      </w:r>
+    </w:p>
+    <w:p>
+      <w:pPr>
+        <w:rPr>
+          <w:b/>
+          <w:bCs/>
+        </w:rPr>
+      </w:pPr>
+      <w:r>
+        <w:rPr>
+          <w:b/>
+          <w:bCs/>
+        </w:rPr>
+        <w:t>Summary (Desi Logic):</w:t>
+      </w:r>
+    </w:p>
+    <w:p>
+      <w:r>
+        <w:t xml:space="preserve">Bhai, DOM ka </w:t>
+      </w:r>
+      <w:proofErr w:type="spellStart"/>
+      <w:r>
+        <w:t>matlab</w:t>
+      </w:r>
+      <w:proofErr w:type="spellEnd"/>
+      <w:r>
+        <w:t xml:space="preserve"> </w:t>
+      </w:r>
+      <w:proofErr w:type="spellStart"/>
+      <w:r>
+        <w:t>hai</w:t>
+      </w:r>
+      <w:proofErr w:type="spellEnd"/>
+      <w:r>
+        <w:t xml:space="preserve"> ki </w:t>
+      </w:r>
+      <w:proofErr w:type="spellStart"/>
+      <w:r>
+        <w:t>tumhara</w:t>
+      </w:r>
+      <w:proofErr w:type="spellEnd"/>
+      <w:r>
+        <w:t xml:space="preserve"> HTML ab ek "</w:t>
+      </w:r>
+      <w:proofErr w:type="spellStart"/>
+      <w:r>
+        <w:t>Kathputli</w:t>
+      </w:r>
+      <w:proofErr w:type="spellEnd"/>
+      <w:r>
+        <w:t xml:space="preserve">" (Puppet) </w:t>
+      </w:r>
+      <w:proofErr w:type="spellStart"/>
+      <w:r>
+        <w:t>hai</w:t>
+      </w:r>
+      <w:proofErr w:type="spellEnd"/>
+      <w:r>
+        <w:t xml:space="preserve"> aur JavaScript </w:t>
+      </w:r>
+      <w:proofErr w:type="spellStart"/>
+      <w:r>
+        <w:t>uski</w:t>
+      </w:r>
+      <w:proofErr w:type="spellEnd"/>
+      <w:r>
+        <w:t xml:space="preserve"> "Dori" (Strings). Is video ka </w:t>
+      </w:r>
+      <w:proofErr w:type="spellStart"/>
+      <w:r>
+        <w:t>maqsad</w:t>
+      </w:r>
+      <w:proofErr w:type="spellEnd"/>
+      <w:r>
+        <w:t xml:space="preserve"> ye </w:t>
+      </w:r>
+      <w:proofErr w:type="spellStart"/>
+      <w:r>
+        <w:t>hai</w:t>
+      </w:r>
+      <w:proofErr w:type="spellEnd"/>
+      <w:r>
+        <w:t xml:space="preserve"> ki tum </w:t>
+      </w:r>
+      <w:proofErr w:type="spellStart"/>
+      <w:r>
+        <w:t>samajh</w:t>
+      </w:r>
+      <w:proofErr w:type="spellEnd"/>
+      <w:r>
+        <w:t xml:space="preserve"> </w:t>
+      </w:r>
+      <w:proofErr w:type="spellStart"/>
+      <w:r>
+        <w:t>jao</w:t>
+      </w:r>
+      <w:proofErr w:type="spellEnd"/>
+      <w:r>
+        <w:t xml:space="preserve"> ki HTML page ko browser </w:t>
+      </w:r>
+      <w:proofErr w:type="spellStart"/>
+      <w:r>
+        <w:t>ke</w:t>
+      </w:r>
+      <w:proofErr w:type="spellEnd"/>
+      <w:r>
+        <w:t xml:space="preserve"> </w:t>
+      </w:r>
+      <w:proofErr w:type="spellStart"/>
+      <w:r>
+        <w:t>dimaag</w:t>
+      </w:r>
+      <w:proofErr w:type="spellEnd"/>
+      <w:r>
+        <w:t xml:space="preserve"> </w:t>
+      </w:r>
+      <w:proofErr w:type="spellStart"/>
+      <w:r>
+        <w:t>mein</w:t>
+      </w:r>
+      <w:proofErr w:type="spellEnd"/>
+      <w:r>
+        <w:t xml:space="preserve"> </w:t>
+      </w:r>
+      <w:proofErr w:type="spellStart"/>
+      <w:r>
+        <w:t>kaise</w:t>
+      </w:r>
+      <w:proofErr w:type="spellEnd"/>
+      <w:r>
+        <w:t xml:space="preserve"> map </w:t>
+      </w:r>
+      <w:proofErr w:type="spellStart"/>
+      <w:r>
+        <w:t>kiya</w:t>
+      </w:r>
+      <w:proofErr w:type="spellEnd"/>
+      <w:r>
+        <w:t xml:space="preserve"> </w:t>
+      </w:r>
+      <w:proofErr w:type="spellStart"/>
+      <w:r>
+        <w:t>jata</w:t>
+      </w:r>
+      <w:proofErr w:type="spellEnd"/>
+      <w:r>
+        <w:t xml:space="preserve"> </w:t>
+      </w:r>
+      <w:proofErr w:type="spellStart"/>
+      <w:r>
+        <w:t>hai</w:t>
+      </w:r>
+      <w:proofErr w:type="spellEnd"/>
+      <w:r>
+        <w:t>.</w:t>
+      </w:r>
+    </w:p>
+    <w:p>
+      <w:r>
+        <w:rPr>
+          <w:b/>
+          <w:bCs/>
+        </w:rPr>
+        <w:t>Technical Tip:</w:t>
+      </w:r>
+      <w:r>
+        <w:t xml:space="preserve"> Jab tum browser </w:t>
+      </w:r>
+      <w:proofErr w:type="spellStart"/>
+      <w:r>
+        <w:t>ke</w:t>
+      </w:r>
+      <w:proofErr w:type="spellEnd"/>
+      <w:r>
+        <w:t xml:space="preserve"> Console </w:t>
+      </w:r>
+      <w:proofErr w:type="spellStart"/>
+      <w:r>
+        <w:t>mein</w:t>
+      </w:r>
+      <w:proofErr w:type="spellEnd"/>
+      <w:r>
+        <w:t xml:space="preserve"> </w:t>
+      </w:r>
+      <w:proofErr w:type="spellStart"/>
+      <w:r>
+        <w:t>jaakar</w:t>
+      </w:r>
+      <w:proofErr w:type="spellEnd"/>
+      <w:r>
+        <w:t xml:space="preserve"> </w:t>
+      </w:r>
+      <w:proofErr w:type="spellStart"/>
+      <w:r>
+        <w:t>console.dir</w:t>
+      </w:r>
+      <w:proofErr w:type="spellEnd"/>
+      <w:r>
+        <w:t xml:space="preserve">(document) </w:t>
+      </w:r>
+      <w:proofErr w:type="spellStart"/>
+      <w:r>
+        <w:t>likhte</w:t>
+      </w:r>
+      <w:proofErr w:type="spellEnd"/>
+      <w:r>
+        <w:t xml:space="preserve"> </w:t>
+      </w:r>
+      <w:proofErr w:type="spellStart"/>
+      <w:r>
+        <w:t>ho</w:t>
+      </w:r>
+      <w:proofErr w:type="spellEnd"/>
+      <w:r>
+        <w:t xml:space="preserve">, </w:t>
+      </w:r>
+      <w:proofErr w:type="spellStart"/>
+      <w:r>
+        <w:t>toh</w:t>
+      </w:r>
+      <w:proofErr w:type="spellEnd"/>
+      <w:r>
+        <w:t xml:space="preserve"> </w:t>
+      </w:r>
+      <w:proofErr w:type="spellStart"/>
+      <w:r>
+        <w:t>tumhe</w:t>
+      </w:r>
+      <w:proofErr w:type="spellEnd"/>
+      <w:r>
+        <w:t xml:space="preserve"> wo </w:t>
+      </w:r>
+      <w:proofErr w:type="spellStart"/>
+      <w:r>
+        <w:t>poora</w:t>
+      </w:r>
+      <w:proofErr w:type="spellEnd"/>
+      <w:r>
+        <w:t xml:space="preserve"> object </w:t>
+      </w:r>
+      <w:proofErr w:type="spellStart"/>
+      <w:r>
+        <w:t>dikhta</w:t>
+      </w:r>
+      <w:proofErr w:type="spellEnd"/>
+      <w:r>
+        <w:t xml:space="preserve"> </w:t>
+      </w:r>
+      <w:proofErr w:type="spellStart"/>
+      <w:r>
+        <w:t>hai</w:t>
+      </w:r>
+      <w:proofErr w:type="spellEnd"/>
+      <w:r>
+        <w:t xml:space="preserve"> </w:t>
+      </w:r>
+      <w:proofErr w:type="spellStart"/>
+      <w:r>
+        <w:t>jiske</w:t>
+      </w:r>
+      <w:proofErr w:type="spellEnd"/>
+      <w:r>
+        <w:t xml:space="preserve"> </w:t>
+      </w:r>
+      <w:proofErr w:type="spellStart"/>
+      <w:r>
+        <w:t>baare</w:t>
+      </w:r>
+      <w:proofErr w:type="spellEnd"/>
+      <w:r>
+        <w:t xml:space="preserve"> </w:t>
+      </w:r>
+      <w:proofErr w:type="spellStart"/>
+      <w:r>
+        <w:t>mein</w:t>
+      </w:r>
+      <w:proofErr w:type="spellEnd"/>
+      <w:r>
+        <w:t xml:space="preserve"> Hitesh sir </w:t>
+      </w:r>
+      <w:proofErr w:type="spellStart"/>
+      <w:r>
+        <w:t>baat</w:t>
+      </w:r>
+      <w:proofErr w:type="spellEnd"/>
+      <w:r>
+        <w:t xml:space="preserve"> </w:t>
+      </w:r>
+      <w:proofErr w:type="spellStart"/>
+      <w:r>
+        <w:t>kar</w:t>
+      </w:r>
+      <w:proofErr w:type="spellEnd"/>
+      <w:r>
+        <w:t xml:space="preserve"> </w:t>
+      </w:r>
+      <w:proofErr w:type="spellStart"/>
+      <w:r>
+        <w:t>rahe</w:t>
+      </w:r>
+      <w:proofErr w:type="spellEnd"/>
+      <w:r>
+        <w:t xml:space="preserve"> hain.</w:t>
+      </w:r>
+      <w:r>
+        <w:pict w14:anchorId="5F6D217C">
+          <v:rect id="_x0000_i1065" style="width:0;height:1.5pt" o:hralign="center" o:hrstd="t" o:hr="t" fillcolor="#a0a0a0" stroked="f"/>
+        </w:pict>
       </w:r>
     </w:p>
     <w:p/>
@@ -42,6 +2330,891 @@
     </w:sectPr>
   </w:body>
 </w:document>
+</file>
+
+<file path=word/numbering.xml><?xml version="1.0" encoding="utf-8"?>
+<w:numbering xmlns:wpc="http://schemas.microsoft.com/office/word/2010/wordprocessingCanvas" xmlns:cx="http://schemas.microsoft.com/office/drawing/2014/chartex" xmlns:cx1="http://schemas.microsoft.com/office/drawing/2015/9/8/chartex" xmlns:cx2="http://schemas.microsoft.com/office/drawing/2015/10/21/chartex" xmlns:cx3="http://schemas.microsoft.com/office/drawing/2016/5/9/chartex" xmlns:cx4="http://schemas.microsoft.com/office/drawing/2016/5/10/chartex" xmlns:cx5="http://schemas.microsoft.com/office/drawing/2016/5/11/chartex" xmlns:cx6="http://schemas.microsoft.com/office/drawing/2016/5/12/chartex" xmlns:cx7="http://schemas.microsoft.com/office/drawing/2016/5/13/chartex" xmlns:cx8="http://schemas.microsoft.com/office/drawing/2016/5/14/chartex" xmlns:mc="http://schemas.openxmlformats.org/markup-compatibility/2006" xmlns:aink="http://schemas.microsoft.com/office/drawing/2016/ink" xmlns:am3d="http://schemas.microsoft.com/office/drawing/2017/model3d" xmlns:o="urn:schemas-microsoft-com:office:office" xmlns:oel="http://schemas.microsoft.com/office/2019/extlst" xmlns:r="http://schemas.openxmlformats.org/officeDocument/2006/relationships" xmlns:m="http://schemas.openxmlformats.org/officeDocument/2006/math" xmlns:v="urn:schemas-microsoft-com:vml" xmlns:wp14="http://schemas.microsoft.com/office/word/2010/wordprocessingDrawing" xmlns:wp="http://schemas.openxmlformats.org/drawingml/2006/wordprocessingDrawing" xmlns:w10="urn:schemas-microsoft-com:office:word" xmlns:w="http://schemas.openxmlformats.org/wordprocessingml/2006/main" xmlns:w14="http://schemas.microsoft.com/office/word/2010/wordml" xmlns:w15="http://schemas.microsoft.com/office/word/2012/wordml" xmlns:w16cex="http://schemas.microsoft.com/office/word/2018/wordml/cex" xmlns:w16cid="http://schemas.microsoft.com/office/word/2016/wordml/cid" xmlns:w16="http://schemas.microsoft.com/office/word/2018/wordml" xmlns:w16du="http://schemas.microsoft.com/office/word/2023/wordml/word16du" xmlns:w16sdtdh="http://schemas.microsoft.com/office/word/2020/wordml/sdtdatahash" xmlns:w16sdtfl="http://schemas.microsoft.com/office/word/2024/wordml/sdtformatlock" xmlns:w16se="http://schemas.microsoft.com/office/word/2015/wordml/symex" xmlns:wpg="http://schemas.microsoft.com/office/word/2010/wordprocessingGroup" xmlns:wpi="http://schemas.microsoft.com/office/word/2010/wordprocessingInk" xmlns:wne="http://schemas.microsoft.com/office/word/2006/wordml" xmlns:wps="http://schemas.microsoft.com/office/word/2010/wordprocessingShape" mc:Ignorable="w14 w15 w16se w16cid w16 w16cex w16sdtdh w16sdtfl w16du wp14">
+  <w:abstractNum w:abstractNumId="0" w15:restartNumberingAfterBreak="0">
+    <w:nsid w:val="00C24323"/>
+    <w:multiLevelType w:val="hybridMultilevel"/>
+    <w:tmpl w:val="C80C2540"/>
+    <w:lvl w:ilvl="0" w:tplc="65760094">
+      <w:start w:val="1"/>
+      <w:numFmt w:val="bullet"/>
+      <w:lvlText w:val=""/>
+      <w:lvlJc w:val="left"/>
+      <w:pPr>
+        <w:tabs>
+          <w:tab w:val="num" w:pos="720"/>
+        </w:tabs>
+        <w:ind w:left="720" w:hanging="360"/>
+      </w:pPr>
+      <w:rPr>
+        <w:rFonts w:ascii="Symbol" w:hAnsi="Symbol" w:hint="default"/>
+        <w:sz w:val="20"/>
+      </w:rPr>
+    </w:lvl>
+    <w:lvl w:ilvl="1" w:tplc="6DFE4540">
+      <w:start w:val="1"/>
+      <w:numFmt w:val="decimal"/>
+      <w:lvlText w:val="%2."/>
+      <w:lvlJc w:val="left"/>
+      <w:pPr>
+        <w:tabs>
+          <w:tab w:val="num" w:pos="1440"/>
+        </w:tabs>
+        <w:ind w:left="1440" w:hanging="360"/>
+      </w:pPr>
+    </w:lvl>
+    <w:lvl w:ilvl="2" w:tplc="FF6C80DE" w:tentative="1">
+      <w:start w:val="1"/>
+      <w:numFmt w:val="bullet"/>
+      <w:lvlText w:val=""/>
+      <w:lvlJc w:val="left"/>
+      <w:pPr>
+        <w:tabs>
+          <w:tab w:val="num" w:pos="2160"/>
+        </w:tabs>
+        <w:ind w:left="2160" w:hanging="360"/>
+      </w:pPr>
+      <w:rPr>
+        <w:rFonts w:ascii="Wingdings" w:hAnsi="Wingdings" w:hint="default"/>
+        <w:sz w:val="20"/>
+      </w:rPr>
+    </w:lvl>
+    <w:lvl w:ilvl="3" w:tplc="22207DF6" w:tentative="1">
+      <w:start w:val="1"/>
+      <w:numFmt w:val="bullet"/>
+      <w:lvlText w:val=""/>
+      <w:lvlJc w:val="left"/>
+      <w:pPr>
+        <w:tabs>
+          <w:tab w:val="num" w:pos="2880"/>
+        </w:tabs>
+        <w:ind w:left="2880" w:hanging="360"/>
+      </w:pPr>
+      <w:rPr>
+        <w:rFonts w:ascii="Wingdings" w:hAnsi="Wingdings" w:hint="default"/>
+        <w:sz w:val="20"/>
+      </w:rPr>
+    </w:lvl>
+    <w:lvl w:ilvl="4" w:tplc="E236BEFC" w:tentative="1">
+      <w:start w:val="1"/>
+      <w:numFmt w:val="bullet"/>
+      <w:lvlText w:val=""/>
+      <w:lvlJc w:val="left"/>
+      <w:pPr>
+        <w:tabs>
+          <w:tab w:val="num" w:pos="3600"/>
+        </w:tabs>
+        <w:ind w:left="3600" w:hanging="360"/>
+      </w:pPr>
+      <w:rPr>
+        <w:rFonts w:ascii="Wingdings" w:hAnsi="Wingdings" w:hint="default"/>
+        <w:sz w:val="20"/>
+      </w:rPr>
+    </w:lvl>
+    <w:lvl w:ilvl="5" w:tplc="60842640" w:tentative="1">
+      <w:start w:val="1"/>
+      <w:numFmt w:val="bullet"/>
+      <w:lvlText w:val=""/>
+      <w:lvlJc w:val="left"/>
+      <w:pPr>
+        <w:tabs>
+          <w:tab w:val="num" w:pos="4320"/>
+        </w:tabs>
+        <w:ind w:left="4320" w:hanging="360"/>
+      </w:pPr>
+      <w:rPr>
+        <w:rFonts w:ascii="Wingdings" w:hAnsi="Wingdings" w:hint="default"/>
+        <w:sz w:val="20"/>
+      </w:rPr>
+    </w:lvl>
+    <w:lvl w:ilvl="6" w:tplc="B7F27544" w:tentative="1">
+      <w:start w:val="1"/>
+      <w:numFmt w:val="bullet"/>
+      <w:lvlText w:val=""/>
+      <w:lvlJc w:val="left"/>
+      <w:pPr>
+        <w:tabs>
+          <w:tab w:val="num" w:pos="5040"/>
+        </w:tabs>
+        <w:ind w:left="5040" w:hanging="360"/>
+      </w:pPr>
+      <w:rPr>
+        <w:rFonts w:ascii="Wingdings" w:hAnsi="Wingdings" w:hint="default"/>
+        <w:sz w:val="20"/>
+      </w:rPr>
+    </w:lvl>
+    <w:lvl w:ilvl="7" w:tplc="4E36DCDE" w:tentative="1">
+      <w:start w:val="1"/>
+      <w:numFmt w:val="bullet"/>
+      <w:lvlText w:val=""/>
+      <w:lvlJc w:val="left"/>
+      <w:pPr>
+        <w:tabs>
+          <w:tab w:val="num" w:pos="5760"/>
+        </w:tabs>
+        <w:ind w:left="5760" w:hanging="360"/>
+      </w:pPr>
+      <w:rPr>
+        <w:rFonts w:ascii="Wingdings" w:hAnsi="Wingdings" w:hint="default"/>
+        <w:sz w:val="20"/>
+      </w:rPr>
+    </w:lvl>
+    <w:lvl w:ilvl="8" w:tplc="D854B9C2" w:tentative="1">
+      <w:start w:val="1"/>
+      <w:numFmt w:val="bullet"/>
+      <w:lvlText w:val=""/>
+      <w:lvlJc w:val="left"/>
+      <w:pPr>
+        <w:tabs>
+          <w:tab w:val="num" w:pos="6480"/>
+        </w:tabs>
+        <w:ind w:left="6480" w:hanging="360"/>
+      </w:pPr>
+      <w:rPr>
+        <w:rFonts w:ascii="Wingdings" w:hAnsi="Wingdings" w:hint="default"/>
+        <w:sz w:val="20"/>
+      </w:rPr>
+    </w:lvl>
+  </w:abstractNum>
+  <w:abstractNum w:abstractNumId="1" w15:restartNumberingAfterBreak="0">
+    <w:nsid w:val="35B173BD"/>
+    <w:multiLevelType w:val="multilevel"/>
+    <w:tmpl w:val="EBE66E46"/>
+    <w:lvl w:ilvl="0">
+      <w:start w:val="1"/>
+      <w:numFmt w:val="bullet"/>
+      <w:lvlText w:val=""/>
+      <w:lvlJc w:val="left"/>
+      <w:pPr>
+        <w:tabs>
+          <w:tab w:val="num" w:pos="720"/>
+        </w:tabs>
+        <w:ind w:left="720" w:hanging="360"/>
+      </w:pPr>
+      <w:rPr>
+        <w:rFonts w:ascii="Symbol" w:hAnsi="Symbol" w:hint="default"/>
+        <w:sz w:val="20"/>
+      </w:rPr>
+    </w:lvl>
+    <w:lvl w:ilvl="1">
+      <w:start w:val="1"/>
+      <w:numFmt w:val="bullet"/>
+      <w:lvlText w:val="o"/>
+      <w:lvlJc w:val="left"/>
+      <w:pPr>
+        <w:tabs>
+          <w:tab w:val="num" w:pos="1440"/>
+        </w:tabs>
+        <w:ind w:left="1440" w:hanging="360"/>
+      </w:pPr>
+      <w:rPr>
+        <w:rFonts w:ascii="Courier New" w:hAnsi="Courier New" w:hint="default"/>
+        <w:sz w:val="20"/>
+      </w:rPr>
+    </w:lvl>
+    <w:lvl w:ilvl="2" w:tentative="1">
+      <w:start w:val="1"/>
+      <w:numFmt w:val="bullet"/>
+      <w:lvlText w:val=""/>
+      <w:lvlJc w:val="left"/>
+      <w:pPr>
+        <w:tabs>
+          <w:tab w:val="num" w:pos="2160"/>
+        </w:tabs>
+        <w:ind w:left="2160" w:hanging="360"/>
+      </w:pPr>
+      <w:rPr>
+        <w:rFonts w:ascii="Wingdings" w:hAnsi="Wingdings" w:hint="default"/>
+        <w:sz w:val="20"/>
+      </w:rPr>
+    </w:lvl>
+    <w:lvl w:ilvl="3" w:tentative="1">
+      <w:start w:val="1"/>
+      <w:numFmt w:val="bullet"/>
+      <w:lvlText w:val=""/>
+      <w:lvlJc w:val="left"/>
+      <w:pPr>
+        <w:tabs>
+          <w:tab w:val="num" w:pos="2880"/>
+        </w:tabs>
+        <w:ind w:left="2880" w:hanging="360"/>
+      </w:pPr>
+      <w:rPr>
+        <w:rFonts w:ascii="Wingdings" w:hAnsi="Wingdings" w:hint="default"/>
+        <w:sz w:val="20"/>
+      </w:rPr>
+    </w:lvl>
+    <w:lvl w:ilvl="4" w:tentative="1">
+      <w:start w:val="1"/>
+      <w:numFmt w:val="bullet"/>
+      <w:lvlText w:val=""/>
+      <w:lvlJc w:val="left"/>
+      <w:pPr>
+        <w:tabs>
+          <w:tab w:val="num" w:pos="3600"/>
+        </w:tabs>
+        <w:ind w:left="3600" w:hanging="360"/>
+      </w:pPr>
+      <w:rPr>
+        <w:rFonts w:ascii="Wingdings" w:hAnsi="Wingdings" w:hint="default"/>
+        <w:sz w:val="20"/>
+      </w:rPr>
+    </w:lvl>
+    <w:lvl w:ilvl="5" w:tentative="1">
+      <w:start w:val="1"/>
+      <w:numFmt w:val="bullet"/>
+      <w:lvlText w:val=""/>
+      <w:lvlJc w:val="left"/>
+      <w:pPr>
+        <w:tabs>
+          <w:tab w:val="num" w:pos="4320"/>
+        </w:tabs>
+        <w:ind w:left="4320" w:hanging="360"/>
+      </w:pPr>
+      <w:rPr>
+        <w:rFonts w:ascii="Wingdings" w:hAnsi="Wingdings" w:hint="default"/>
+        <w:sz w:val="20"/>
+      </w:rPr>
+    </w:lvl>
+    <w:lvl w:ilvl="6" w:tentative="1">
+      <w:start w:val="1"/>
+      <w:numFmt w:val="bullet"/>
+      <w:lvlText w:val=""/>
+      <w:lvlJc w:val="left"/>
+      <w:pPr>
+        <w:tabs>
+          <w:tab w:val="num" w:pos="5040"/>
+        </w:tabs>
+        <w:ind w:left="5040" w:hanging="360"/>
+      </w:pPr>
+      <w:rPr>
+        <w:rFonts w:ascii="Wingdings" w:hAnsi="Wingdings" w:hint="default"/>
+        <w:sz w:val="20"/>
+      </w:rPr>
+    </w:lvl>
+    <w:lvl w:ilvl="7" w:tentative="1">
+      <w:start w:val="1"/>
+      <w:numFmt w:val="bullet"/>
+      <w:lvlText w:val=""/>
+      <w:lvlJc w:val="left"/>
+      <w:pPr>
+        <w:tabs>
+          <w:tab w:val="num" w:pos="5760"/>
+        </w:tabs>
+        <w:ind w:left="5760" w:hanging="360"/>
+      </w:pPr>
+      <w:rPr>
+        <w:rFonts w:ascii="Wingdings" w:hAnsi="Wingdings" w:hint="default"/>
+        <w:sz w:val="20"/>
+      </w:rPr>
+    </w:lvl>
+    <w:lvl w:ilvl="8" w:tentative="1">
+      <w:start w:val="1"/>
+      <w:numFmt w:val="bullet"/>
+      <w:lvlText w:val=""/>
+      <w:lvlJc w:val="left"/>
+      <w:pPr>
+        <w:tabs>
+          <w:tab w:val="num" w:pos="6480"/>
+        </w:tabs>
+        <w:ind w:left="6480" w:hanging="360"/>
+      </w:pPr>
+      <w:rPr>
+        <w:rFonts w:ascii="Wingdings" w:hAnsi="Wingdings" w:hint="default"/>
+        <w:sz w:val="20"/>
+      </w:rPr>
+    </w:lvl>
+  </w:abstractNum>
+  <w:abstractNum w:abstractNumId="2" w15:restartNumberingAfterBreak="0">
+    <w:nsid w:val="563322F1"/>
+    <w:multiLevelType w:val="multilevel"/>
+    <w:tmpl w:val="7FA8F40C"/>
+    <w:lvl w:ilvl="0">
+      <w:start w:val="1"/>
+      <w:numFmt w:val="decimal"/>
+      <w:lvlText w:val="%1."/>
+      <w:lvlJc w:val="left"/>
+      <w:pPr>
+        <w:tabs>
+          <w:tab w:val="num" w:pos="720"/>
+        </w:tabs>
+        <w:ind w:left="720" w:hanging="360"/>
+      </w:pPr>
+    </w:lvl>
+    <w:lvl w:ilvl="1">
+      <w:start w:val="1"/>
+      <w:numFmt w:val="bullet"/>
+      <w:lvlText w:val="o"/>
+      <w:lvlJc w:val="left"/>
+      <w:pPr>
+        <w:tabs>
+          <w:tab w:val="num" w:pos="1440"/>
+        </w:tabs>
+        <w:ind w:left="1440" w:hanging="360"/>
+      </w:pPr>
+      <w:rPr>
+        <w:rFonts w:ascii="Courier New" w:hAnsi="Courier New" w:hint="default"/>
+        <w:sz w:val="20"/>
+      </w:rPr>
+    </w:lvl>
+    <w:lvl w:ilvl="2">
+      <w:start w:val="1"/>
+      <w:numFmt w:val="bullet"/>
+      <w:lvlText w:val=""/>
+      <w:lvlJc w:val="left"/>
+      <w:pPr>
+        <w:tabs>
+          <w:tab w:val="num" w:pos="2160"/>
+        </w:tabs>
+        <w:ind w:left="2160" w:hanging="360"/>
+      </w:pPr>
+      <w:rPr>
+        <w:rFonts w:ascii="Wingdings" w:hAnsi="Wingdings" w:hint="default"/>
+        <w:sz w:val="20"/>
+      </w:rPr>
+    </w:lvl>
+    <w:lvl w:ilvl="3" w:tentative="1">
+      <w:start w:val="1"/>
+      <w:numFmt w:val="decimal"/>
+      <w:lvlText w:val="%4."/>
+      <w:lvlJc w:val="left"/>
+      <w:pPr>
+        <w:tabs>
+          <w:tab w:val="num" w:pos="2880"/>
+        </w:tabs>
+        <w:ind w:left="2880" w:hanging="360"/>
+      </w:pPr>
+    </w:lvl>
+    <w:lvl w:ilvl="4" w:tentative="1">
+      <w:start w:val="1"/>
+      <w:numFmt w:val="decimal"/>
+      <w:lvlText w:val="%5."/>
+      <w:lvlJc w:val="left"/>
+      <w:pPr>
+        <w:tabs>
+          <w:tab w:val="num" w:pos="3600"/>
+        </w:tabs>
+        <w:ind w:left="3600" w:hanging="360"/>
+      </w:pPr>
+    </w:lvl>
+    <w:lvl w:ilvl="5" w:tentative="1">
+      <w:start w:val="1"/>
+      <w:numFmt w:val="decimal"/>
+      <w:lvlText w:val="%6."/>
+      <w:lvlJc w:val="left"/>
+      <w:pPr>
+        <w:tabs>
+          <w:tab w:val="num" w:pos="4320"/>
+        </w:tabs>
+        <w:ind w:left="4320" w:hanging="360"/>
+      </w:pPr>
+    </w:lvl>
+    <w:lvl w:ilvl="6" w:tentative="1">
+      <w:start w:val="1"/>
+      <w:numFmt w:val="decimal"/>
+      <w:lvlText w:val="%7."/>
+      <w:lvlJc w:val="left"/>
+      <w:pPr>
+        <w:tabs>
+          <w:tab w:val="num" w:pos="5040"/>
+        </w:tabs>
+        <w:ind w:left="5040" w:hanging="360"/>
+      </w:pPr>
+    </w:lvl>
+    <w:lvl w:ilvl="7" w:tentative="1">
+      <w:start w:val="1"/>
+      <w:numFmt w:val="decimal"/>
+      <w:lvlText w:val="%8."/>
+      <w:lvlJc w:val="left"/>
+      <w:pPr>
+        <w:tabs>
+          <w:tab w:val="num" w:pos="5760"/>
+        </w:tabs>
+        <w:ind w:left="5760" w:hanging="360"/>
+      </w:pPr>
+    </w:lvl>
+    <w:lvl w:ilvl="8" w:tentative="1">
+      <w:start w:val="1"/>
+      <w:numFmt w:val="decimal"/>
+      <w:lvlText w:val="%9."/>
+      <w:lvlJc w:val="left"/>
+      <w:pPr>
+        <w:tabs>
+          <w:tab w:val="num" w:pos="6480"/>
+        </w:tabs>
+        <w:ind w:left="6480" w:hanging="360"/>
+      </w:pPr>
+    </w:lvl>
+  </w:abstractNum>
+  <w:abstractNum w:abstractNumId="3" w15:restartNumberingAfterBreak="0">
+    <w:nsid w:val="678942D3"/>
+    <w:multiLevelType w:val="multilevel"/>
+    <w:tmpl w:val="B014946A"/>
+    <w:lvl w:ilvl="0">
+      <w:start w:val="1"/>
+      <w:numFmt w:val="bullet"/>
+      <w:lvlText w:val=""/>
+      <w:lvlJc w:val="left"/>
+      <w:pPr>
+        <w:tabs>
+          <w:tab w:val="num" w:pos="720"/>
+        </w:tabs>
+        <w:ind w:left="720" w:hanging="360"/>
+      </w:pPr>
+      <w:rPr>
+        <w:rFonts w:ascii="Symbol" w:hAnsi="Symbol" w:hint="default"/>
+        <w:sz w:val="20"/>
+      </w:rPr>
+    </w:lvl>
+    <w:lvl w:ilvl="1" w:tentative="1">
+      <w:start w:val="1"/>
+      <w:numFmt w:val="bullet"/>
+      <w:lvlText w:val="o"/>
+      <w:lvlJc w:val="left"/>
+      <w:pPr>
+        <w:tabs>
+          <w:tab w:val="num" w:pos="1440"/>
+        </w:tabs>
+        <w:ind w:left="1440" w:hanging="360"/>
+      </w:pPr>
+      <w:rPr>
+        <w:rFonts w:ascii="Courier New" w:hAnsi="Courier New" w:hint="default"/>
+        <w:sz w:val="20"/>
+      </w:rPr>
+    </w:lvl>
+    <w:lvl w:ilvl="2" w:tentative="1">
+      <w:start w:val="1"/>
+      <w:numFmt w:val="bullet"/>
+      <w:lvlText w:val=""/>
+      <w:lvlJc w:val="left"/>
+      <w:pPr>
+        <w:tabs>
+          <w:tab w:val="num" w:pos="2160"/>
+        </w:tabs>
+        <w:ind w:left="2160" w:hanging="360"/>
+      </w:pPr>
+      <w:rPr>
+        <w:rFonts w:ascii="Wingdings" w:hAnsi="Wingdings" w:hint="default"/>
+        <w:sz w:val="20"/>
+      </w:rPr>
+    </w:lvl>
+    <w:lvl w:ilvl="3" w:tentative="1">
+      <w:start w:val="1"/>
+      <w:numFmt w:val="bullet"/>
+      <w:lvlText w:val=""/>
+      <w:lvlJc w:val="left"/>
+      <w:pPr>
+        <w:tabs>
+          <w:tab w:val="num" w:pos="2880"/>
+        </w:tabs>
+        <w:ind w:left="2880" w:hanging="360"/>
+      </w:pPr>
+      <w:rPr>
+        <w:rFonts w:ascii="Wingdings" w:hAnsi="Wingdings" w:hint="default"/>
+        <w:sz w:val="20"/>
+      </w:rPr>
+    </w:lvl>
+    <w:lvl w:ilvl="4" w:tentative="1">
+      <w:start w:val="1"/>
+      <w:numFmt w:val="bullet"/>
+      <w:lvlText w:val=""/>
+      <w:lvlJc w:val="left"/>
+      <w:pPr>
+        <w:tabs>
+          <w:tab w:val="num" w:pos="3600"/>
+        </w:tabs>
+        <w:ind w:left="3600" w:hanging="360"/>
+      </w:pPr>
+      <w:rPr>
+        <w:rFonts w:ascii="Wingdings" w:hAnsi="Wingdings" w:hint="default"/>
+        <w:sz w:val="20"/>
+      </w:rPr>
+    </w:lvl>
+    <w:lvl w:ilvl="5" w:tentative="1">
+      <w:start w:val="1"/>
+      <w:numFmt w:val="bullet"/>
+      <w:lvlText w:val=""/>
+      <w:lvlJc w:val="left"/>
+      <w:pPr>
+        <w:tabs>
+          <w:tab w:val="num" w:pos="4320"/>
+        </w:tabs>
+        <w:ind w:left="4320" w:hanging="360"/>
+      </w:pPr>
+      <w:rPr>
+        <w:rFonts w:ascii="Wingdings" w:hAnsi="Wingdings" w:hint="default"/>
+        <w:sz w:val="20"/>
+      </w:rPr>
+    </w:lvl>
+    <w:lvl w:ilvl="6" w:tentative="1">
+      <w:start w:val="1"/>
+      <w:numFmt w:val="bullet"/>
+      <w:lvlText w:val=""/>
+      <w:lvlJc w:val="left"/>
+      <w:pPr>
+        <w:tabs>
+          <w:tab w:val="num" w:pos="5040"/>
+        </w:tabs>
+        <w:ind w:left="5040" w:hanging="360"/>
+      </w:pPr>
+      <w:rPr>
+        <w:rFonts w:ascii="Wingdings" w:hAnsi="Wingdings" w:hint="default"/>
+        <w:sz w:val="20"/>
+      </w:rPr>
+    </w:lvl>
+    <w:lvl w:ilvl="7" w:tentative="1">
+      <w:start w:val="1"/>
+      <w:numFmt w:val="bullet"/>
+      <w:lvlText w:val=""/>
+      <w:lvlJc w:val="left"/>
+      <w:pPr>
+        <w:tabs>
+          <w:tab w:val="num" w:pos="5760"/>
+        </w:tabs>
+        <w:ind w:left="5760" w:hanging="360"/>
+      </w:pPr>
+      <w:rPr>
+        <w:rFonts w:ascii="Wingdings" w:hAnsi="Wingdings" w:hint="default"/>
+        <w:sz w:val="20"/>
+      </w:rPr>
+    </w:lvl>
+    <w:lvl w:ilvl="8" w:tentative="1">
+      <w:start w:val="1"/>
+      <w:numFmt w:val="bullet"/>
+      <w:lvlText w:val=""/>
+      <w:lvlJc w:val="left"/>
+      <w:pPr>
+        <w:tabs>
+          <w:tab w:val="num" w:pos="6480"/>
+        </w:tabs>
+        <w:ind w:left="6480" w:hanging="360"/>
+      </w:pPr>
+      <w:rPr>
+        <w:rFonts w:ascii="Wingdings" w:hAnsi="Wingdings" w:hint="default"/>
+        <w:sz w:val="20"/>
+      </w:rPr>
+    </w:lvl>
+  </w:abstractNum>
+  <w:abstractNum w:abstractNumId="4" w15:restartNumberingAfterBreak="0">
+    <w:nsid w:val="69F05BF9"/>
+    <w:multiLevelType w:val="multilevel"/>
+    <w:tmpl w:val="776AAD52"/>
+    <w:lvl w:ilvl="0">
+      <w:start w:val="1"/>
+      <w:numFmt w:val="bullet"/>
+      <w:lvlText w:val=""/>
+      <w:lvlJc w:val="left"/>
+      <w:pPr>
+        <w:tabs>
+          <w:tab w:val="num" w:pos="720"/>
+        </w:tabs>
+        <w:ind w:left="720" w:hanging="360"/>
+      </w:pPr>
+      <w:rPr>
+        <w:rFonts w:ascii="Symbol" w:hAnsi="Symbol" w:hint="default"/>
+        <w:sz w:val="20"/>
+      </w:rPr>
+    </w:lvl>
+    <w:lvl w:ilvl="1" w:tentative="1">
+      <w:start w:val="1"/>
+      <w:numFmt w:val="bullet"/>
+      <w:lvlText w:val="o"/>
+      <w:lvlJc w:val="left"/>
+      <w:pPr>
+        <w:tabs>
+          <w:tab w:val="num" w:pos="1440"/>
+        </w:tabs>
+        <w:ind w:left="1440" w:hanging="360"/>
+      </w:pPr>
+      <w:rPr>
+        <w:rFonts w:ascii="Courier New" w:hAnsi="Courier New" w:hint="default"/>
+        <w:sz w:val="20"/>
+      </w:rPr>
+    </w:lvl>
+    <w:lvl w:ilvl="2" w:tentative="1">
+      <w:start w:val="1"/>
+      <w:numFmt w:val="bullet"/>
+      <w:lvlText w:val=""/>
+      <w:lvlJc w:val="left"/>
+      <w:pPr>
+        <w:tabs>
+          <w:tab w:val="num" w:pos="2160"/>
+        </w:tabs>
+        <w:ind w:left="2160" w:hanging="360"/>
+      </w:pPr>
+      <w:rPr>
+        <w:rFonts w:ascii="Wingdings" w:hAnsi="Wingdings" w:hint="default"/>
+        <w:sz w:val="20"/>
+      </w:rPr>
+    </w:lvl>
+    <w:lvl w:ilvl="3" w:tentative="1">
+      <w:start w:val="1"/>
+      <w:numFmt w:val="bullet"/>
+      <w:lvlText w:val=""/>
+      <w:lvlJc w:val="left"/>
+      <w:pPr>
+        <w:tabs>
+          <w:tab w:val="num" w:pos="2880"/>
+        </w:tabs>
+        <w:ind w:left="2880" w:hanging="360"/>
+      </w:pPr>
+      <w:rPr>
+        <w:rFonts w:ascii="Wingdings" w:hAnsi="Wingdings" w:hint="default"/>
+        <w:sz w:val="20"/>
+      </w:rPr>
+    </w:lvl>
+    <w:lvl w:ilvl="4" w:tentative="1">
+      <w:start w:val="1"/>
+      <w:numFmt w:val="bullet"/>
+      <w:lvlText w:val=""/>
+      <w:lvlJc w:val="left"/>
+      <w:pPr>
+        <w:tabs>
+          <w:tab w:val="num" w:pos="3600"/>
+        </w:tabs>
+        <w:ind w:left="3600" w:hanging="360"/>
+      </w:pPr>
+      <w:rPr>
+        <w:rFonts w:ascii="Wingdings" w:hAnsi="Wingdings" w:hint="default"/>
+        <w:sz w:val="20"/>
+      </w:rPr>
+    </w:lvl>
+    <w:lvl w:ilvl="5" w:tentative="1">
+      <w:start w:val="1"/>
+      <w:numFmt w:val="bullet"/>
+      <w:lvlText w:val=""/>
+      <w:lvlJc w:val="left"/>
+      <w:pPr>
+        <w:tabs>
+          <w:tab w:val="num" w:pos="4320"/>
+        </w:tabs>
+        <w:ind w:left="4320" w:hanging="360"/>
+      </w:pPr>
+      <w:rPr>
+        <w:rFonts w:ascii="Wingdings" w:hAnsi="Wingdings" w:hint="default"/>
+        <w:sz w:val="20"/>
+      </w:rPr>
+    </w:lvl>
+    <w:lvl w:ilvl="6" w:tentative="1">
+      <w:start w:val="1"/>
+      <w:numFmt w:val="bullet"/>
+      <w:lvlText w:val=""/>
+      <w:lvlJc w:val="left"/>
+      <w:pPr>
+        <w:tabs>
+          <w:tab w:val="num" w:pos="5040"/>
+        </w:tabs>
+        <w:ind w:left="5040" w:hanging="360"/>
+      </w:pPr>
+      <w:rPr>
+        <w:rFonts w:ascii="Wingdings" w:hAnsi="Wingdings" w:hint="default"/>
+        <w:sz w:val="20"/>
+      </w:rPr>
+    </w:lvl>
+    <w:lvl w:ilvl="7" w:tentative="1">
+      <w:start w:val="1"/>
+      <w:numFmt w:val="bullet"/>
+      <w:lvlText w:val=""/>
+      <w:lvlJc w:val="left"/>
+      <w:pPr>
+        <w:tabs>
+          <w:tab w:val="num" w:pos="5760"/>
+        </w:tabs>
+        <w:ind w:left="5760" w:hanging="360"/>
+      </w:pPr>
+      <w:rPr>
+        <w:rFonts w:ascii="Wingdings" w:hAnsi="Wingdings" w:hint="default"/>
+        <w:sz w:val="20"/>
+      </w:rPr>
+    </w:lvl>
+    <w:lvl w:ilvl="8" w:tentative="1">
+      <w:start w:val="1"/>
+      <w:numFmt w:val="bullet"/>
+      <w:lvlText w:val=""/>
+      <w:lvlJc w:val="left"/>
+      <w:pPr>
+        <w:tabs>
+          <w:tab w:val="num" w:pos="6480"/>
+        </w:tabs>
+        <w:ind w:left="6480" w:hanging="360"/>
+      </w:pPr>
+      <w:rPr>
+        <w:rFonts w:ascii="Wingdings" w:hAnsi="Wingdings" w:hint="default"/>
+        <w:sz w:val="20"/>
+      </w:rPr>
+    </w:lvl>
+  </w:abstractNum>
+  <w:abstractNum w:abstractNumId="5" w15:restartNumberingAfterBreak="0">
+    <w:nsid w:val="74E13F54"/>
+    <w:multiLevelType w:val="multilevel"/>
+    <w:tmpl w:val="7A4AEFDE"/>
+    <w:lvl w:ilvl="0">
+      <w:start w:val="1"/>
+      <w:numFmt w:val="bullet"/>
+      <w:lvlText w:val=""/>
+      <w:lvlJc w:val="left"/>
+      <w:pPr>
+        <w:tabs>
+          <w:tab w:val="num" w:pos="720"/>
+        </w:tabs>
+        <w:ind w:left="720" w:hanging="360"/>
+      </w:pPr>
+      <w:rPr>
+        <w:rFonts w:ascii="Symbol" w:hAnsi="Symbol" w:hint="default"/>
+        <w:sz w:val="20"/>
+      </w:rPr>
+    </w:lvl>
+    <w:lvl w:ilvl="1">
+      <w:start w:val="1"/>
+      <w:numFmt w:val="bullet"/>
+      <w:lvlText w:val="o"/>
+      <w:lvlJc w:val="left"/>
+      <w:pPr>
+        <w:tabs>
+          <w:tab w:val="num" w:pos="1440"/>
+        </w:tabs>
+        <w:ind w:left="1440" w:hanging="360"/>
+      </w:pPr>
+      <w:rPr>
+        <w:rFonts w:ascii="Courier New" w:hAnsi="Courier New" w:hint="default"/>
+        <w:sz w:val="20"/>
+      </w:rPr>
+    </w:lvl>
+    <w:lvl w:ilvl="2" w:tentative="1">
+      <w:start w:val="1"/>
+      <w:numFmt w:val="bullet"/>
+      <w:lvlText w:val=""/>
+      <w:lvlJc w:val="left"/>
+      <w:pPr>
+        <w:tabs>
+          <w:tab w:val="num" w:pos="2160"/>
+        </w:tabs>
+        <w:ind w:left="2160" w:hanging="360"/>
+      </w:pPr>
+      <w:rPr>
+        <w:rFonts w:ascii="Wingdings" w:hAnsi="Wingdings" w:hint="default"/>
+        <w:sz w:val="20"/>
+      </w:rPr>
+    </w:lvl>
+    <w:lvl w:ilvl="3" w:tentative="1">
+      <w:start w:val="1"/>
+      <w:numFmt w:val="bullet"/>
+      <w:lvlText w:val=""/>
+      <w:lvlJc w:val="left"/>
+      <w:pPr>
+        <w:tabs>
+          <w:tab w:val="num" w:pos="2880"/>
+        </w:tabs>
+        <w:ind w:left="2880" w:hanging="360"/>
+      </w:pPr>
+      <w:rPr>
+        <w:rFonts w:ascii="Wingdings" w:hAnsi="Wingdings" w:hint="default"/>
+        <w:sz w:val="20"/>
+      </w:rPr>
+    </w:lvl>
+    <w:lvl w:ilvl="4" w:tentative="1">
+      <w:start w:val="1"/>
+      <w:numFmt w:val="bullet"/>
+      <w:lvlText w:val=""/>
+      <w:lvlJc w:val="left"/>
+      <w:pPr>
+        <w:tabs>
+          <w:tab w:val="num" w:pos="3600"/>
+        </w:tabs>
+        <w:ind w:left="3600" w:hanging="360"/>
+      </w:pPr>
+      <w:rPr>
+        <w:rFonts w:ascii="Wingdings" w:hAnsi="Wingdings" w:hint="default"/>
+        <w:sz w:val="20"/>
+      </w:rPr>
+    </w:lvl>
+    <w:lvl w:ilvl="5" w:tentative="1">
+      <w:start w:val="1"/>
+      <w:numFmt w:val="bullet"/>
+      <w:lvlText w:val=""/>
+      <w:lvlJc w:val="left"/>
+      <w:pPr>
+        <w:tabs>
+          <w:tab w:val="num" w:pos="4320"/>
+        </w:tabs>
+        <w:ind w:left="4320" w:hanging="360"/>
+      </w:pPr>
+      <w:rPr>
+        <w:rFonts w:ascii="Wingdings" w:hAnsi="Wingdings" w:hint="default"/>
+        <w:sz w:val="20"/>
+      </w:rPr>
+    </w:lvl>
+    <w:lvl w:ilvl="6" w:tentative="1">
+      <w:start w:val="1"/>
+      <w:numFmt w:val="bullet"/>
+      <w:lvlText w:val=""/>
+      <w:lvlJc w:val="left"/>
+      <w:pPr>
+        <w:tabs>
+          <w:tab w:val="num" w:pos="5040"/>
+        </w:tabs>
+        <w:ind w:left="5040" w:hanging="360"/>
+      </w:pPr>
+      <w:rPr>
+        <w:rFonts w:ascii="Wingdings" w:hAnsi="Wingdings" w:hint="default"/>
+        <w:sz w:val="20"/>
+      </w:rPr>
+    </w:lvl>
+    <w:lvl w:ilvl="7" w:tentative="1">
+      <w:start w:val="1"/>
+      <w:numFmt w:val="bullet"/>
+      <w:lvlText w:val=""/>
+      <w:lvlJc w:val="left"/>
+      <w:pPr>
+        <w:tabs>
+          <w:tab w:val="num" w:pos="5760"/>
+        </w:tabs>
+        <w:ind w:left="5760" w:hanging="360"/>
+      </w:pPr>
+      <w:rPr>
+        <w:rFonts w:ascii="Wingdings" w:hAnsi="Wingdings" w:hint="default"/>
+        <w:sz w:val="20"/>
+      </w:rPr>
+    </w:lvl>
+    <w:lvl w:ilvl="8" w:tentative="1">
+      <w:start w:val="1"/>
+      <w:numFmt w:val="bullet"/>
+      <w:lvlText w:val=""/>
+      <w:lvlJc w:val="left"/>
+      <w:pPr>
+        <w:tabs>
+          <w:tab w:val="num" w:pos="6480"/>
+        </w:tabs>
+        <w:ind w:left="6480" w:hanging="360"/>
+      </w:pPr>
+      <w:rPr>
+        <w:rFonts w:ascii="Wingdings" w:hAnsi="Wingdings" w:hint="default"/>
+        <w:sz w:val="20"/>
+      </w:rPr>
+    </w:lvl>
+  </w:abstractNum>
+  <w:num w:numId="1" w16cid:durableId="1634942704">
+    <w:abstractNumId w:val="4"/>
+  </w:num>
+  <w:num w:numId="2" w16cid:durableId="43455050">
+    <w:abstractNumId w:val="1"/>
+  </w:num>
+  <w:num w:numId="3" w16cid:durableId="15693454">
+    <w:abstractNumId w:val="2"/>
+  </w:num>
+  <w:num w:numId="4" w16cid:durableId="1716544912">
+    <w:abstractNumId w:val="5"/>
+  </w:num>
+  <w:num w:numId="5" w16cid:durableId="5139372">
+    <w:abstractNumId w:val="0"/>
+  </w:num>
+  <w:num w:numId="6" w16cid:durableId="366835832">
+    <w:abstractNumId w:val="3"/>
+  </w:num>
+</w:numbering>
 </file>
 
 <file path=word/styles.xml><?xml version="1.0" encoding="utf-8"?>
@@ -647,7 +3820,6 @@
   <w:style w:type="character" w:default="1" w:styleId="DefaultParagraphFont">
     <w:name w:val="Default Paragraph Font"/>
     <w:uiPriority w:val="1"/>
-    <w:semiHidden/>
     <w:unhideWhenUsed/>
   </w:style>
   <w:style w:type="table" w:default="1" w:styleId="TableNormal">

</xml_diff>

<commit_message>
started document object manipulation
</commit_message>
<xml_diff>
--- a/JAVASCRIPT NOTES/JAVASCRIPT NOTES (2) AFTER BASICS.docx
+++ b/JAVASCRIPT NOTES/JAVASCRIPT NOTES (2) AFTER BASICS.docx
@@ -579,7 +579,49 @@
       </w:r>
       <w:proofErr w:type="spellEnd"/>
       <w:r>
-        <w:t xml:space="preserve"> (location, history, storage, and document).</w:t>
+        <w:t xml:space="preserve"> (location, history, storage, and document)</w:t>
+      </w:r>
+      <w:r>
+        <w:t>.</w:t>
+      </w:r>
+    </w:p>
+    <w:p>
+      <w:r>
+        <w:drawing>
+          <wp:inline distT="0" distB="0" distL="0" distR="0" wp14:anchorId="2B8A6FBC" wp14:editId="61402939">
+            <wp:extent cx="5731510" cy="4445000"/>
+            <wp:effectExtent l="0" t="0" r="2540" b="0"/>
+            <wp:docPr id="1984981641" name="Picture 1"/>
+            <wp:cNvGraphicFramePr>
+              <a:graphicFrameLocks xmlns:a="http://schemas.openxmlformats.org/drawingml/2006/main" noChangeAspect="1"/>
+            </wp:cNvGraphicFramePr>
+            <a:graphic xmlns:a="http://schemas.openxmlformats.org/drawingml/2006/main">
+              <a:graphicData uri="http://schemas.openxmlformats.org/drawingml/2006/picture">
+                <pic:pic xmlns:pic="http://schemas.openxmlformats.org/drawingml/2006/picture">
+                  <pic:nvPicPr>
+                    <pic:cNvPr id="1984981641" name=""/>
+                    <pic:cNvPicPr/>
+                  </pic:nvPicPr>
+                  <pic:blipFill>
+                    <a:blip r:embed="rId5"/>
+                    <a:stretch>
+                      <a:fillRect/>
+                    </a:stretch>
+                  </pic:blipFill>
+                  <pic:spPr>
+                    <a:xfrm>
+                      <a:off x="0" y="0"/>
+                      <a:ext cx="5731510" cy="4445000"/>
+                    </a:xfrm>
+                    <a:prstGeom prst="rect">
+                      <a:avLst/>
+                    </a:prstGeom>
+                  </pic:spPr>
+                </pic:pic>
+              </a:graphicData>
+            </a:graphic>
+          </wp:inline>
+        </w:drawing>
       </w:r>
     </w:p>
     <w:p>
@@ -594,6 +636,7 @@
           <w:b/>
           <w:bCs/>
         </w:rPr>
+        <w:lastRenderedPageBreak/>
         <w:t>Document Object:</w:t>
       </w:r>
       <w:r>
@@ -775,6 +818,231 @@
     </w:p>
     <w:p>
       <w:r>
+        <w:drawing>
+          <wp:inline distT="0" distB="0" distL="0" distR="0" wp14:anchorId="22D6F708" wp14:editId="6893C300">
+            <wp:extent cx="5731510" cy="3492500"/>
+            <wp:effectExtent l="0" t="0" r="2540" b="0"/>
+            <wp:docPr id="1340292692" name="Picture 1"/>
+            <wp:cNvGraphicFramePr>
+              <a:graphicFrameLocks xmlns:a="http://schemas.openxmlformats.org/drawingml/2006/main" noChangeAspect="1"/>
+            </wp:cNvGraphicFramePr>
+            <a:graphic xmlns:a="http://schemas.openxmlformats.org/drawingml/2006/main">
+              <a:graphicData uri="http://schemas.openxmlformats.org/drawingml/2006/picture">
+                <pic:pic xmlns:pic="http://schemas.openxmlformats.org/drawingml/2006/picture">
+                  <pic:nvPicPr>
+                    <pic:cNvPr id="1340292692" name=""/>
+                    <pic:cNvPicPr/>
+                  </pic:nvPicPr>
+                  <pic:blipFill>
+                    <a:blip r:embed="rId6"/>
+                    <a:stretch>
+                      <a:fillRect/>
+                    </a:stretch>
+                  </pic:blipFill>
+                  <pic:spPr>
+                    <a:xfrm>
+                      <a:off x="0" y="0"/>
+                      <a:ext cx="5731510" cy="3492500"/>
+                    </a:xfrm>
+                    <a:prstGeom prst="rect">
+                      <a:avLst/>
+                    </a:prstGeom>
+                  </pic:spPr>
+                </pic:pic>
+              </a:graphicData>
+            </a:graphic>
+          </wp:inline>
+        </w:drawing>
+      </w:r>
+    </w:p>
+    <w:p>
+      <w:pPr>
+        <w:rPr>
+          <w:b/>
+          <w:bCs/>
+          <w:sz w:val="32"/>
+          <w:szCs w:val="32"/>
+        </w:rPr>
+      </w:pPr>
+      <w:r>
+        <w:rPr>
+          <w:b/>
+          <w:bCs/>
+          <w:sz w:val="32"/>
+          <w:szCs w:val="32"/>
+        </w:rPr>
+        <w:t xml:space="preserve"># </w:t>
+      </w:r>
+      <w:r>
+        <w:rPr>
+          <w:b/>
+          <w:bCs/>
+          <w:sz w:val="32"/>
+          <w:szCs w:val="32"/>
+          <w:u w:val="single"/>
+        </w:rPr>
+        <w:t>console.log(document)</w:t>
+      </w:r>
+    </w:p>
+    <w:p>
+      <w:r>
+        <w:drawing>
+          <wp:inline distT="0" distB="0" distL="0" distR="0" wp14:anchorId="640ADE70" wp14:editId="73183D17">
+            <wp:extent cx="5731510" cy="3005455"/>
+            <wp:effectExtent l="0" t="0" r="2540" b="4445"/>
+            <wp:docPr id="1444295210" name="Picture 1"/>
+            <wp:cNvGraphicFramePr>
+              <a:graphicFrameLocks xmlns:a="http://schemas.openxmlformats.org/drawingml/2006/main" noChangeAspect="1"/>
+            </wp:cNvGraphicFramePr>
+            <a:graphic xmlns:a="http://schemas.openxmlformats.org/drawingml/2006/main">
+              <a:graphicData uri="http://schemas.openxmlformats.org/drawingml/2006/picture">
+                <pic:pic xmlns:pic="http://schemas.openxmlformats.org/drawingml/2006/picture">
+                  <pic:nvPicPr>
+                    <pic:cNvPr id="1444295210" name=""/>
+                    <pic:cNvPicPr/>
+                  </pic:nvPicPr>
+                  <pic:blipFill>
+                    <a:blip r:embed="rId7"/>
+                    <a:stretch>
+                      <a:fillRect/>
+                    </a:stretch>
+                  </pic:blipFill>
+                  <pic:spPr>
+                    <a:xfrm>
+                      <a:off x="0" y="0"/>
+                      <a:ext cx="5731510" cy="3005455"/>
+                    </a:xfrm>
+                    <a:prstGeom prst="rect">
+                      <a:avLst/>
+                    </a:prstGeom>
+                  </pic:spPr>
+                </pic:pic>
+              </a:graphicData>
+            </a:graphic>
+          </wp:inline>
+        </w:drawing>
+      </w:r>
+    </w:p>
+    <w:p>
+      <w:r>
+        <w:lastRenderedPageBreak/>
+        <w:drawing>
+          <wp:inline distT="0" distB="0" distL="0" distR="0" wp14:anchorId="706816A4" wp14:editId="6439835B">
+            <wp:extent cx="5572903" cy="3143689"/>
+            <wp:effectExtent l="0" t="0" r="8890" b="0"/>
+            <wp:docPr id="826141354" name="Picture 1"/>
+            <wp:cNvGraphicFramePr>
+              <a:graphicFrameLocks xmlns:a="http://schemas.openxmlformats.org/drawingml/2006/main" noChangeAspect="1"/>
+            </wp:cNvGraphicFramePr>
+            <a:graphic xmlns:a="http://schemas.openxmlformats.org/drawingml/2006/main">
+              <a:graphicData uri="http://schemas.openxmlformats.org/drawingml/2006/picture">
+                <pic:pic xmlns:pic="http://schemas.openxmlformats.org/drawingml/2006/picture">
+                  <pic:nvPicPr>
+                    <pic:cNvPr id="826141354" name=""/>
+                    <pic:cNvPicPr/>
+                  </pic:nvPicPr>
+                  <pic:blipFill>
+                    <a:blip r:embed="rId8"/>
+                    <a:stretch>
+                      <a:fillRect/>
+                    </a:stretch>
+                  </pic:blipFill>
+                  <pic:spPr>
+                    <a:xfrm>
+                      <a:off x="0" y="0"/>
+                      <a:ext cx="5572903" cy="3143689"/>
+                    </a:xfrm>
+                    <a:prstGeom prst="rect">
+                      <a:avLst/>
+                    </a:prstGeom>
+                  </pic:spPr>
+                </pic:pic>
+              </a:graphicData>
+            </a:graphic>
+          </wp:inline>
+        </w:drawing>
+      </w:r>
+    </w:p>
+    <w:p>
+      <w:pPr>
+        <w:rPr>
+          <w:b/>
+          <w:bCs/>
+          <w:sz w:val="32"/>
+          <w:szCs w:val="32"/>
+        </w:rPr>
+      </w:pPr>
+      <w:r>
+        <w:rPr>
+          <w:b/>
+          <w:bCs/>
+          <w:sz w:val="32"/>
+          <w:szCs w:val="32"/>
+        </w:rPr>
+        <w:t xml:space="preserve"># </w:t>
+      </w:r>
+      <w:proofErr w:type="spellStart"/>
+      <w:r>
+        <w:rPr>
+          <w:b/>
+          <w:bCs/>
+          <w:sz w:val="32"/>
+          <w:szCs w:val="32"/>
+          <w:u w:val="single"/>
+        </w:rPr>
+        <w:t>console.dir</w:t>
+      </w:r>
+      <w:proofErr w:type="spellEnd"/>
+      <w:r>
+        <w:rPr>
+          <w:b/>
+          <w:bCs/>
+          <w:sz w:val="32"/>
+          <w:szCs w:val="32"/>
+          <w:u w:val="single"/>
+        </w:rPr>
+        <w:t>(document)</w:t>
+      </w:r>
+    </w:p>
+    <w:p>
+      <w:r>
+        <w:drawing>
+          <wp:inline distT="0" distB="0" distL="0" distR="0" wp14:anchorId="75A6A042" wp14:editId="1AE37905">
+            <wp:extent cx="5731510" cy="4081780"/>
+            <wp:effectExtent l="0" t="0" r="2540" b="0"/>
+            <wp:docPr id="639551204" name="Picture 1"/>
+            <wp:cNvGraphicFramePr>
+              <a:graphicFrameLocks xmlns:a="http://schemas.openxmlformats.org/drawingml/2006/main" noChangeAspect="1"/>
+            </wp:cNvGraphicFramePr>
+            <a:graphic xmlns:a="http://schemas.openxmlformats.org/drawingml/2006/main">
+              <a:graphicData uri="http://schemas.openxmlformats.org/drawingml/2006/picture">
+                <pic:pic xmlns:pic="http://schemas.openxmlformats.org/drawingml/2006/picture">
+                  <pic:nvPicPr>
+                    <pic:cNvPr id="639551204" name=""/>
+                    <pic:cNvPicPr/>
+                  </pic:nvPicPr>
+                  <pic:blipFill>
+                    <a:blip r:embed="rId9"/>
+                    <a:stretch>
+                      <a:fillRect/>
+                    </a:stretch>
+                  </pic:blipFill>
+                  <pic:spPr>
+                    <a:xfrm>
+                      <a:off x="0" y="0"/>
+                      <a:ext cx="5731510" cy="4081780"/>
+                    </a:xfrm>
+                    <a:prstGeom prst="rect">
+                      <a:avLst/>
+                    </a:prstGeom>
+                  </pic:spPr>
+                </pic:pic>
+              </a:graphicData>
+            </a:graphic>
+          </wp:inline>
+        </w:drawing>
+      </w:r>
+      <w:r>
         <w:pict w14:anchorId="7141133C">
           <v:rect id="_x0000_i1056" style="width:0;height:1.5pt" o:hralign="center" o:hrstd="t" o:hr="t" fillcolor="#a0a0a0" stroked="f"/>
         </w:pict>
@@ -852,6 +1120,7 @@
           <w:b/>
           <w:bCs/>
         </w:rPr>
+        <w:lastRenderedPageBreak/>
         <w:t>Window</w:t>
       </w:r>
       <w:r>
@@ -979,7 +1248,6 @@
           <w:b/>
           <w:bCs/>
         </w:rPr>
-        <w:lastRenderedPageBreak/>
         <w:t>4. Key Concepts &amp; Selectors (Accessing Elements)</w:t>
       </w:r>
     </w:p>
@@ -1879,6 +2147,7 @@
           <w:b/>
           <w:bCs/>
         </w:rPr>
+        <w:lastRenderedPageBreak/>
         <w:t>NodeList</w:t>
       </w:r>
       <w:proofErr w:type="spellEnd"/>

</xml_diff>

<commit_message>
learnt about querySelectorAll and diff between NodeList and HTMLCollection
</commit_message>
<xml_diff>
--- a/JAVASCRIPT NOTES/JAVASCRIPT NOTES (2) AFTER BASICS.docx
+++ b/JAVASCRIPT NOTES/JAVASCRIPT NOTES (2) AFTER BASICS.docx
@@ -606,7 +606,7 @@
                     <pic:cNvPicPr/>
                   </pic:nvPicPr>
                   <pic:blipFill>
-                    <a:blip r:embed="rId5"/>
+                    <a:blip r:embed="rId7"/>
                     <a:stretch>
                       <a:fillRect/>
                     </a:stretch>
@@ -840,7 +840,7 @@
                     <pic:cNvPicPr/>
                   </pic:nvPicPr>
                   <pic:blipFill>
-                    <a:blip r:embed="rId6"/>
+                    <a:blip r:embed="rId8"/>
                     <a:stretch>
                       <a:fillRect/>
                     </a:stretch>
@@ -911,7 +911,7 @@
                     <pic:cNvPicPr/>
                   </pic:nvPicPr>
                   <pic:blipFill>
-                    <a:blip r:embed="rId7"/>
+                    <a:blip r:embed="rId9"/>
                     <a:stretch>
                       <a:fillRect/>
                     </a:stretch>
@@ -954,7 +954,7 @@
                     <pic:cNvPicPr/>
                   </pic:nvPicPr>
                   <pic:blipFill>
-                    <a:blip r:embed="rId8"/>
+                    <a:blip r:embed="rId10"/>
                     <a:stretch>
                       <a:fillRect/>
                     </a:stretch>
@@ -1037,7 +1037,7 @@
                     <pic:cNvPicPr/>
                   </pic:nvPicPr>
                   <pic:blipFill>
-                    <a:blip r:embed="rId9"/>
+                    <a:blip r:embed="rId11"/>
                     <a:stretch>
                       <a:fillRect/>
                     </a:stretch>
@@ -1238,6 +1238,9 @@
     </w:p>
     <w:p>
       <w:r>
+        <w:rPr>
+          <w:noProof/>
+        </w:rPr>
         <w:drawing>
           <wp:inline distT="0" distB="0" distL="0" distR="0" wp14:anchorId="6744F9E7" wp14:editId="1AD1461D">
             <wp:extent cx="5731510" cy="2024380"/>
@@ -1254,7 +1257,7 @@
                     <pic:cNvPicPr/>
                   </pic:nvPicPr>
                   <pic:blipFill>
-                    <a:blip r:embed="rId10"/>
+                    <a:blip r:embed="rId12"/>
                     <a:stretch>
                       <a:fillRect/>
                     </a:stretch>
@@ -1277,6 +1280,9 @@
     </w:p>
     <w:p>
       <w:r>
+        <w:rPr>
+          <w:noProof/>
+        </w:rPr>
         <w:drawing>
           <wp:inline distT="0" distB="0" distL="0" distR="0" wp14:anchorId="3BF3B9CE" wp14:editId="7AB650BE">
             <wp:extent cx="5731510" cy="4083685"/>
@@ -1293,7 +1299,7 @@
                     <pic:cNvPicPr/>
                   </pic:nvPicPr>
                   <pic:blipFill>
-                    <a:blip r:embed="rId11"/>
+                    <a:blip r:embed="rId13"/>
                     <a:stretch>
                       <a:fillRect/>
                     </a:stretch>
@@ -1721,6 +1727,9 @@
     </w:p>
     <w:p>
       <w:r>
+        <w:rPr>
+          <w:noProof/>
+        </w:rPr>
         <w:drawing>
           <wp:inline distT="0" distB="0" distL="0" distR="0" wp14:anchorId="37B9B0FC" wp14:editId="23D5F240">
             <wp:extent cx="5731510" cy="1896745"/>
@@ -1737,7 +1746,7 @@
                     <pic:cNvPicPr/>
                   </pic:nvPicPr>
                   <pic:blipFill>
-                    <a:blip r:embed="rId12"/>
+                    <a:blip r:embed="rId14"/>
                     <a:stretch>
                       <a:fillRect/>
                     </a:stretch>
@@ -2765,6 +2774,7 @@
         <w:rPr>
           <w:b/>
           <w:bCs/>
+          <w:noProof/>
         </w:rPr>
         <w:drawing>
           <wp:inline distT="0" distB="0" distL="0" distR="0" wp14:anchorId="3B26204F" wp14:editId="6509E9B3">
@@ -2782,7 +2792,7 @@
                     <pic:cNvPicPr/>
                   </pic:nvPicPr>
                   <pic:blipFill>
-                    <a:blip r:embed="rId13"/>
+                    <a:blip r:embed="rId15"/>
                     <a:stretch>
                       <a:fillRect/>
                     </a:stretch>
@@ -3079,6 +3089,9 @@
     </w:p>
     <w:p>
       <w:r>
+        <w:rPr>
+          <w:noProof/>
+        </w:rPr>
         <w:drawing>
           <wp:inline distT="0" distB="0" distL="0" distR="0" wp14:anchorId="796D6FE3" wp14:editId="67AF4BE1">
             <wp:extent cx="5731510" cy="1645920"/>
@@ -3095,7 +3108,7 @@
                     <pic:cNvPicPr/>
                   </pic:nvPicPr>
                   <pic:blipFill>
-                    <a:blip r:embed="rId14"/>
+                    <a:blip r:embed="rId16"/>
                     <a:stretch>
                       <a:fillRect/>
                     </a:stretch>
@@ -3118,6 +3131,9 @@
     </w:p>
     <w:p>
       <w:r>
+        <w:rPr>
+          <w:noProof/>
+        </w:rPr>
         <w:lastRenderedPageBreak/>
         <w:drawing>
           <wp:inline distT="0" distB="0" distL="0" distR="0" wp14:anchorId="0DBCA00C" wp14:editId="35624F2B">
@@ -3135,7 +3151,7 @@
                     <pic:cNvPicPr/>
                   </pic:nvPicPr>
                   <pic:blipFill>
-                    <a:blip r:embed="rId15"/>
+                    <a:blip r:embed="rId17"/>
                     <a:stretch>
                       <a:fillRect/>
                     </a:stretch>
@@ -3157,7 +3173,7 @@
       </w:r>
       <w:r>
         <w:pict w14:anchorId="1E5E623C">
-          <v:rect id="_x0000_i1061" style="width:0;height:1.5pt" o:hralign="center" o:hrstd="t" o:hr="t" fillcolor="#a0a0a0" stroked="f"/>
+          <v:rect id="_x0000_i1031" style="width:0;height:1.5pt" o:hralign="center" o:hrstd="t" o:hr="t" fillcolor="#a0a0a0" stroked="f"/>
         </w:pict>
       </w:r>
     </w:p>
@@ -3309,6 +3325,9 @@
     </w:p>
     <w:p>
       <w:r>
+        <w:rPr>
+          <w:noProof/>
+        </w:rPr>
         <w:drawing>
           <wp:inline distT="0" distB="0" distL="0" distR="0" wp14:anchorId="7C4B60AE" wp14:editId="32623AB9">
             <wp:extent cx="5731510" cy="1215390"/>
@@ -3325,7 +3344,7 @@
                     <pic:cNvPicPr/>
                   </pic:nvPicPr>
                   <pic:blipFill>
-                    <a:blip r:embed="rId16"/>
+                    <a:blip r:embed="rId18"/>
                     <a:stretch>
                       <a:fillRect/>
                     </a:stretch>
@@ -3631,6 +3650,9 @@
     <w:p/>
     <w:p>
       <w:r>
+        <w:rPr>
+          <w:noProof/>
+        </w:rPr>
         <w:drawing>
           <wp:inline distT="0" distB="0" distL="0" distR="0" wp14:anchorId="5F024244" wp14:editId="10F51378">
             <wp:extent cx="5731510" cy="1706245"/>
@@ -3647,7 +3669,7 @@
                     <pic:cNvPicPr/>
                   </pic:nvPicPr>
                   <pic:blipFill>
-                    <a:blip r:embed="rId17"/>
+                    <a:blip r:embed="rId19"/>
                     <a:stretch>
                       <a:fillRect/>
                     </a:stretch>
@@ -3670,6 +3692,9 @@
     </w:p>
     <w:p>
       <w:r>
+        <w:rPr>
+          <w:noProof/>
+        </w:rPr>
         <w:lastRenderedPageBreak/>
         <w:drawing>
           <wp:inline distT="0" distB="0" distL="0" distR="0" wp14:anchorId="0E13EBE7" wp14:editId="2D4DAE26">
@@ -3687,7 +3712,7 @@
                     <pic:cNvPicPr/>
                   </pic:nvPicPr>
                   <pic:blipFill>
-                    <a:blip r:embed="rId18"/>
+                    <a:blip r:embed="rId20"/>
                     <a:stretch>
                       <a:fillRect/>
                     </a:stretch>
@@ -3710,6 +3735,9 @@
     </w:p>
     <w:p>
       <w:r>
+        <w:rPr>
+          <w:noProof/>
+        </w:rPr>
         <w:drawing>
           <wp:inline distT="0" distB="0" distL="0" distR="0" wp14:anchorId="723E1C3D" wp14:editId="25C231F1">
             <wp:extent cx="5731510" cy="3979545"/>
@@ -3726,7 +3754,7 @@
                     <pic:cNvPicPr/>
                   </pic:nvPicPr>
                   <pic:blipFill>
-                    <a:blip r:embed="rId19"/>
+                    <a:blip r:embed="rId21"/>
                     <a:stretch>
                       <a:fillRect/>
                     </a:stretch>
@@ -3749,6 +3777,9 @@
     </w:p>
     <w:p>
       <w:r>
+        <w:rPr>
+          <w:noProof/>
+        </w:rPr>
         <w:drawing>
           <wp:inline distT="0" distB="0" distL="0" distR="0" wp14:anchorId="7559818E" wp14:editId="67911377">
             <wp:extent cx="5731510" cy="1170940"/>
@@ -3765,7 +3796,7 @@
                     <pic:cNvPicPr/>
                   </pic:nvPicPr>
                   <pic:blipFill>
-                    <a:blip r:embed="rId20"/>
+                    <a:blip r:embed="rId22"/>
                     <a:stretch>
                       <a:fillRect/>
                     </a:stretch>
@@ -3787,7 +3818,7 @@
       </w:r>
       <w:r>
         <w:pict w14:anchorId="25EB5863">
-          <v:rect id="_x0000_i1062" style="width:0;height:1.5pt" o:hralign="center" o:hrstd="t" o:hr="t" fillcolor="#a0a0a0" stroked="f"/>
+          <v:rect id="_x0000_i1032" style="width:0;height:1.5pt" o:hralign="center" o:hrstd="t" o:hr="t" fillcolor="#a0a0a0" stroked="f"/>
         </w:pict>
       </w:r>
     </w:p>
@@ -3980,6 +4011,9 @@
         <w:t xml:space="preserve">               </w:t>
       </w:r>
       <w:r>
+        <w:rPr>
+          <w:noProof/>
+        </w:rPr>
         <w:drawing>
           <wp:inline distT="0" distB="0" distL="0" distR="0" wp14:anchorId="294EDDD8" wp14:editId="51A1770B">
             <wp:extent cx="4420217" cy="1600423"/>
@@ -3996,7 +4030,7 @@
                     <pic:cNvPicPr/>
                   </pic:nvPicPr>
                   <pic:blipFill>
-                    <a:blip r:embed="rId21"/>
+                    <a:blip r:embed="rId23"/>
                     <a:stretch>
                       <a:fillRect/>
                     </a:stretch>
@@ -4318,6 +4352,9 @@
         <w:t xml:space="preserve">                        </w:t>
       </w:r>
       <w:r>
+        <w:rPr>
+          <w:noProof/>
+        </w:rPr>
         <w:drawing>
           <wp:inline distT="0" distB="0" distL="0" distR="0" wp14:anchorId="7307B2A6" wp14:editId="095D8318">
             <wp:extent cx="3658111" cy="1457528"/>
@@ -4334,7 +4371,7 @@
                     <pic:cNvPicPr/>
                   </pic:nvPicPr>
                   <pic:blipFill>
-                    <a:blip r:embed="rId22"/>
+                    <a:blip r:embed="rId24"/>
                     <a:stretch>
                       <a:fillRect/>
                     </a:stretch>
@@ -4362,6 +4399,9 @@
         <w:t xml:space="preserve">       </w:t>
       </w:r>
       <w:r>
+        <w:rPr>
+          <w:noProof/>
+        </w:rPr>
         <w:drawing>
           <wp:inline distT="0" distB="0" distL="0" distR="0" wp14:anchorId="74FC7921" wp14:editId="14BFF043">
             <wp:extent cx="5363323" cy="876422"/>
@@ -4378,7 +4418,7 @@
                     <pic:cNvPicPr/>
                   </pic:nvPicPr>
                   <pic:blipFill>
-                    <a:blip r:embed="rId23"/>
+                    <a:blip r:embed="rId25"/>
                     <a:stretch>
                       <a:fillRect/>
                     </a:stretch>
@@ -4401,6 +4441,9 @@
     </w:p>
     <w:p>
       <w:r>
+        <w:rPr>
+          <w:noProof/>
+        </w:rPr>
         <w:lastRenderedPageBreak/>
         <w:drawing>
           <wp:inline distT="0" distB="0" distL="0" distR="0" wp14:anchorId="214A6184" wp14:editId="37915913">
@@ -4418,7 +4461,7 @@
                     <pic:cNvPicPr/>
                   </pic:nvPicPr>
                   <pic:blipFill>
-                    <a:blip r:embed="rId24"/>
+                    <a:blip r:embed="rId26"/>
                     <a:stretch>
                       <a:fillRect/>
                     </a:stretch>
@@ -4440,7 +4483,7 @@
       </w:r>
       <w:r>
         <w:pict w14:anchorId="50AA9778">
-          <v:rect id="_x0000_i1063" style="width:0;height:1.5pt" o:hralign="center" o:hrstd="t" o:hr="t" fillcolor="#a0a0a0" stroked="f"/>
+          <v:rect id="_x0000_i1033" style="width:0;height:1.5pt" o:hralign="center" o:hrstd="t" o:hr="t" fillcolor="#a0a0a0" stroked="f"/>
         </w:pict>
       </w:r>
     </w:p>
@@ -4470,6 +4513,7 @@
         <w:rPr>
           <w:b/>
           <w:bCs/>
+          <w:noProof/>
         </w:rPr>
         <w:drawing>
           <wp:inline distT="0" distB="0" distL="0" distR="0" wp14:anchorId="2185824B" wp14:editId="54171E18">
@@ -4487,7 +4531,7 @@
                     <pic:cNvPicPr/>
                   </pic:nvPicPr>
                   <pic:blipFill>
-                    <a:blip r:embed="rId25"/>
+                    <a:blip r:embed="rId27"/>
                     <a:stretch>
                       <a:fillRect/>
                     </a:stretch>
@@ -4808,6 +4852,9 @@
     </w:p>
     <w:p>
       <w:r>
+        <w:rPr>
+          <w:noProof/>
+        </w:rPr>
         <w:drawing>
           <wp:inline distT="0" distB="0" distL="0" distR="0" wp14:anchorId="24ABFB11" wp14:editId="2FA475CF">
             <wp:extent cx="5731510" cy="1160780"/>
@@ -4824,7 +4871,7 @@
                     <pic:cNvPicPr/>
                   </pic:nvPicPr>
                   <pic:blipFill>
-                    <a:blip r:embed="rId26"/>
+                    <a:blip r:embed="rId28"/>
                     <a:stretch>
                       <a:fillRect/>
                     </a:stretch>
@@ -4847,6 +4894,9 @@
     </w:p>
     <w:p>
       <w:r>
+        <w:rPr>
+          <w:noProof/>
+        </w:rPr>
         <w:lastRenderedPageBreak/>
         <w:drawing>
           <wp:inline distT="0" distB="0" distL="0" distR="0" wp14:anchorId="34BFC438" wp14:editId="1F8E8C3E">
@@ -4864,7 +4914,7 @@
                     <pic:cNvPicPr/>
                   </pic:nvPicPr>
                   <pic:blipFill>
-                    <a:blip r:embed="rId27"/>
+                    <a:blip r:embed="rId29"/>
                     <a:stretch>
                       <a:fillRect/>
                     </a:stretch>
@@ -4886,7 +4936,7 @@
       </w:r>
       <w:r>
         <w:pict w14:anchorId="3B81B7B4">
-          <v:rect id="_x0000_i1064" style="width:0;height:1.5pt" o:hralign="center" o:hrstd="t" o:hr="t" fillcolor="#a0a0a0" stroked="f"/>
+          <v:rect id="_x0000_i1034" style="width:0;height:1.5pt" o:hralign="center" o:hrstd="t" o:hr="t" fillcolor="#a0a0a0" stroked="f"/>
         </w:pict>
       </w:r>
     </w:p>
@@ -5027,6 +5077,9 @@
     </w:p>
     <w:p>
       <w:r>
+        <w:rPr>
+          <w:noProof/>
+        </w:rPr>
         <w:drawing>
           <wp:inline distT="0" distB="0" distL="0" distR="0" wp14:anchorId="4D4655EC" wp14:editId="3BB693AB">
             <wp:extent cx="5731510" cy="1671320"/>
@@ -5043,7 +5096,7 @@
                     <pic:cNvPicPr/>
                   </pic:nvPicPr>
                   <pic:blipFill>
-                    <a:blip r:embed="rId28"/>
+                    <a:blip r:embed="rId30"/>
                     <a:stretch>
                       <a:fillRect/>
                     </a:stretch>
@@ -5095,6 +5148,9 @@
     </w:p>
     <w:p>
       <w:r>
+        <w:rPr>
+          <w:noProof/>
+        </w:rPr>
         <w:drawing>
           <wp:inline distT="0" distB="0" distL="0" distR="0" wp14:anchorId="098C8278" wp14:editId="23F1532C">
             <wp:extent cx="5731510" cy="374650"/>
@@ -5111,7 +5167,7 @@
                     <pic:cNvPicPr/>
                   </pic:nvPicPr>
                   <pic:blipFill>
-                    <a:blip r:embed="rId29"/>
+                    <a:blip r:embed="rId31"/>
                     <a:stretch>
                       <a:fillRect/>
                     </a:stretch>
@@ -5474,6 +5530,9 @@
     </w:p>
     <w:p>
       <w:r>
+        <w:rPr>
+          <w:noProof/>
+        </w:rPr>
         <w:drawing>
           <wp:inline distT="0" distB="0" distL="0" distR="0" wp14:anchorId="6A961EE4" wp14:editId="08A0E3E4">
             <wp:extent cx="5731510" cy="1497330"/>
@@ -5490,7 +5549,7 @@
                     <pic:cNvPicPr/>
                   </pic:nvPicPr>
                   <pic:blipFill>
-                    <a:blip r:embed="rId30"/>
+                    <a:blip r:embed="rId32"/>
                     <a:stretch>
                       <a:fillRect/>
                     </a:stretch>
@@ -5512,7 +5571,7 @@
       </w:r>
       <w:r>
         <w:pict w14:anchorId="7A713773">
-          <v:rect id="_x0000_i1065" style="width:0;height:1.5pt" o:hralign="center" o:hrstd="t" o:hr="t" fillcolor="#a0a0a0" stroked="f"/>
+          <v:rect id="_x0000_i1035" style="width:0;height:1.5pt" o:hralign="center" o:hrstd="t" o:hr="t" fillcolor="#a0a0a0" stroked="f"/>
         </w:pict>
       </w:r>
     </w:p>
@@ -5567,6 +5626,7 @@
         <w:rPr>
           <w:b/>
           <w:bCs/>
+          <w:noProof/>
         </w:rPr>
         <w:drawing>
           <wp:inline distT="0" distB="0" distL="0" distR="0" wp14:anchorId="4B57AC39" wp14:editId="174CD588">
@@ -5584,7 +5644,7 @@
                     <pic:cNvPicPr/>
                   </pic:nvPicPr>
                   <pic:blipFill>
-                    <a:blip r:embed="rId31"/>
+                    <a:blip r:embed="rId33"/>
                     <a:stretch>
                       <a:fillRect/>
                     </a:stretch>
@@ -5623,6 +5683,7 @@
         <w:rPr>
           <w:b/>
           <w:bCs/>
+          <w:noProof/>
         </w:rPr>
         <w:drawing>
           <wp:inline distT="0" distB="0" distL="0" distR="0" wp14:anchorId="5849E002" wp14:editId="252385E5">
@@ -5640,7 +5701,7 @@
                     <pic:cNvPicPr/>
                   </pic:nvPicPr>
                   <pic:blipFill>
-                    <a:blip r:embed="rId32"/>
+                    <a:blip r:embed="rId34"/>
                     <a:stretch>
                       <a:fillRect/>
                     </a:stretch>
@@ -5768,6 +5829,9 @@
     </w:p>
     <w:p>
       <w:r>
+        <w:rPr>
+          <w:noProof/>
+        </w:rPr>
         <w:lastRenderedPageBreak/>
         <w:drawing>
           <wp:inline distT="0" distB="0" distL="0" distR="0" wp14:anchorId="62FE2388" wp14:editId="1F298AC9">
@@ -5785,7 +5849,7 @@
                     <pic:cNvPicPr/>
                   </pic:nvPicPr>
                   <pic:blipFill>
-                    <a:blip r:embed="rId33"/>
+                    <a:blip r:embed="rId35"/>
                     <a:stretch>
                       <a:fillRect/>
                     </a:stretch>
@@ -5819,6 +5883,9 @@
     </w:p>
     <w:p>
       <w:r>
+        <w:rPr>
+          <w:noProof/>
+        </w:rPr>
         <w:drawing>
           <wp:inline distT="0" distB="0" distL="0" distR="0" wp14:anchorId="04643197" wp14:editId="12CF1E7D">
             <wp:extent cx="4944165" cy="1476581"/>
@@ -5835,7 +5902,7 @@
                     <pic:cNvPicPr/>
                   </pic:nvPicPr>
                   <pic:blipFill>
-                    <a:blip r:embed="rId34"/>
+                    <a:blip r:embed="rId36"/>
                     <a:stretch>
                       <a:fillRect/>
                     </a:stretch>
@@ -5919,7 +5986,7 @@
     <w:p>
       <w:r>
         <w:pict w14:anchorId="11A8F393">
-          <v:rect id="_x0000_i1071" style="width:0;height:1.5pt" o:hralign="center" o:hrstd="t" o:hr="t" fillcolor="#a0a0a0" stroked="f"/>
+          <v:rect id="_x0000_i1036" style="width:0;height:1.5pt" o:hralign="center" o:hrstd="t" o:hr="t" fillcolor="#a0a0a0" stroked="f"/>
         </w:pict>
       </w:r>
     </w:p>
@@ -5952,6 +6019,9 @@
         <w:t>IMPORTANT -&gt; CSS SELECTORS!!</w:t>
       </w:r>
       <w:r>
+        <w:rPr>
+          <w:noProof/>
+        </w:rPr>
         <w:drawing>
           <wp:inline distT="0" distB="0" distL="0" distR="0" wp14:anchorId="0D1267C1" wp14:editId="02F42BDF">
             <wp:extent cx="5731510" cy="661035"/>
@@ -5968,7 +6038,7 @@
                     <pic:cNvPicPr/>
                   </pic:nvPicPr>
                   <pic:blipFill>
-                    <a:blip r:embed="rId35"/>
+                    <a:blip r:embed="rId37"/>
                     <a:stretch>
                       <a:fillRect/>
                     </a:stretch>
@@ -5989,6 +6059,9 @@
         </w:drawing>
       </w:r>
       <w:r>
+        <w:rPr>
+          <w:noProof/>
+        </w:rPr>
         <w:drawing>
           <wp:inline distT="0" distB="0" distL="0" distR="0" wp14:anchorId="2478AA5B" wp14:editId="279752A2">
             <wp:extent cx="5731510" cy="3352800"/>
@@ -6005,7 +6078,7 @@
                     <pic:cNvPicPr/>
                   </pic:nvPicPr>
                   <pic:blipFill>
-                    <a:blip r:embed="rId36"/>
+                    <a:blip r:embed="rId38"/>
                     <a:stretch>
                       <a:fillRect/>
                     </a:stretch>
@@ -6033,6 +6106,9 @@
         </w:tabs>
       </w:pPr>
       <w:r>
+        <w:rPr>
+          <w:noProof/>
+        </w:rPr>
         <w:lastRenderedPageBreak/>
         <w:drawing>
           <wp:inline distT="0" distB="0" distL="0" distR="0" wp14:anchorId="22C633B7" wp14:editId="55E80415">
@@ -6050,7 +6126,7 @@
                     <pic:cNvPicPr/>
                   </pic:nvPicPr>
                   <pic:blipFill>
-                    <a:blip r:embed="rId37"/>
+                    <a:blip r:embed="rId39"/>
                     <a:stretch>
                       <a:fillRect/>
                     </a:stretch>
@@ -6085,6 +6161,9 @@
         </w:tabs>
       </w:pPr>
       <w:r>
+        <w:rPr>
+          <w:noProof/>
+        </w:rPr>
         <w:drawing>
           <wp:inline distT="0" distB="0" distL="0" distR="0" wp14:anchorId="3C50F803" wp14:editId="799A8E32">
             <wp:extent cx="5731510" cy="1986280"/>
@@ -6101,7 +6180,7 @@
                     <pic:cNvPicPr/>
                   </pic:nvPicPr>
                   <pic:blipFill>
-                    <a:blip r:embed="rId38"/>
+                    <a:blip r:embed="rId40"/>
                     <a:stretch>
                       <a:fillRect/>
                     </a:stretch>
@@ -6136,6 +6215,9 @@
         </w:tabs>
       </w:pPr>
       <w:r>
+        <w:rPr>
+          <w:noProof/>
+        </w:rPr>
         <w:drawing>
           <wp:inline distT="0" distB="0" distL="0" distR="0" wp14:anchorId="5F0DB6ED" wp14:editId="7D40C5A8">
             <wp:extent cx="5731510" cy="2294255"/>
@@ -6152,7 +6234,7 @@
                     <pic:cNvPicPr/>
                   </pic:nvPicPr>
                   <pic:blipFill>
-                    <a:blip r:embed="rId39"/>
+                    <a:blip r:embed="rId41"/>
                     <a:stretch>
                       <a:fillRect/>
                     </a:stretch>
@@ -6180,6 +6262,9 @@
         </w:tabs>
       </w:pPr>
       <w:r>
+        <w:rPr>
+          <w:noProof/>
+        </w:rPr>
         <w:lastRenderedPageBreak/>
         <w:drawing>
           <wp:inline distT="0" distB="0" distL="0" distR="0" wp14:anchorId="37FE9FA0" wp14:editId="5720EA5D">
@@ -6197,7 +6282,7 @@
                     <pic:cNvPicPr/>
                   </pic:nvPicPr>
                   <pic:blipFill>
-                    <a:blip r:embed="rId40"/>
+                    <a:blip r:embed="rId42"/>
                     <a:stretch>
                       <a:fillRect/>
                     </a:stretch>
@@ -6219,7 +6304,7 @@
       </w:r>
       <w:r>
         <w:pict w14:anchorId="1BA20062">
-          <v:rect id="_x0000_i1072" style="width:0;height:1.5pt" o:hralign="center" o:hrstd="t" o:hr="t" fillcolor="#a0a0a0" stroked="f"/>
+          <v:rect id="_x0000_i1037" style="width:0;height:1.5pt" o:hralign="center" o:hrstd="t" o:hr="t" fillcolor="#a0a0a0" stroked="f"/>
         </w:pict>
       </w:r>
     </w:p>
@@ -6271,6 +6356,9 @@
         </w:tabs>
       </w:pPr>
       <w:r>
+        <w:rPr>
+          <w:noProof/>
+        </w:rPr>
         <w:drawing>
           <wp:inline distT="0" distB="0" distL="0" distR="0" wp14:anchorId="5C626AE0" wp14:editId="43F9834A">
             <wp:extent cx="5731510" cy="3188335"/>
@@ -6287,7 +6375,7 @@
                     <pic:cNvPicPr/>
                   </pic:nvPicPr>
                   <pic:blipFill>
-                    <a:blip r:embed="rId41"/>
+                    <a:blip r:embed="rId43"/>
                     <a:stretch>
                       <a:fillRect/>
                     </a:stretch>
@@ -6542,6 +6630,51 @@
     </w:p>
     <w:p>
       <w:pPr>
+        <w:tabs>
+          <w:tab w:val="left" w:pos="2437"/>
+        </w:tabs>
+      </w:pPr>
+      <w:r>
+        <w:lastRenderedPageBreak/>
+        <w:drawing>
+          <wp:inline distT="0" distB="0" distL="0" distR="0" wp14:anchorId="753DB7D9" wp14:editId="7B6B6E1F">
+            <wp:extent cx="5731510" cy="1892300"/>
+            <wp:effectExtent l="0" t="0" r="2540" b="0"/>
+            <wp:docPr id="90071390" name="Picture 1"/>
+            <wp:cNvGraphicFramePr>
+              <a:graphicFrameLocks xmlns:a="http://schemas.openxmlformats.org/drawingml/2006/main" noChangeAspect="1"/>
+            </wp:cNvGraphicFramePr>
+            <a:graphic xmlns:a="http://schemas.openxmlformats.org/drawingml/2006/main">
+              <a:graphicData uri="http://schemas.openxmlformats.org/drawingml/2006/picture">
+                <pic:pic xmlns:pic="http://schemas.openxmlformats.org/drawingml/2006/picture">
+                  <pic:nvPicPr>
+                    <pic:cNvPr id="90071390" name=""/>
+                    <pic:cNvPicPr/>
+                  </pic:nvPicPr>
+                  <pic:blipFill>
+                    <a:blip r:embed="rId44"/>
+                    <a:stretch>
+                      <a:fillRect/>
+                    </a:stretch>
+                  </pic:blipFill>
+                  <pic:spPr>
+                    <a:xfrm>
+                      <a:off x="0" y="0"/>
+                      <a:ext cx="5731510" cy="1892300"/>
+                    </a:xfrm>
+                    <a:prstGeom prst="rect">
+                      <a:avLst/>
+                    </a:prstGeom>
+                  </pic:spPr>
+                </pic:pic>
+              </a:graphicData>
+            </a:graphic>
+          </wp:inline>
+        </w:drawing>
+      </w:r>
+    </w:p>
+    <w:p>
+      <w:pPr>
         <w:numPr>
           <w:ilvl w:val="0"/>
           <w:numId w:val="13"/>
@@ -6555,159 +6688,250 @@
           <w:b/>
           <w:bCs/>
         </w:rPr>
+        <w:t>The "</w:t>
+      </w:r>
+      <w:proofErr w:type="spellStart"/>
+      <w:r>
+        <w:rPr>
+          <w:b/>
+          <w:bCs/>
+        </w:rPr>
+        <w:t>forEach</w:t>
+      </w:r>
+      <w:proofErr w:type="spellEnd"/>
+      <w:r>
+        <w:rPr>
+          <w:b/>
+          <w:bCs/>
+        </w:rPr>
+        <w:t>" Support:</w:t>
+      </w:r>
+      <w:r>
+        <w:t xml:space="preserve"> </w:t>
+      </w:r>
+      <w:proofErr w:type="spellStart"/>
+      <w:r>
+        <w:t>NodeList</w:t>
+      </w:r>
+      <w:proofErr w:type="spellEnd"/>
+      <w:r>
+        <w:t xml:space="preserve"> ki </w:t>
+      </w:r>
+      <w:proofErr w:type="spellStart"/>
+      <w:r>
+        <w:t>sabse</w:t>
+      </w:r>
+      <w:proofErr w:type="spellEnd"/>
+      <w:r>
+        <w:t xml:space="preserve"> </w:t>
+      </w:r>
+      <w:proofErr w:type="spellStart"/>
+      <w:r>
+        <w:t>achhi</w:t>
+      </w:r>
+      <w:proofErr w:type="spellEnd"/>
+      <w:r>
+        <w:t xml:space="preserve"> </w:t>
+      </w:r>
+      <w:proofErr w:type="spellStart"/>
+      <w:r>
+        <w:t>baat</w:t>
+      </w:r>
+      <w:proofErr w:type="spellEnd"/>
+      <w:r>
+        <w:t xml:space="preserve"> ye </w:t>
+      </w:r>
+      <w:proofErr w:type="spellStart"/>
+      <w:r>
+        <w:t>hai</w:t>
+      </w:r>
+      <w:proofErr w:type="spellEnd"/>
+      <w:r>
+        <w:t xml:space="preserve"> ki </w:t>
+      </w:r>
+      <w:proofErr w:type="spellStart"/>
+      <w:r>
+        <w:t>ispar</w:t>
+      </w:r>
+      <w:proofErr w:type="spellEnd"/>
+      <w:r>
+        <w:t xml:space="preserve"> JavaScript ka </w:t>
+      </w:r>
+      <w:proofErr w:type="spellStart"/>
+      <w:r>
+        <w:rPr>
+          <w:b/>
+          <w:bCs/>
+        </w:rPr>
+        <w:t>forEach</w:t>
+      </w:r>
+      <w:proofErr w:type="spellEnd"/>
+      <w:r>
+        <w:t xml:space="preserve"> loop </w:t>
+      </w:r>
+      <w:proofErr w:type="spellStart"/>
+      <w:r>
+        <w:t>pehle</w:t>
+      </w:r>
+      <w:proofErr w:type="spellEnd"/>
+      <w:r>
+        <w:t xml:space="preserve"> se </w:t>
+      </w:r>
+      <w:proofErr w:type="spellStart"/>
+      <w:r>
+        <w:t>chalta</w:t>
+      </w:r>
+      <w:proofErr w:type="spellEnd"/>
+      <w:r>
+        <w:t xml:space="preserve"> </w:t>
+      </w:r>
+      <w:proofErr w:type="spellStart"/>
+      <w:r>
+        <w:t>hai</w:t>
+      </w:r>
+      <w:proofErr w:type="spellEnd"/>
+      <w:r>
+        <w:t xml:space="preserve">. </w:t>
+      </w:r>
+      <w:proofErr w:type="spellStart"/>
+      <w:r>
+        <w:t>Tumhe</w:t>
+      </w:r>
+      <w:proofErr w:type="spellEnd"/>
+      <w:r>
+        <w:t xml:space="preserve"> </w:t>
+      </w:r>
+      <w:proofErr w:type="spellStart"/>
+      <w:r>
+        <w:t>ise</w:t>
+      </w:r>
+      <w:proofErr w:type="spellEnd"/>
+      <w:r>
+        <w:t xml:space="preserve"> convert </w:t>
+      </w:r>
+      <w:proofErr w:type="spellStart"/>
+      <w:r>
+        <w:t>karne</w:t>
+      </w:r>
+      <w:proofErr w:type="spellEnd"/>
+      <w:r>
+        <w:t xml:space="preserve"> ki </w:t>
+      </w:r>
+      <w:proofErr w:type="spellStart"/>
+      <w:r>
+        <w:t>zaroorat</w:t>
+      </w:r>
+      <w:proofErr w:type="spellEnd"/>
+      <w:r>
+        <w:t xml:space="preserve"> </w:t>
+      </w:r>
+      <w:proofErr w:type="spellStart"/>
+      <w:r>
+        <w:t>nahi</w:t>
+      </w:r>
+      <w:proofErr w:type="spellEnd"/>
+      <w:r>
+        <w:t xml:space="preserve"> </w:t>
+      </w:r>
+      <w:proofErr w:type="spellStart"/>
+      <w:r>
+        <w:t>padti</w:t>
+      </w:r>
+      <w:proofErr w:type="spellEnd"/>
+      <w:r>
+        <w:t>.</w:t>
+      </w:r>
+    </w:p>
+    <w:p>
+      <w:pPr>
+        <w:tabs>
+          <w:tab w:val="left" w:pos="2437"/>
+        </w:tabs>
+      </w:pPr>
+      <w:r>
+        <w:t xml:space="preserve">         </w:t>
+      </w:r>
+      <w:r>
+        <w:drawing>
+          <wp:inline distT="0" distB="0" distL="0" distR="0" wp14:anchorId="0A8A9EE6" wp14:editId="02FE8F89">
+            <wp:extent cx="5153744" cy="4686954"/>
+            <wp:effectExtent l="0" t="0" r="8890" b="0"/>
+            <wp:docPr id="888624699" name="Picture 1"/>
+            <wp:cNvGraphicFramePr>
+              <a:graphicFrameLocks xmlns:a="http://schemas.openxmlformats.org/drawingml/2006/main" noChangeAspect="1"/>
+            </wp:cNvGraphicFramePr>
+            <a:graphic xmlns:a="http://schemas.openxmlformats.org/drawingml/2006/main">
+              <a:graphicData uri="http://schemas.openxmlformats.org/drawingml/2006/picture">
+                <pic:pic xmlns:pic="http://schemas.openxmlformats.org/drawingml/2006/picture">
+                  <pic:nvPicPr>
+                    <pic:cNvPr id="888624699" name=""/>
+                    <pic:cNvPicPr/>
+                  </pic:nvPicPr>
+                  <pic:blipFill>
+                    <a:blip r:embed="rId45"/>
+                    <a:stretch>
+                      <a:fillRect/>
+                    </a:stretch>
+                  </pic:blipFill>
+                  <pic:spPr>
+                    <a:xfrm>
+                      <a:off x="0" y="0"/>
+                      <a:ext cx="5153744" cy="4686954"/>
+                    </a:xfrm>
+                    <a:prstGeom prst="rect">
+                      <a:avLst/>
+                    </a:prstGeom>
+                  </pic:spPr>
+                </pic:pic>
+              </a:graphicData>
+            </a:graphic>
+          </wp:inline>
+        </w:drawing>
+      </w:r>
+    </w:p>
+    <w:p>
+      <w:pPr>
+        <w:tabs>
+          <w:tab w:val="left" w:pos="2437"/>
+        </w:tabs>
+      </w:pPr>
+      <w:r>
         <w:lastRenderedPageBreak/>
-        <w:t>The "</w:t>
-      </w:r>
-      <w:proofErr w:type="spellStart"/>
-      <w:r>
-        <w:rPr>
-          <w:b/>
-          <w:bCs/>
-        </w:rPr>
-        <w:t>forEach</w:t>
-      </w:r>
-      <w:proofErr w:type="spellEnd"/>
-      <w:r>
-        <w:rPr>
-          <w:b/>
-          <w:bCs/>
-        </w:rPr>
-        <w:t>" Support:</w:t>
-      </w:r>
-      <w:r>
-        <w:t xml:space="preserve"> </w:t>
-      </w:r>
-      <w:proofErr w:type="spellStart"/>
-      <w:r>
-        <w:t>NodeList</w:t>
-      </w:r>
-      <w:proofErr w:type="spellEnd"/>
-      <w:r>
-        <w:t xml:space="preserve"> ki </w:t>
-      </w:r>
-      <w:proofErr w:type="spellStart"/>
-      <w:r>
-        <w:t>sabse</w:t>
-      </w:r>
-      <w:proofErr w:type="spellEnd"/>
-      <w:r>
-        <w:t xml:space="preserve"> </w:t>
-      </w:r>
-      <w:proofErr w:type="spellStart"/>
-      <w:r>
-        <w:t>achhi</w:t>
-      </w:r>
-      <w:proofErr w:type="spellEnd"/>
-      <w:r>
-        <w:t xml:space="preserve"> </w:t>
-      </w:r>
-      <w:proofErr w:type="spellStart"/>
-      <w:r>
-        <w:t>baat</w:t>
-      </w:r>
-      <w:proofErr w:type="spellEnd"/>
-      <w:r>
-        <w:t xml:space="preserve"> ye </w:t>
-      </w:r>
-      <w:proofErr w:type="spellStart"/>
-      <w:r>
-        <w:t>hai</w:t>
-      </w:r>
-      <w:proofErr w:type="spellEnd"/>
-      <w:r>
-        <w:t xml:space="preserve"> ki </w:t>
-      </w:r>
-      <w:proofErr w:type="spellStart"/>
-      <w:r>
-        <w:t>ispar</w:t>
-      </w:r>
-      <w:proofErr w:type="spellEnd"/>
-      <w:r>
-        <w:t xml:space="preserve"> JavaScript ka </w:t>
-      </w:r>
-      <w:proofErr w:type="spellStart"/>
-      <w:r>
-        <w:rPr>
-          <w:b/>
-          <w:bCs/>
-        </w:rPr>
-        <w:t>forEach</w:t>
-      </w:r>
-      <w:proofErr w:type="spellEnd"/>
-      <w:r>
-        <w:t xml:space="preserve"> loop </w:t>
-      </w:r>
-      <w:proofErr w:type="spellStart"/>
-      <w:r>
-        <w:t>pehle</w:t>
-      </w:r>
-      <w:proofErr w:type="spellEnd"/>
-      <w:r>
-        <w:t xml:space="preserve"> se </w:t>
-      </w:r>
-      <w:proofErr w:type="spellStart"/>
-      <w:r>
-        <w:t>chalta</w:t>
-      </w:r>
-      <w:proofErr w:type="spellEnd"/>
-      <w:r>
-        <w:t xml:space="preserve"> </w:t>
-      </w:r>
-      <w:proofErr w:type="spellStart"/>
-      <w:r>
-        <w:t>hai</w:t>
-      </w:r>
-      <w:proofErr w:type="spellEnd"/>
-      <w:r>
-        <w:t xml:space="preserve">. </w:t>
-      </w:r>
-      <w:proofErr w:type="spellStart"/>
-      <w:r>
-        <w:t>Tumhe</w:t>
-      </w:r>
-      <w:proofErr w:type="spellEnd"/>
-      <w:r>
-        <w:t xml:space="preserve"> </w:t>
-      </w:r>
-      <w:proofErr w:type="spellStart"/>
-      <w:r>
-        <w:t>ise</w:t>
-      </w:r>
-      <w:proofErr w:type="spellEnd"/>
-      <w:r>
-        <w:t xml:space="preserve"> convert </w:t>
-      </w:r>
-      <w:proofErr w:type="spellStart"/>
-      <w:r>
-        <w:t>karne</w:t>
-      </w:r>
-      <w:proofErr w:type="spellEnd"/>
-      <w:r>
-        <w:t xml:space="preserve"> ki </w:t>
-      </w:r>
-      <w:proofErr w:type="spellStart"/>
-      <w:r>
-        <w:t>zaroorat</w:t>
-      </w:r>
-      <w:proofErr w:type="spellEnd"/>
-      <w:r>
-        <w:t xml:space="preserve"> </w:t>
-      </w:r>
-      <w:proofErr w:type="spellStart"/>
-      <w:r>
-        <w:t>nahi</w:t>
-      </w:r>
-      <w:proofErr w:type="spellEnd"/>
-      <w:r>
-        <w:t xml:space="preserve"> </w:t>
-      </w:r>
-      <w:proofErr w:type="spellStart"/>
-      <w:r>
-        <w:t>padti</w:t>
-      </w:r>
-      <w:proofErr w:type="spellEnd"/>
-      <w:r>
-        <w:t>.</w:t>
+        <w:drawing>
+          <wp:inline distT="0" distB="0" distL="0" distR="0" wp14:anchorId="20B1F9A0" wp14:editId="71CBAA8B">
+            <wp:extent cx="5731510" cy="2384425"/>
+            <wp:effectExtent l="0" t="0" r="2540" b="0"/>
+            <wp:docPr id="1367647819" name="Picture 1"/>
+            <wp:cNvGraphicFramePr>
+              <a:graphicFrameLocks xmlns:a="http://schemas.openxmlformats.org/drawingml/2006/main" noChangeAspect="1"/>
+            </wp:cNvGraphicFramePr>
+            <a:graphic xmlns:a="http://schemas.openxmlformats.org/drawingml/2006/main">
+              <a:graphicData uri="http://schemas.openxmlformats.org/drawingml/2006/picture">
+                <pic:pic xmlns:pic="http://schemas.openxmlformats.org/drawingml/2006/picture">
+                  <pic:nvPicPr>
+                    <pic:cNvPr id="1367647819" name=""/>
+                    <pic:cNvPicPr/>
+                  </pic:nvPicPr>
+                  <pic:blipFill>
+                    <a:blip r:embed="rId46"/>
+                    <a:stretch>
+                      <a:fillRect/>
+                    </a:stretch>
+                  </pic:blipFill>
+                  <pic:spPr>
+                    <a:xfrm>
+                      <a:off x="0" y="0"/>
+                      <a:ext cx="5731510" cy="2384425"/>
+                    </a:xfrm>
+                    <a:prstGeom prst="rect">
+                      <a:avLst/>
+                    </a:prstGeom>
+                  </pic:spPr>
+                </pic:pic>
+              </a:graphicData>
+            </a:graphic>
+          </wp:inline>
+        </w:drawing>
       </w:r>
     </w:p>
     <w:p>
@@ -6862,16 +7086,104 @@
       <w:r>
         <w:t>.</w:t>
       </w:r>
+      <w:r>
+        <w:t>\</w:t>
+      </w:r>
     </w:p>
     <w:p>
       <w:pPr>
         <w:tabs>
           <w:tab w:val="left" w:pos="2437"/>
         </w:tabs>
-      </w:pPr>
+        <w:ind w:left="360"/>
+      </w:pPr>
+      <w:r>
+        <w:t xml:space="preserve">           </w:t>
+      </w:r>
+      <w:r>
+        <w:drawing>
+          <wp:inline distT="0" distB="0" distL="0" distR="0" wp14:anchorId="450895B1" wp14:editId="75638781">
+            <wp:extent cx="4277322" cy="2915057"/>
+            <wp:effectExtent l="0" t="0" r="9525" b="0"/>
+            <wp:docPr id="1606507160" name="Picture 1"/>
+            <wp:cNvGraphicFramePr>
+              <a:graphicFrameLocks xmlns:a="http://schemas.openxmlformats.org/drawingml/2006/main" noChangeAspect="1"/>
+            </wp:cNvGraphicFramePr>
+            <a:graphic xmlns:a="http://schemas.openxmlformats.org/drawingml/2006/main">
+              <a:graphicData uri="http://schemas.openxmlformats.org/drawingml/2006/picture">
+                <pic:pic xmlns:pic="http://schemas.openxmlformats.org/drawingml/2006/picture">
+                  <pic:nvPicPr>
+                    <pic:cNvPr id="1606507160" name=""/>
+                    <pic:cNvPicPr/>
+                  </pic:nvPicPr>
+                  <pic:blipFill>
+                    <a:blip r:embed="rId47"/>
+                    <a:stretch>
+                      <a:fillRect/>
+                    </a:stretch>
+                  </pic:blipFill>
+                  <pic:spPr>
+                    <a:xfrm>
+                      <a:off x="0" y="0"/>
+                      <a:ext cx="4277322" cy="2915057"/>
+                    </a:xfrm>
+                    <a:prstGeom prst="rect">
+                      <a:avLst/>
+                    </a:prstGeom>
+                  </pic:spPr>
+                </pic:pic>
+              </a:graphicData>
+            </a:graphic>
+          </wp:inline>
+        </w:drawing>
+      </w:r>
+    </w:p>
+    <w:p>
+      <w:pPr>
+        <w:tabs>
+          <w:tab w:val="left" w:pos="2437"/>
+        </w:tabs>
+      </w:pPr>
+      <w:r>
+        <w:drawing>
+          <wp:inline distT="0" distB="0" distL="0" distR="0" wp14:anchorId="3ECDAE65" wp14:editId="51FAD604">
+            <wp:extent cx="5731510" cy="1783080"/>
+            <wp:effectExtent l="0" t="0" r="2540" b="7620"/>
+            <wp:docPr id="1021242159" name="Picture 1"/>
+            <wp:cNvGraphicFramePr>
+              <a:graphicFrameLocks xmlns:a="http://schemas.openxmlformats.org/drawingml/2006/main" noChangeAspect="1"/>
+            </wp:cNvGraphicFramePr>
+            <a:graphic xmlns:a="http://schemas.openxmlformats.org/drawingml/2006/main">
+              <a:graphicData uri="http://schemas.openxmlformats.org/drawingml/2006/picture">
+                <pic:pic xmlns:pic="http://schemas.openxmlformats.org/drawingml/2006/picture">
+                  <pic:nvPicPr>
+                    <pic:cNvPr id="1021242159" name=""/>
+                    <pic:cNvPicPr/>
+                  </pic:nvPicPr>
+                  <pic:blipFill>
+                    <a:blip r:embed="rId48"/>
+                    <a:stretch>
+                      <a:fillRect/>
+                    </a:stretch>
+                  </pic:blipFill>
+                  <pic:spPr>
+                    <a:xfrm>
+                      <a:off x="0" y="0"/>
+                      <a:ext cx="5731510" cy="1783080"/>
+                    </a:xfrm>
+                    <a:prstGeom prst="rect">
+                      <a:avLst/>
+                    </a:prstGeom>
+                  </pic:spPr>
+                </pic:pic>
+              </a:graphicData>
+            </a:graphic>
+          </wp:inline>
+        </w:drawing>
+      </w:r>
       <w:r>
         <w:pict w14:anchorId="0AD12F55">
-          <v:rect id="_x0000_i1103" style="width:0;height:1.5pt" o:hralign="center" o:hrstd="t" o:hr="t" fillcolor="#a0a0a0" stroked="f"/>
+          <v:rect id="_x0000_i1051" style="width:0;height:1.5pt" o:hralign="center" o:hrstd="t" o:hr="t" fillcolor="#a0a0a0" stroked="f"/>
         </w:pict>
       </w:r>
     </w:p>
@@ -6885,20 +7197,32 @@
           <w:bCs/>
         </w:rPr>
       </w:pPr>
-      <w:r>
-        <w:rPr>
-          <w:b/>
-          <w:bCs/>
-        </w:rPr>
-        <w:t xml:space="preserve">2. </w:t>
-      </w:r>
-      <w:proofErr w:type="spellStart"/>
-      <w:r>
-        <w:rPr>
-          <w:b/>
-          <w:bCs/>
-        </w:rPr>
-        <w:t>getElementsByClassName</w:t>
+    </w:p>
+    <w:p>
+      <w:pPr>
+        <w:tabs>
+          <w:tab w:val="left" w:pos="2437"/>
+        </w:tabs>
+        <w:rPr>
+          <w:b/>
+          <w:bCs/>
+        </w:rPr>
+      </w:pPr>
+      <w:r>
+        <w:rPr>
+          <w:b/>
+          <w:bCs/>
+        </w:rPr>
+        <w:lastRenderedPageBreak/>
+        <w:t>2. g</w:t>
+      </w:r>
+      <w:proofErr w:type="spellStart"/>
+      <w:r>
+        <w:rPr>
+          <w:b/>
+          <w:bCs/>
+        </w:rPr>
+        <w:t>etElementsByClassName</w:t>
       </w:r>
       <w:proofErr w:type="spellEnd"/>
       <w:r>
@@ -7184,6 +7508,97 @@
     </w:p>
     <w:p>
       <w:pPr>
+        <w:tabs>
+          <w:tab w:val="left" w:pos="2437"/>
+        </w:tabs>
+      </w:pPr>
+      <w:r>
+        <w:drawing>
+          <wp:inline distT="0" distB="0" distL="0" distR="0" wp14:anchorId="33177659" wp14:editId="168DC400">
+            <wp:extent cx="5731510" cy="2496185"/>
+            <wp:effectExtent l="0" t="0" r="2540" b="0"/>
+            <wp:docPr id="266363040" name="Picture 1"/>
+            <wp:cNvGraphicFramePr>
+              <a:graphicFrameLocks xmlns:a="http://schemas.openxmlformats.org/drawingml/2006/main" noChangeAspect="1"/>
+            </wp:cNvGraphicFramePr>
+            <a:graphic xmlns:a="http://schemas.openxmlformats.org/drawingml/2006/main">
+              <a:graphicData uri="http://schemas.openxmlformats.org/drawingml/2006/picture">
+                <pic:pic xmlns:pic="http://schemas.openxmlformats.org/drawingml/2006/picture">
+                  <pic:nvPicPr>
+                    <pic:cNvPr id="266363040" name=""/>
+                    <pic:cNvPicPr/>
+                  </pic:nvPicPr>
+                  <pic:blipFill>
+                    <a:blip r:embed="rId49"/>
+                    <a:stretch>
+                      <a:fillRect/>
+                    </a:stretch>
+                  </pic:blipFill>
+                  <pic:spPr>
+                    <a:xfrm>
+                      <a:off x="0" y="0"/>
+                      <a:ext cx="5731510" cy="2496185"/>
+                    </a:xfrm>
+                    <a:prstGeom prst="rect">
+                      <a:avLst/>
+                    </a:prstGeom>
+                  </pic:spPr>
+                </pic:pic>
+              </a:graphicData>
+            </a:graphic>
+          </wp:inline>
+        </w:drawing>
+      </w:r>
+    </w:p>
+    <w:p>
+      <w:pPr>
+        <w:tabs>
+          <w:tab w:val="left" w:pos="2437"/>
+        </w:tabs>
+      </w:pPr>
+      <w:r>
+        <w:t xml:space="preserve">           </w:t>
+      </w:r>
+      <w:r>
+        <w:drawing>
+          <wp:inline distT="0" distB="0" distL="0" distR="0" wp14:anchorId="646D99E9" wp14:editId="5BB665EC">
+            <wp:extent cx="4648849" cy="1743318"/>
+            <wp:effectExtent l="0" t="0" r="0" b="9525"/>
+            <wp:docPr id="1807579238" name="Picture 1"/>
+            <wp:cNvGraphicFramePr>
+              <a:graphicFrameLocks xmlns:a="http://schemas.openxmlformats.org/drawingml/2006/main" noChangeAspect="1"/>
+            </wp:cNvGraphicFramePr>
+            <a:graphic xmlns:a="http://schemas.openxmlformats.org/drawingml/2006/main">
+              <a:graphicData uri="http://schemas.openxmlformats.org/drawingml/2006/picture">
+                <pic:pic xmlns:pic="http://schemas.openxmlformats.org/drawingml/2006/picture">
+                  <pic:nvPicPr>
+                    <pic:cNvPr id="1807579238" name=""/>
+                    <pic:cNvPicPr/>
+                  </pic:nvPicPr>
+                  <pic:blipFill>
+                    <a:blip r:embed="rId50"/>
+                    <a:stretch>
+                      <a:fillRect/>
+                    </a:stretch>
+                  </pic:blipFill>
+                  <pic:spPr>
+                    <a:xfrm>
+                      <a:off x="0" y="0"/>
+                      <a:ext cx="4648849" cy="1743318"/>
+                    </a:xfrm>
+                    <a:prstGeom prst="rect">
+                      <a:avLst/>
+                    </a:prstGeom>
+                  </pic:spPr>
+                </pic:pic>
+              </a:graphicData>
+            </a:graphic>
+          </wp:inline>
+        </w:drawing>
+      </w:r>
+    </w:p>
+    <w:p>
+      <w:pPr>
         <w:numPr>
           <w:ilvl w:val="0"/>
           <w:numId w:val="14"/>
@@ -7283,7 +7698,7 @@
       </w:pPr>
       <w:r>
         <w:pict w14:anchorId="16118A7A">
-          <v:rect id="_x0000_i1104" style="width:0;height:1.5pt" o:hralign="center" o:hrstd="t" o:hr="t" fillcolor="#a0a0a0" stroked="f"/>
+          <v:rect id="_x0000_i1039" style="width:0;height:1.5pt" o:hralign="center" o:hrstd="t" o:hr="t" fillcolor="#a0a0a0" stroked="f"/>
         </w:pict>
       </w:r>
     </w:p>
@@ -7703,8 +8118,46 @@
         </w:tabs>
       </w:pPr>
       <w:r>
+        <w:lastRenderedPageBreak/>
+        <w:drawing>
+          <wp:inline distT="0" distB="0" distL="0" distR="0" wp14:anchorId="66A40B28" wp14:editId="697823AB">
+            <wp:extent cx="5731510" cy="3291840"/>
+            <wp:effectExtent l="0" t="0" r="2540" b="3810"/>
+            <wp:docPr id="2113962800" name="Picture 1"/>
+            <wp:cNvGraphicFramePr>
+              <a:graphicFrameLocks xmlns:a="http://schemas.openxmlformats.org/drawingml/2006/main" noChangeAspect="1"/>
+            </wp:cNvGraphicFramePr>
+            <a:graphic xmlns:a="http://schemas.openxmlformats.org/drawingml/2006/main">
+              <a:graphicData uri="http://schemas.openxmlformats.org/drawingml/2006/picture">
+                <pic:pic xmlns:pic="http://schemas.openxmlformats.org/drawingml/2006/picture">
+                  <pic:nvPicPr>
+                    <pic:cNvPr id="2113962800" name=""/>
+                    <pic:cNvPicPr/>
+                  </pic:nvPicPr>
+                  <pic:blipFill>
+                    <a:blip r:embed="rId51"/>
+                    <a:stretch>
+                      <a:fillRect/>
+                    </a:stretch>
+                  </pic:blipFill>
+                  <pic:spPr>
+                    <a:xfrm>
+                      <a:off x="0" y="0"/>
+                      <a:ext cx="5731510" cy="3291840"/>
+                    </a:xfrm>
+                    <a:prstGeom prst="rect">
+                      <a:avLst/>
+                    </a:prstGeom>
+                  </pic:spPr>
+                </pic:pic>
+              </a:graphicData>
+            </a:graphic>
+          </wp:inline>
+        </w:drawing>
+      </w:r>
+      <w:r>
         <w:pict w14:anchorId="39FA1F72">
-          <v:rect id="_x0000_i1105" style="width:0;height:1.5pt" o:hralign="center" o:hrstd="t" o:hr="t" fillcolor="#a0a0a0" stroked="f"/>
+          <v:rect id="_x0000_i1040" style="width:0;height:1.5pt" o:hralign="center" o:hrstd="t" o:hr="t" fillcolor="#a0a0a0" stroked="f"/>
         </w:pict>
       </w:r>
     </w:p>
@@ -8093,8 +8546,134 @@
       </w:pPr>
       <w:r>
         <w:lastRenderedPageBreak/>
+        <w:drawing>
+          <wp:inline distT="0" distB="0" distL="0" distR="0" wp14:anchorId="50CF1D8C" wp14:editId="73BB8AC8">
+            <wp:extent cx="5731510" cy="5081905"/>
+            <wp:effectExtent l="0" t="0" r="2540" b="4445"/>
+            <wp:docPr id="533726387" name="Picture 1"/>
+            <wp:cNvGraphicFramePr>
+              <a:graphicFrameLocks xmlns:a="http://schemas.openxmlformats.org/drawingml/2006/main" noChangeAspect="1"/>
+            </wp:cNvGraphicFramePr>
+            <a:graphic xmlns:a="http://schemas.openxmlformats.org/drawingml/2006/main">
+              <a:graphicData uri="http://schemas.openxmlformats.org/drawingml/2006/picture">
+                <pic:pic xmlns:pic="http://schemas.openxmlformats.org/drawingml/2006/picture">
+                  <pic:nvPicPr>
+                    <pic:cNvPr id="533726387" name=""/>
+                    <pic:cNvPicPr/>
+                  </pic:nvPicPr>
+                  <pic:blipFill>
+                    <a:blip r:embed="rId52"/>
+                    <a:stretch>
+                      <a:fillRect/>
+                    </a:stretch>
+                  </pic:blipFill>
+                  <pic:spPr>
+                    <a:xfrm>
+                      <a:off x="0" y="0"/>
+                      <a:ext cx="5731510" cy="5081905"/>
+                    </a:xfrm>
+                    <a:prstGeom prst="rect">
+                      <a:avLst/>
+                    </a:prstGeom>
+                  </pic:spPr>
+                </pic:pic>
+              </a:graphicData>
+            </a:graphic>
+          </wp:inline>
+        </w:drawing>
+      </w:r>
+    </w:p>
+    <w:p>
+      <w:pPr>
+        <w:tabs>
+          <w:tab w:val="left" w:pos="2437"/>
+        </w:tabs>
+      </w:pPr>
+      <w:r>
+        <w:drawing>
+          <wp:inline distT="0" distB="0" distL="0" distR="0" wp14:anchorId="1989FDBB" wp14:editId="1A254B8C">
+            <wp:extent cx="5731510" cy="1583690"/>
+            <wp:effectExtent l="0" t="0" r="2540" b="0"/>
+            <wp:docPr id="1300294455" name="Picture 1"/>
+            <wp:cNvGraphicFramePr>
+              <a:graphicFrameLocks xmlns:a="http://schemas.openxmlformats.org/drawingml/2006/main" noChangeAspect="1"/>
+            </wp:cNvGraphicFramePr>
+            <a:graphic xmlns:a="http://schemas.openxmlformats.org/drawingml/2006/main">
+              <a:graphicData uri="http://schemas.openxmlformats.org/drawingml/2006/picture">
+                <pic:pic xmlns:pic="http://schemas.openxmlformats.org/drawingml/2006/picture">
+                  <pic:nvPicPr>
+                    <pic:cNvPr id="1300294455" name=""/>
+                    <pic:cNvPicPr/>
+                  </pic:nvPicPr>
+                  <pic:blipFill>
+                    <a:blip r:embed="rId53"/>
+                    <a:stretch>
+                      <a:fillRect/>
+                    </a:stretch>
+                  </pic:blipFill>
+                  <pic:spPr>
+                    <a:xfrm>
+                      <a:off x="0" y="0"/>
+                      <a:ext cx="5731510" cy="1583690"/>
+                    </a:xfrm>
+                    <a:prstGeom prst="rect">
+                      <a:avLst/>
+                    </a:prstGeom>
+                  </pic:spPr>
+                </pic:pic>
+              </a:graphicData>
+            </a:graphic>
+          </wp:inline>
+        </w:drawing>
+      </w:r>
+    </w:p>
+    <w:p>
+      <w:pPr>
+        <w:tabs>
+          <w:tab w:val="left" w:pos="2437"/>
+        </w:tabs>
+      </w:pPr>
+      <w:r>
+        <w:lastRenderedPageBreak/>
+        <w:drawing>
+          <wp:inline distT="0" distB="0" distL="0" distR="0" wp14:anchorId="15D21797" wp14:editId="14687DF5">
+            <wp:extent cx="5731510" cy="4032885"/>
+            <wp:effectExtent l="0" t="0" r="2540" b="5715"/>
+            <wp:docPr id="591599210" name="Picture 1"/>
+            <wp:cNvGraphicFramePr>
+              <a:graphicFrameLocks xmlns:a="http://schemas.openxmlformats.org/drawingml/2006/main" noChangeAspect="1"/>
+            </wp:cNvGraphicFramePr>
+            <a:graphic xmlns:a="http://schemas.openxmlformats.org/drawingml/2006/main">
+              <a:graphicData uri="http://schemas.openxmlformats.org/drawingml/2006/picture">
+                <pic:pic xmlns:pic="http://schemas.openxmlformats.org/drawingml/2006/picture">
+                  <pic:nvPicPr>
+                    <pic:cNvPr id="591599210" name=""/>
+                    <pic:cNvPicPr/>
+                  </pic:nvPicPr>
+                  <pic:blipFill>
+                    <a:blip r:embed="rId54"/>
+                    <a:stretch>
+                      <a:fillRect/>
+                    </a:stretch>
+                  </pic:blipFill>
+                  <pic:spPr>
+                    <a:xfrm>
+                      <a:off x="0" y="0"/>
+                      <a:ext cx="5731510" cy="4032885"/>
+                    </a:xfrm>
+                    <a:prstGeom prst="rect">
+                      <a:avLst/>
+                    </a:prstGeom>
+                  </pic:spPr>
+                </pic:pic>
+              </a:graphicData>
+            </a:graphic>
+          </wp:inline>
+        </w:drawing>
+      </w:r>
+      <w:r>
         <w:pict w14:anchorId="4B9529F0">
-          <v:rect id="_x0000_i1106" style="width:0;height:1.5pt" o:hralign="center" o:hrstd="t" o:hr="t" fillcolor="#a0a0a0" stroked="f"/>
+          <v:rect id="_x0000_i1041" style="width:0;height:1.5pt" o:hralign="center" o:hrstd="t" o:hr="t" fillcolor="#a0a0a0" stroked="f"/>
         </w:pict>
       </w:r>
     </w:p>
@@ -8632,7 +9211,7 @@
       <w:bookmarkStart w:id="0" w:name="_Hlk227589453"/>
       <w:r>
         <w:pict w14:anchorId="3476A7A4">
-          <v:rect id="_x0000_i1107" style="width:0;height:1.5pt" o:hralign="center" o:hrstd="t" o:hr="t" fillcolor="#a0a0a0" stroked="f"/>
+          <v:rect id="_x0000_i1042" style="width:0;height:1.5pt" o:hralign="center" o:hrstd="t" o:hr="t" fillcolor="#a0a0a0" stroked="f"/>
         </w:pict>
       </w:r>
       <w:bookmarkEnd w:id="0"/>
@@ -8694,19 +9273,82 @@
         </w:tabs>
       </w:pPr>
       <w:r>
-        <w:t xml:space="preserve">Bhai, sir ne last </w:t>
-      </w:r>
-      <w:proofErr w:type="spellStart"/>
-      <w:r>
+        <w:rPr>
+          <w:b/>
+          <w:bCs/>
+        </w:rPr>
+        <w:t xml:space="preserve">Bhai, simple word </w:t>
+      </w:r>
+      <w:proofErr w:type="spellStart"/>
+      <w:r>
+        <w:rPr>
+          <w:b/>
+          <w:bCs/>
+        </w:rPr>
         <w:t>mein</w:t>
       </w:r>
       <w:proofErr w:type="spellEnd"/>
       <w:r>
-        <w:t xml:space="preserve"> ye </w:t>
-      </w:r>
-      <w:proofErr w:type="spellStart"/>
-      <w:r>
-        <w:t>samjhaya</w:t>
+        <w:rPr>
+          <w:b/>
+          <w:bCs/>
+        </w:rPr>
+        <w:t>:</w:t>
+      </w:r>
+      <w:r>
+        <w:t xml:space="preserve"> </w:t>
+      </w:r>
+      <w:proofErr w:type="spellStart"/>
+      <w:r>
+        <w:t>forEach</w:t>
+      </w:r>
+      <w:proofErr w:type="spellEnd"/>
+      <w:r>
+        <w:t xml:space="preserve"> loop </w:t>
+      </w:r>
+      <w:proofErr w:type="spellStart"/>
+      <w:r>
+        <w:t>tumhara</w:t>
+      </w:r>
+      <w:proofErr w:type="spellEnd"/>
+      <w:r>
+        <w:t xml:space="preserve"> best friend </w:t>
+      </w:r>
+      <w:proofErr w:type="spellStart"/>
+      <w:r>
+        <w:t>hai</w:t>
+      </w:r>
+      <w:proofErr w:type="spellEnd"/>
+      <w:r>
+        <w:t xml:space="preserve"> multiple elements </w:t>
+      </w:r>
+      <w:proofErr w:type="spellStart"/>
+      <w:r>
+        <w:t>ke</w:t>
+      </w:r>
+      <w:proofErr w:type="spellEnd"/>
+      <w:r>
+        <w:t xml:space="preserve"> </w:t>
+      </w:r>
+      <w:proofErr w:type="spellStart"/>
+      <w:r>
+        <w:t>liye</w:t>
+      </w:r>
+      <w:proofErr w:type="spellEnd"/>
+      <w:r>
+        <w:t xml:space="preserve">. Bas ye check </w:t>
+      </w:r>
+      <w:proofErr w:type="spellStart"/>
+      <w:r>
+        <w:t>kar</w:t>
+      </w:r>
+      <w:proofErr w:type="spellEnd"/>
+      <w:r>
+        <w:t xml:space="preserve"> </w:t>
+      </w:r>
+      <w:proofErr w:type="spellStart"/>
+      <w:r>
+        <w:t>lena</w:t>
       </w:r>
       <w:proofErr w:type="spellEnd"/>
       <w:r>
@@ -8714,105 +9356,27 @@
       </w:r>
       <w:proofErr w:type="spellStart"/>
       <w:r>
-        <w:t>abhi</w:t>
-      </w:r>
-      <w:proofErr w:type="spellEnd"/>
-      <w:r>
-        <w:t xml:space="preserve"> hum ye sab </w:t>
-      </w:r>
-      <w:r>
-        <w:rPr>
-          <w:b/>
-          <w:bCs/>
-        </w:rPr>
-        <w:t>Console</w:t>
-      </w:r>
-      <w:r>
-        <w:t xml:space="preserve"> </w:t>
-      </w:r>
-      <w:proofErr w:type="spellStart"/>
-      <w:r>
-        <w:t>mein</w:t>
-      </w:r>
-      <w:proofErr w:type="spellEnd"/>
-      <w:r>
-        <w:t xml:space="preserve"> </w:t>
-      </w:r>
-      <w:proofErr w:type="spellStart"/>
-      <w:r>
-        <w:t>kar</w:t>
-      </w:r>
-      <w:proofErr w:type="spellEnd"/>
-      <w:r>
-        <w:t xml:space="preserve"> </w:t>
-      </w:r>
-      <w:proofErr w:type="spellStart"/>
-      <w:r>
-        <w:t>rahe</w:t>
-      </w:r>
-      <w:proofErr w:type="spellEnd"/>
-      <w:r>
-        <w:t xml:space="preserve"> hain, par </w:t>
-      </w:r>
-      <w:proofErr w:type="spellStart"/>
-      <w:r>
-        <w:t>aage</w:t>
-      </w:r>
-      <w:proofErr w:type="spellEnd"/>
-      <w:r>
-        <w:t xml:space="preserve"> </w:t>
-      </w:r>
-      <w:proofErr w:type="spellStart"/>
-      <w:r>
-        <w:t>chalkar</w:t>
-      </w:r>
-      <w:proofErr w:type="spellEnd"/>
-      <w:r>
-        <w:t xml:space="preserve"> hum </w:t>
-      </w:r>
-      <w:proofErr w:type="spellStart"/>
-      <w:r>
-        <w:t>ise</w:t>
-      </w:r>
-      <w:proofErr w:type="spellEnd"/>
-      <w:r>
-        <w:t xml:space="preserve"> .</w:t>
-      </w:r>
-      <w:proofErr w:type="spellStart"/>
-      <w:r>
-        <w:t>js</w:t>
-      </w:r>
-      <w:proofErr w:type="spellEnd"/>
-      <w:r>
-        <w:t xml:space="preserve"> file </w:t>
-      </w:r>
-      <w:proofErr w:type="spellStart"/>
-      <w:r>
-        <w:t>mein</w:t>
-      </w:r>
-      <w:proofErr w:type="spellEnd"/>
-      <w:r>
-        <w:t xml:space="preserve"> </w:t>
-      </w:r>
-      <w:proofErr w:type="spellStart"/>
-      <w:r>
-        <w:t>likhenge</w:t>
-      </w:r>
-      <w:proofErr w:type="spellEnd"/>
-      <w:r>
-        <w:t xml:space="preserve">. Ye foundation </w:t>
-      </w:r>
-      <w:proofErr w:type="spellStart"/>
-      <w:r>
-        <w:t>isliye</w:t>
-      </w:r>
-      <w:proofErr w:type="spellEnd"/>
-      <w:r>
-        <w:t xml:space="preserve"> </w:t>
-      </w:r>
-      <w:proofErr w:type="spellStart"/>
-      <w:r>
-        <w:t>zaroori</w:t>
+        <w:t>tumhare</w:t>
+      </w:r>
+      <w:proofErr w:type="spellEnd"/>
+      <w:r>
+        <w:t xml:space="preserve"> </w:t>
+      </w:r>
+      <w:proofErr w:type="spellStart"/>
+      <w:r>
+        <w:t>paas</w:t>
+      </w:r>
+      <w:proofErr w:type="spellEnd"/>
+      <w:r>
+        <w:t xml:space="preserve"> </w:t>
+      </w:r>
+      <w:proofErr w:type="spellStart"/>
+      <w:r>
+        <w:rPr>
+          <w:b/>
+          <w:bCs/>
+        </w:rPr>
+        <w:t>NodeList</w:t>
       </w:r>
       <w:proofErr w:type="spellEnd"/>
       <w:r>
@@ -8828,23 +9392,27 @@
       </w:r>
       <w:proofErr w:type="spellStart"/>
       <w:r>
-        <w:t>taaki</w:t>
-      </w:r>
-      <w:proofErr w:type="spellEnd"/>
-      <w:r>
-        <w:t xml:space="preserve"> jab tum database se </w:t>
-      </w:r>
-      <w:proofErr w:type="spellStart"/>
-      <w:r>
-        <w:t>aayi</w:t>
-      </w:r>
-      <w:proofErr w:type="spellEnd"/>
-      <w:r>
-        <w:t xml:space="preserve"> hui 100 items ki list ko UI par </w:t>
-      </w:r>
-      <w:proofErr w:type="spellStart"/>
-      <w:r>
-        <w:t>dikhao</w:t>
+        <w:t>ya</w:t>
+      </w:r>
+      <w:proofErr w:type="spellEnd"/>
+      <w:r>
+        <w:t xml:space="preserve"> </w:t>
+      </w:r>
+      <w:proofErr w:type="spellStart"/>
+      <w:r>
+        <w:rPr>
+          <w:b/>
+          <w:bCs/>
+        </w:rPr>
+        <w:t>HTMLCollection</w:t>
+      </w:r>
+      <w:proofErr w:type="spellEnd"/>
+      <w:r>
+        <w:t xml:space="preserve">. Agar collection </w:t>
+      </w:r>
+      <w:proofErr w:type="spellStart"/>
+      <w:r>
+        <w:t>hai</w:t>
       </w:r>
       <w:proofErr w:type="spellEnd"/>
       <w:r>
@@ -8856,63 +9424,39 @@
       </w:r>
       <w:proofErr w:type="spellEnd"/>
       <w:r>
-        <w:t xml:space="preserve"> tum </w:t>
-      </w:r>
-      <w:proofErr w:type="spellStart"/>
-      <w:r>
-        <w:t>darr</w:t>
-      </w:r>
-      <w:proofErr w:type="spellEnd"/>
-      <w:r>
-        <w:t xml:space="preserve"> </w:t>
-      </w:r>
-      <w:proofErr w:type="spellStart"/>
-      <w:r>
-        <w:t>na</w:t>
-      </w:r>
-      <w:proofErr w:type="spellEnd"/>
-      <w:r>
-        <w:t xml:space="preserve"> </w:t>
-      </w:r>
-      <w:proofErr w:type="spellStart"/>
-      <w:r>
-        <w:t>jao</w:t>
-      </w:r>
-      <w:proofErr w:type="spellEnd"/>
-      <w:r>
-        <w:t xml:space="preserve"> ki "</w:t>
-      </w:r>
-      <w:proofErr w:type="spellStart"/>
-      <w:r>
-        <w:t>Itne</w:t>
-      </w:r>
-      <w:proofErr w:type="spellEnd"/>
-      <w:r>
-        <w:t xml:space="preserve"> </w:t>
-      </w:r>
-      <w:proofErr w:type="spellStart"/>
-      <w:r>
-        <w:t>saare</w:t>
-      </w:r>
-      <w:proofErr w:type="spellEnd"/>
-      <w:r>
-        <w:t xml:space="preserve"> elements </w:t>
-      </w:r>
-      <w:proofErr w:type="spellStart"/>
-      <w:r>
-        <w:t>kaise</w:t>
-      </w:r>
-      <w:proofErr w:type="spellEnd"/>
-      <w:r>
-        <w:t xml:space="preserve"> handle </w:t>
-      </w:r>
-      <w:proofErr w:type="spellStart"/>
-      <w:r>
-        <w:t>karun</w:t>
-      </w:r>
-      <w:proofErr w:type="spellEnd"/>
-      <w:r>
-        <w:t>?"</w:t>
+        <w:t xml:space="preserve"> </w:t>
+      </w:r>
+      <w:proofErr w:type="spellStart"/>
+      <w:r>
+        <w:t>Array.from</w:t>
+      </w:r>
+      <w:proofErr w:type="spellEnd"/>
+      <w:r>
+        <w:t xml:space="preserve">() ka </w:t>
+      </w:r>
+      <w:proofErr w:type="spellStart"/>
+      <w:r>
+        <w:t>chashma</w:t>
+      </w:r>
+      <w:proofErr w:type="spellEnd"/>
+      <w:r>
+        <w:t xml:space="preserve"> </w:t>
+      </w:r>
+      <w:proofErr w:type="spellStart"/>
+      <w:r>
+        <w:t>pehna</w:t>
+      </w:r>
+      <w:proofErr w:type="spellEnd"/>
+      <w:r>
+        <w:t xml:space="preserve"> do </w:t>
+      </w:r>
+      <w:proofErr w:type="spellStart"/>
+      <w:r>
+        <w:t>usey</w:t>
+      </w:r>
+      <w:proofErr w:type="spellEnd"/>
+      <w:r>
+        <w:t>!</w:t>
       </w:r>
     </w:p>
     <w:p>
@@ -8922,190 +9466,100 @@
         </w:tabs>
       </w:pPr>
       <w:r>
-        <w:rPr>
-          <w:b/>
-          <w:bCs/>
-        </w:rPr>
-        <w:t xml:space="preserve">Bhai, simple word </w:t>
-      </w:r>
-      <w:proofErr w:type="spellStart"/>
-      <w:r>
-        <w:rPr>
-          <w:b/>
-          <w:bCs/>
-        </w:rPr>
-        <w:t>mein</w:t>
-      </w:r>
-      <w:proofErr w:type="spellEnd"/>
-      <w:r>
-        <w:rPr>
-          <w:b/>
-          <w:bCs/>
-        </w:rPr>
-        <w:t>:</w:t>
-      </w:r>
-      <w:r>
-        <w:t xml:space="preserve"> </w:t>
-      </w:r>
-      <w:proofErr w:type="spellStart"/>
-      <w:r>
-        <w:t>forEach</w:t>
-      </w:r>
-      <w:proofErr w:type="spellEnd"/>
-      <w:r>
-        <w:t xml:space="preserve"> loop </w:t>
-      </w:r>
-      <w:proofErr w:type="spellStart"/>
-      <w:r>
-        <w:t>tumhara</w:t>
-      </w:r>
-      <w:proofErr w:type="spellEnd"/>
-      <w:r>
-        <w:t xml:space="preserve"> best friend </w:t>
-      </w:r>
-      <w:proofErr w:type="spellStart"/>
-      <w:r>
-        <w:t>hai</w:t>
-      </w:r>
-      <w:proofErr w:type="spellEnd"/>
-      <w:r>
-        <w:t xml:space="preserve"> multiple elements </w:t>
-      </w:r>
-      <w:proofErr w:type="spellStart"/>
-      <w:r>
-        <w:t>ke</w:t>
-      </w:r>
-      <w:proofErr w:type="spellEnd"/>
-      <w:r>
-        <w:t xml:space="preserve"> </w:t>
-      </w:r>
-      <w:proofErr w:type="spellStart"/>
-      <w:r>
-        <w:t>liye</w:t>
-      </w:r>
-      <w:proofErr w:type="spellEnd"/>
-      <w:r>
-        <w:t xml:space="preserve">. Bas ye check </w:t>
-      </w:r>
-      <w:proofErr w:type="spellStart"/>
-      <w:r>
-        <w:t>kar</w:t>
-      </w:r>
-      <w:proofErr w:type="spellEnd"/>
-      <w:r>
-        <w:t xml:space="preserve"> </w:t>
-      </w:r>
-      <w:proofErr w:type="spellStart"/>
-      <w:r>
-        <w:t>lena</w:t>
-      </w:r>
-      <w:proofErr w:type="spellEnd"/>
-      <w:r>
-        <w:t xml:space="preserve"> ki </w:t>
-      </w:r>
-      <w:proofErr w:type="spellStart"/>
-      <w:r>
-        <w:t>tumhare</w:t>
-      </w:r>
-      <w:proofErr w:type="spellEnd"/>
-      <w:r>
-        <w:t xml:space="preserve"> </w:t>
-      </w:r>
-      <w:proofErr w:type="spellStart"/>
-      <w:r>
-        <w:t>paas</w:t>
-      </w:r>
-      <w:proofErr w:type="spellEnd"/>
-      <w:r>
-        <w:t xml:space="preserve"> </w:t>
-      </w:r>
-      <w:proofErr w:type="spellStart"/>
-      <w:r>
-        <w:rPr>
-          <w:b/>
-          <w:bCs/>
+        <w:pict w14:anchorId="558ABDE9">
+          <v:rect id="_x0000_i1043" style="width:0;height:1.5pt" o:hralign="center" o:hrstd="t" o:hr="t" fillcolor="#a0a0a0" stroked="f"/>
+        </w:pict>
+      </w:r>
+    </w:p>
+    <w:p>
+      <w:pPr>
+        <w:tabs>
+          <w:tab w:val="left" w:pos="2437"/>
+        </w:tabs>
+      </w:pPr>
+    </w:p>
+    <w:p>
+      <w:pPr>
+        <w:tabs>
+          <w:tab w:val="left" w:pos="2437"/>
+        </w:tabs>
+      </w:pPr>
+    </w:p>
+    <w:p>
+      <w:pPr>
+        <w:tabs>
+          <w:tab w:val="left" w:pos="2437"/>
+        </w:tabs>
+        <w:rPr>
+          <w:b/>
+          <w:bCs/>
+          <w:sz w:val="32"/>
+          <w:szCs w:val="32"/>
+        </w:rPr>
+      </w:pPr>
+      <w:r>
+        <w:rPr>
+          <w:b/>
+          <w:bCs/>
+          <w:sz w:val="32"/>
+          <w:szCs w:val="32"/>
+        </w:rPr>
+        <w:lastRenderedPageBreak/>
+        <w:t xml:space="preserve"># </w:t>
+      </w:r>
+      <w:r>
+        <w:rPr>
+          <w:b/>
+          <w:bCs/>
+          <w:sz w:val="32"/>
+          <w:szCs w:val="32"/>
+          <w:u w:val="single"/>
+        </w:rPr>
+        <w:t xml:space="preserve">IMPORTANT -&gt; DIFFERENCE BETWEEN </w:t>
+      </w:r>
+      <w:proofErr w:type="spellStart"/>
+      <w:r>
+        <w:rPr>
+          <w:b/>
+          <w:bCs/>
+          <w:sz w:val="32"/>
+          <w:szCs w:val="32"/>
+          <w:u w:val="single"/>
         </w:rPr>
         <w:t>NodeList</w:t>
       </w:r>
       <w:proofErr w:type="spellEnd"/>
       <w:r>
-        <w:t xml:space="preserve"> </w:t>
-      </w:r>
-      <w:proofErr w:type="spellStart"/>
-      <w:r>
-        <w:t>hai</w:t>
-      </w:r>
-      <w:proofErr w:type="spellEnd"/>
-      <w:r>
-        <w:t xml:space="preserve"> </w:t>
-      </w:r>
-      <w:proofErr w:type="spellStart"/>
-      <w:r>
-        <w:t>ya</w:t>
-      </w:r>
-      <w:proofErr w:type="spellEnd"/>
-      <w:r>
-        <w:t xml:space="preserve"> </w:t>
-      </w:r>
-      <w:proofErr w:type="spellStart"/>
-      <w:r>
-        <w:rPr>
-          <w:b/>
-          <w:bCs/>
+        <w:rPr>
+          <w:b/>
+          <w:bCs/>
+          <w:sz w:val="32"/>
+          <w:szCs w:val="32"/>
+          <w:u w:val="single"/>
+        </w:rPr>
+        <w:t xml:space="preserve"> AND </w:t>
+      </w:r>
+      <w:proofErr w:type="spellStart"/>
+      <w:r>
+        <w:rPr>
+          <w:b/>
+          <w:bCs/>
+          <w:sz w:val="32"/>
+          <w:szCs w:val="32"/>
+          <w:u w:val="single"/>
         </w:rPr>
         <w:t>HTMLCollection</w:t>
       </w:r>
       <w:proofErr w:type="spellEnd"/>
       <w:r>
-        <w:t xml:space="preserve">. Agar collection </w:t>
-      </w:r>
-      <w:proofErr w:type="spellStart"/>
-      <w:r>
-        <w:t>hai</w:t>
-      </w:r>
-      <w:proofErr w:type="spellEnd"/>
-      <w:r>
-        <w:t xml:space="preserve">, </w:t>
-      </w:r>
-      <w:proofErr w:type="spellStart"/>
-      <w:r>
-        <w:t>toh</w:t>
-      </w:r>
-      <w:proofErr w:type="spellEnd"/>
-      <w:r>
-        <w:t xml:space="preserve"> </w:t>
-      </w:r>
-      <w:proofErr w:type="spellStart"/>
-      <w:r>
-        <w:t>Array.from</w:t>
-      </w:r>
-      <w:proofErr w:type="spellEnd"/>
-      <w:r>
-        <w:t xml:space="preserve">() ka </w:t>
-      </w:r>
-      <w:proofErr w:type="spellStart"/>
-      <w:r>
-        <w:t>chashma</w:t>
-      </w:r>
-      <w:proofErr w:type="spellEnd"/>
-      <w:r>
-        <w:t xml:space="preserve"> </w:t>
-      </w:r>
-      <w:proofErr w:type="spellStart"/>
-      <w:r>
-        <w:t>pehna</w:t>
-      </w:r>
-      <w:proofErr w:type="spellEnd"/>
-      <w:r>
-        <w:t xml:space="preserve"> do </w:t>
-      </w:r>
-      <w:proofErr w:type="spellStart"/>
-      <w:r>
-        <w:t>usey</w:t>
-      </w:r>
-      <w:proofErr w:type="spellEnd"/>
-      <w:r>
-        <w:t>!</w:t>
+        <w:rPr>
+          <w:b/>
+          <w:bCs/>
+          <w:sz w:val="32"/>
+          <w:szCs w:val="32"/>
+          <w:u w:val="single"/>
+        </w:rPr>
+        <w:t>??</w:t>
       </w:r>
     </w:p>
     <w:p>
@@ -9115,8 +9569,136 @@
         </w:tabs>
       </w:pPr>
       <w:r>
-        <w:pict w14:anchorId="558ABDE9">
-          <v:rect id="_x0000_i1122" style="width:0;height:1.5pt" o:hralign="center" o:hrstd="t" o:hr="t" fillcolor="#a0a0a0" stroked="f"/>
+        <w:drawing>
+          <wp:inline distT="0" distB="0" distL="0" distR="0" wp14:anchorId="6D7862B8" wp14:editId="425E96BE">
+            <wp:extent cx="5731510" cy="2229485"/>
+            <wp:effectExtent l="0" t="0" r="2540" b="0"/>
+            <wp:docPr id="682399871" name="Picture 1"/>
+            <wp:cNvGraphicFramePr>
+              <a:graphicFrameLocks xmlns:a="http://schemas.openxmlformats.org/drawingml/2006/main" noChangeAspect="1"/>
+            </wp:cNvGraphicFramePr>
+            <a:graphic xmlns:a="http://schemas.openxmlformats.org/drawingml/2006/main">
+              <a:graphicData uri="http://schemas.openxmlformats.org/drawingml/2006/picture">
+                <pic:pic xmlns:pic="http://schemas.openxmlformats.org/drawingml/2006/picture">
+                  <pic:nvPicPr>
+                    <pic:cNvPr id="682399871" name=""/>
+                    <pic:cNvPicPr/>
+                  </pic:nvPicPr>
+                  <pic:blipFill>
+                    <a:blip r:embed="rId55"/>
+                    <a:stretch>
+                      <a:fillRect/>
+                    </a:stretch>
+                  </pic:blipFill>
+                  <pic:spPr>
+                    <a:xfrm>
+                      <a:off x="0" y="0"/>
+                      <a:ext cx="5731510" cy="2229485"/>
+                    </a:xfrm>
+                    <a:prstGeom prst="rect">
+                      <a:avLst/>
+                    </a:prstGeom>
+                  </pic:spPr>
+                </pic:pic>
+              </a:graphicData>
+            </a:graphic>
+          </wp:inline>
+        </w:drawing>
+      </w:r>
+    </w:p>
+    <w:p>
+      <w:pPr>
+        <w:tabs>
+          <w:tab w:val="left" w:pos="2437"/>
+        </w:tabs>
+      </w:pPr>
+      <w:r>
+        <w:drawing>
+          <wp:inline distT="0" distB="0" distL="0" distR="0" wp14:anchorId="5EC4C6B7" wp14:editId="72159277">
+            <wp:extent cx="5731510" cy="2230120"/>
+            <wp:effectExtent l="0" t="0" r="2540" b="0"/>
+            <wp:docPr id="2080119768" name="Picture 1"/>
+            <wp:cNvGraphicFramePr>
+              <a:graphicFrameLocks xmlns:a="http://schemas.openxmlformats.org/drawingml/2006/main" noChangeAspect="1"/>
+            </wp:cNvGraphicFramePr>
+            <a:graphic xmlns:a="http://schemas.openxmlformats.org/drawingml/2006/main">
+              <a:graphicData uri="http://schemas.openxmlformats.org/drawingml/2006/picture">
+                <pic:pic xmlns:pic="http://schemas.openxmlformats.org/drawingml/2006/picture">
+                  <pic:nvPicPr>
+                    <pic:cNvPr id="2080119768" name=""/>
+                    <pic:cNvPicPr/>
+                  </pic:nvPicPr>
+                  <pic:blipFill>
+                    <a:blip r:embed="rId56"/>
+                    <a:stretch>
+                      <a:fillRect/>
+                    </a:stretch>
+                  </pic:blipFill>
+                  <pic:spPr>
+                    <a:xfrm>
+                      <a:off x="0" y="0"/>
+                      <a:ext cx="5731510" cy="2230120"/>
+                    </a:xfrm>
+                    <a:prstGeom prst="rect">
+                      <a:avLst/>
+                    </a:prstGeom>
+                  </pic:spPr>
+                </pic:pic>
+              </a:graphicData>
+            </a:graphic>
+          </wp:inline>
+        </w:drawing>
+      </w:r>
+    </w:p>
+    <w:p>
+      <w:pPr>
+        <w:tabs>
+          <w:tab w:val="left" w:pos="2437"/>
+        </w:tabs>
+      </w:pPr>
+      <w:r>
+        <w:t xml:space="preserve"> </w:t>
+      </w:r>
+      <w:r>
+        <w:drawing>
+          <wp:inline distT="0" distB="0" distL="0" distR="0" wp14:anchorId="12D62A95" wp14:editId="550EF2D8">
+            <wp:extent cx="5619854" cy="3204673"/>
+            <wp:effectExtent l="0" t="0" r="0" b="0"/>
+            <wp:docPr id="1006872911" name="Picture 1"/>
+            <wp:cNvGraphicFramePr>
+              <a:graphicFrameLocks xmlns:a="http://schemas.openxmlformats.org/drawingml/2006/main" noChangeAspect="1"/>
+            </wp:cNvGraphicFramePr>
+            <a:graphic xmlns:a="http://schemas.openxmlformats.org/drawingml/2006/main">
+              <a:graphicData uri="http://schemas.openxmlformats.org/drawingml/2006/picture">
+                <pic:pic xmlns:pic="http://schemas.openxmlformats.org/drawingml/2006/picture">
+                  <pic:nvPicPr>
+                    <pic:cNvPr id="1006872911" name=""/>
+                    <pic:cNvPicPr/>
+                  </pic:nvPicPr>
+                  <pic:blipFill>
+                    <a:blip r:embed="rId57"/>
+                    <a:stretch>
+                      <a:fillRect/>
+                    </a:stretch>
+                  </pic:blipFill>
+                  <pic:spPr>
+                    <a:xfrm>
+                      <a:off x="0" y="0"/>
+                      <a:ext cx="5653080" cy="3223620"/>
+                    </a:xfrm>
+                    <a:prstGeom prst="rect">
+                      <a:avLst/>
+                    </a:prstGeom>
+                  </pic:spPr>
+                </pic:pic>
+              </a:graphicData>
+            </a:graphic>
+          </wp:inline>
+        </w:drawing>
+      </w:r>
+      <w:r>
+        <w:pict w14:anchorId="4639F10E">
+          <v:rect id="_x0000_i1052" style="width:0;height:1.5pt" o:hralign="center" o:hrstd="t" o:hr="t" fillcolor="#a0a0a0" stroked="f"/>
         </w:pict>
       </w:r>
     </w:p>
@@ -9135,6 +9717,56 @@
     </w:sectPr>
   </w:body>
 </w:document>
+</file>
+
+<file path=word/endnotes.xml><?xml version="1.0" encoding="utf-8"?>
+<w:endnotes xmlns:wpc="http://schemas.microsoft.com/office/word/2010/wordprocessingCanvas" xmlns:cx="http://schemas.microsoft.com/office/drawing/2014/chartex" xmlns:cx1="http://schemas.microsoft.com/office/drawing/2015/9/8/chartex" xmlns:cx2="http://schemas.microsoft.com/office/drawing/2015/10/21/chartex" xmlns:cx3="http://schemas.microsoft.com/office/drawing/2016/5/9/chartex" xmlns:cx4="http://schemas.microsoft.com/office/drawing/2016/5/10/chartex" xmlns:cx5="http://schemas.microsoft.com/office/drawing/2016/5/11/chartex" xmlns:cx6="http://schemas.microsoft.com/office/drawing/2016/5/12/chartex" xmlns:cx7="http://schemas.microsoft.com/office/drawing/2016/5/13/chartex" xmlns:cx8="http://schemas.microsoft.com/office/drawing/2016/5/14/chartex" xmlns:mc="http://schemas.openxmlformats.org/markup-compatibility/2006" xmlns:aink="http://schemas.microsoft.com/office/drawing/2016/ink" xmlns:am3d="http://schemas.microsoft.com/office/drawing/2017/model3d" xmlns:o="urn:schemas-microsoft-com:office:office" xmlns:oel="http://schemas.microsoft.com/office/2019/extlst" xmlns:r="http://schemas.openxmlformats.org/officeDocument/2006/relationships" xmlns:m="http://schemas.openxmlformats.org/officeDocument/2006/math" xmlns:v="urn:schemas-microsoft-com:vml" xmlns:wp14="http://schemas.microsoft.com/office/word/2010/wordprocessingDrawing" xmlns:wp="http://schemas.openxmlformats.org/drawingml/2006/wordprocessingDrawing" xmlns:w10="urn:schemas-microsoft-com:office:word" xmlns:w="http://schemas.openxmlformats.org/wordprocessingml/2006/main" xmlns:w14="http://schemas.microsoft.com/office/word/2010/wordml" xmlns:w15="http://schemas.microsoft.com/office/word/2012/wordml" xmlns:w16cex="http://schemas.microsoft.com/office/word/2018/wordml/cex" xmlns:w16cid="http://schemas.microsoft.com/office/word/2016/wordml/cid" xmlns:w16="http://schemas.microsoft.com/office/word/2018/wordml" xmlns:w16du="http://schemas.microsoft.com/office/word/2023/wordml/word16du" xmlns:w16sdtdh="http://schemas.microsoft.com/office/word/2020/wordml/sdtdatahash" xmlns:w16sdtfl="http://schemas.microsoft.com/office/word/2024/wordml/sdtformatlock" xmlns:w16se="http://schemas.microsoft.com/office/word/2015/wordml/symex" xmlns:wpg="http://schemas.microsoft.com/office/word/2010/wordprocessingGroup" xmlns:wpi="http://schemas.microsoft.com/office/word/2010/wordprocessingInk" xmlns:wne="http://schemas.microsoft.com/office/word/2006/wordml" xmlns:wps="http://schemas.microsoft.com/office/word/2010/wordprocessingShape" mc:Ignorable="w14 w15 w16se w16cid w16 w16cex w16sdtdh w16sdtfl w16du wp14">
+  <w:endnote w:type="separator" w:id="-1">
+    <w:p>
+      <w:pPr>
+        <w:spacing w:after="0" w:line="240" w:lineRule="auto"/>
+      </w:pPr>
+      <w:r>
+        <w:separator/>
+      </w:r>
+    </w:p>
+  </w:endnote>
+  <w:endnote w:type="continuationSeparator" w:id="0">
+    <w:p>
+      <w:pPr>
+        <w:spacing w:after="0" w:line="240" w:lineRule="auto"/>
+      </w:pPr>
+      <w:r>
+        <w:continuationSeparator/>
+      </w:r>
+    </w:p>
+  </w:endnote>
+</w:endnotes>
+</file>
+
+<file path=word/footnotes.xml><?xml version="1.0" encoding="utf-8"?>
+<w:footnotes xmlns:wpc="http://schemas.microsoft.com/office/word/2010/wordprocessingCanvas" xmlns:cx="http://schemas.microsoft.com/office/drawing/2014/chartex" xmlns:cx1="http://schemas.microsoft.com/office/drawing/2015/9/8/chartex" xmlns:cx2="http://schemas.microsoft.com/office/drawing/2015/10/21/chartex" xmlns:cx3="http://schemas.microsoft.com/office/drawing/2016/5/9/chartex" xmlns:cx4="http://schemas.microsoft.com/office/drawing/2016/5/10/chartex" xmlns:cx5="http://schemas.microsoft.com/office/drawing/2016/5/11/chartex" xmlns:cx6="http://schemas.microsoft.com/office/drawing/2016/5/12/chartex" xmlns:cx7="http://schemas.microsoft.com/office/drawing/2016/5/13/chartex" xmlns:cx8="http://schemas.microsoft.com/office/drawing/2016/5/14/chartex" xmlns:mc="http://schemas.openxmlformats.org/markup-compatibility/2006" xmlns:aink="http://schemas.microsoft.com/office/drawing/2016/ink" xmlns:am3d="http://schemas.microsoft.com/office/drawing/2017/model3d" xmlns:o="urn:schemas-microsoft-com:office:office" xmlns:oel="http://schemas.microsoft.com/office/2019/extlst" xmlns:r="http://schemas.openxmlformats.org/officeDocument/2006/relationships" xmlns:m="http://schemas.openxmlformats.org/officeDocument/2006/math" xmlns:v="urn:schemas-microsoft-com:vml" xmlns:wp14="http://schemas.microsoft.com/office/word/2010/wordprocessingDrawing" xmlns:wp="http://schemas.openxmlformats.org/drawingml/2006/wordprocessingDrawing" xmlns:w10="urn:schemas-microsoft-com:office:word" xmlns:w="http://schemas.openxmlformats.org/wordprocessingml/2006/main" xmlns:w14="http://schemas.microsoft.com/office/word/2010/wordml" xmlns:w15="http://schemas.microsoft.com/office/word/2012/wordml" xmlns:w16cex="http://schemas.microsoft.com/office/word/2018/wordml/cex" xmlns:w16cid="http://schemas.microsoft.com/office/word/2016/wordml/cid" xmlns:w16="http://schemas.microsoft.com/office/word/2018/wordml" xmlns:w16du="http://schemas.microsoft.com/office/word/2023/wordml/word16du" xmlns:w16sdtdh="http://schemas.microsoft.com/office/word/2020/wordml/sdtdatahash" xmlns:w16sdtfl="http://schemas.microsoft.com/office/word/2024/wordml/sdtformatlock" xmlns:w16se="http://schemas.microsoft.com/office/word/2015/wordml/symex" xmlns:wpg="http://schemas.microsoft.com/office/word/2010/wordprocessingGroup" xmlns:wpi="http://schemas.microsoft.com/office/word/2010/wordprocessingInk" xmlns:wne="http://schemas.microsoft.com/office/word/2006/wordml" xmlns:wps="http://schemas.microsoft.com/office/word/2010/wordprocessingShape" mc:Ignorable="w14 w15 w16se w16cid w16 w16cex w16sdtdh w16sdtfl w16du wp14">
+  <w:footnote w:type="separator" w:id="-1">
+    <w:p>
+      <w:pPr>
+        <w:spacing w:after="0" w:line="240" w:lineRule="auto"/>
+      </w:pPr>
+      <w:r>
+        <w:separator/>
+      </w:r>
+    </w:p>
+  </w:footnote>
+  <w:footnote w:type="continuationSeparator" w:id="0">
+    <w:p>
+      <w:pPr>
+        <w:spacing w:after="0" w:line="240" w:lineRule="auto"/>
+      </w:pPr>
+      <w:r>
+        <w:continuationSeparator/>
+      </w:r>
+    </w:p>
+  </w:footnote>
+</w:footnotes>
 </file>
 
 <file path=word/numbering.xml><?xml version="1.0" encoding="utf-8"?>
@@ -12109,6 +12741,7 @@
   <w:style w:type="character" w:default="1" w:styleId="DefaultParagraphFont">
     <w:name w:val="Default Paragraph Font"/>
     <w:uiPriority w:val="1"/>
+    <w:semiHidden/>
     <w:unhideWhenUsed/>
   </w:style>
   <w:style w:type="table" w:default="1" w:styleId="TableNormal">
@@ -12422,6 +13055,50 @@
       <w:spacing w:val="5"/>
     </w:rPr>
   </w:style>
+  <w:style w:type="paragraph" w:styleId="Header">
+    <w:name w:val="header"/>
+    <w:basedOn w:val="Normal"/>
+    <w:link w:val="HeaderChar"/>
+    <w:uiPriority w:val="99"/>
+    <w:unhideWhenUsed/>
+    <w:rsid w:val="00FB71B1"/>
+    <w:pPr>
+      <w:tabs>
+        <w:tab w:val="center" w:pos="4513"/>
+        <w:tab w:val="right" w:pos="9026"/>
+      </w:tabs>
+      <w:spacing w:after="0" w:line="240" w:lineRule="auto"/>
+    </w:pPr>
+  </w:style>
+  <w:style w:type="character" w:customStyle="1" w:styleId="HeaderChar">
+    <w:name w:val="Header Char"/>
+    <w:basedOn w:val="DefaultParagraphFont"/>
+    <w:link w:val="Header"/>
+    <w:uiPriority w:val="99"/>
+    <w:rsid w:val="00FB71B1"/>
+  </w:style>
+  <w:style w:type="paragraph" w:styleId="Footer">
+    <w:name w:val="footer"/>
+    <w:basedOn w:val="Normal"/>
+    <w:link w:val="FooterChar"/>
+    <w:uiPriority w:val="99"/>
+    <w:unhideWhenUsed/>
+    <w:rsid w:val="00FB71B1"/>
+    <w:pPr>
+      <w:tabs>
+        <w:tab w:val="center" w:pos="4513"/>
+        <w:tab w:val="right" w:pos="9026"/>
+      </w:tabs>
+      <w:spacing w:after="0" w:line="240" w:lineRule="auto"/>
+    </w:pPr>
+  </w:style>
+  <w:style w:type="character" w:customStyle="1" w:styleId="FooterChar">
+    <w:name w:val="Footer Char"/>
+    <w:basedOn w:val="DefaultParagraphFont"/>
+    <w:link w:val="Footer"/>
+    <w:uiPriority w:val="99"/>
+    <w:rsid w:val="00FB71B1"/>
+  </w:style>
 </w:styles>
 </file>
 

</xml_diff>

<commit_message>
understood difference between children and childnode
</commit_message>
<xml_diff>
--- a/JAVASCRIPT NOTES/JAVASCRIPT NOTES (2) AFTER BASICS.docx
+++ b/JAVASCRIPT NOTES/JAVASCRIPT NOTES (2) AFTER BASICS.docx
@@ -5401,6 +5401,43 @@
         </w:tabs>
       </w:pPr>
       <w:r>
+        <w:drawing>
+          <wp:inline distT="0" distB="0" distL="0" distR="0" wp14:anchorId="7B4F3656" wp14:editId="76AF0A11">
+            <wp:extent cx="5731510" cy="2008505"/>
+            <wp:effectExtent l="0" t="0" r="2540" b="0"/>
+            <wp:docPr id="57081055" name="Picture 1"/>
+            <wp:cNvGraphicFramePr>
+              <a:graphicFrameLocks xmlns:a="http://schemas.openxmlformats.org/drawingml/2006/main" noChangeAspect="1"/>
+            </wp:cNvGraphicFramePr>
+            <a:graphic xmlns:a="http://schemas.openxmlformats.org/drawingml/2006/main">
+              <a:graphicData uri="http://schemas.openxmlformats.org/drawingml/2006/picture">
+                <pic:pic xmlns:pic="http://schemas.openxmlformats.org/drawingml/2006/picture">
+                  <pic:nvPicPr>
+                    <pic:cNvPr id="57081055" name=""/>
+                    <pic:cNvPicPr/>
+                  </pic:nvPicPr>
+                  <pic:blipFill>
+                    <a:blip r:embed="rId68"/>
+                    <a:stretch>
+                      <a:fillRect/>
+                    </a:stretch>
+                  </pic:blipFill>
+                  <pic:spPr>
+                    <a:xfrm>
+                      <a:off x="0" y="0"/>
+                      <a:ext cx="5731510" cy="2008505"/>
+                    </a:xfrm>
+                    <a:prstGeom prst="rect">
+                      <a:avLst/>
+                    </a:prstGeom>
+                  </pic:spPr>
+                </pic:pic>
+              </a:graphicData>
+            </a:graphic>
+          </wp:inline>
+        </w:drawing>
+      </w:r>
+      <w:r>
         <w:pict w14:anchorId="0124D118">
           <v:rect id="_x0000_i1072" style="width:0;height:1.5pt" o:hralign="center" o:hrstd="t" o:hr="t" fillcolor="#a0a0a0" stroked="f"/>
         </w:pict>
@@ -5414,8 +5451,200 @@
         <w:rPr>
           <w:b/>
           <w:bCs/>
-        </w:rPr>
-      </w:pPr>
+          <w:sz w:val="32"/>
+          <w:szCs w:val="32"/>
+          <w:u w:val="single"/>
+        </w:rPr>
+      </w:pPr>
+      <w:r>
+        <w:rPr>
+          <w:b/>
+          <w:bCs/>
+          <w:sz w:val="32"/>
+          <w:szCs w:val="32"/>
+        </w:rPr>
+        <w:t xml:space="preserve"># </w:t>
+      </w:r>
+      <w:r>
+        <w:rPr>
+          <w:b/>
+          <w:bCs/>
+          <w:sz w:val="32"/>
+          <w:szCs w:val="32"/>
+          <w:u w:val="single"/>
+        </w:rPr>
+        <w:t>IMPORTANT -&gt; DIFFERENCE BETWEEN CHILDNODE AND CHILDREN!!</w:t>
+      </w:r>
+    </w:p>
+    <w:p>
+      <w:pPr>
+        <w:tabs>
+          <w:tab w:val="left" w:pos="2437"/>
+        </w:tabs>
+        <w:rPr>
+          <w:b/>
+          <w:bCs/>
+          <w:sz w:val="32"/>
+          <w:szCs w:val="32"/>
+          <w:u w:val="single"/>
+        </w:rPr>
+      </w:pPr>
+      <w:r>
+        <w:rPr>
+          <w:b/>
+          <w:bCs/>
+          <w:sz w:val="32"/>
+          <w:szCs w:val="32"/>
+          <w:u w:val="single"/>
+        </w:rPr>
+        <w:t>CHILDREN:</w:t>
+      </w:r>
+    </w:p>
+    <w:p>
+      <w:pPr>
+        <w:tabs>
+          <w:tab w:val="left" w:pos="2437"/>
+        </w:tabs>
+      </w:pPr>
+      <w:r>
+        <w:drawing>
+          <wp:inline distT="0" distB="0" distL="0" distR="0" wp14:anchorId="70420D6C" wp14:editId="489AF558">
+            <wp:extent cx="5731510" cy="1956435"/>
+            <wp:effectExtent l="0" t="0" r="2540" b="5715"/>
+            <wp:docPr id="7223507" name="Picture 1"/>
+            <wp:cNvGraphicFramePr>
+              <a:graphicFrameLocks xmlns:a="http://schemas.openxmlformats.org/drawingml/2006/main" noChangeAspect="1"/>
+            </wp:cNvGraphicFramePr>
+            <a:graphic xmlns:a="http://schemas.openxmlformats.org/drawingml/2006/main">
+              <a:graphicData uri="http://schemas.openxmlformats.org/drawingml/2006/picture">
+                <pic:pic xmlns:pic="http://schemas.openxmlformats.org/drawingml/2006/picture">
+                  <pic:nvPicPr>
+                    <pic:cNvPr id="1475556121" name=""/>
+                    <pic:cNvPicPr/>
+                  </pic:nvPicPr>
+                  <pic:blipFill>
+                    <a:blip r:embed="rId65"/>
+                    <a:stretch>
+                      <a:fillRect/>
+                    </a:stretch>
+                  </pic:blipFill>
+                  <pic:spPr>
+                    <a:xfrm>
+                      <a:off x="0" y="0"/>
+                      <a:ext cx="5731510" cy="1956435"/>
+                    </a:xfrm>
+                    <a:prstGeom prst="rect">
+                      <a:avLst/>
+                    </a:prstGeom>
+                  </pic:spPr>
+                </pic:pic>
+              </a:graphicData>
+            </a:graphic>
+          </wp:inline>
+        </w:drawing>
+      </w:r>
+    </w:p>
+    <w:p>
+      <w:pPr>
+        <w:tabs>
+          <w:tab w:val="left" w:pos="2437"/>
+        </w:tabs>
+      </w:pPr>
+    </w:p>
+    <w:p>
+      <w:pPr>
+        <w:tabs>
+          <w:tab w:val="left" w:pos="2437"/>
+        </w:tabs>
+      </w:pPr>
+    </w:p>
+    <w:p>
+      <w:pPr>
+        <w:tabs>
+          <w:tab w:val="left" w:pos="2437"/>
+        </w:tabs>
+      </w:pPr>
+    </w:p>
+    <w:p>
+      <w:pPr>
+        <w:tabs>
+          <w:tab w:val="left" w:pos="2437"/>
+        </w:tabs>
+      </w:pPr>
+    </w:p>
+    <w:p>
+      <w:pPr>
+        <w:tabs>
+          <w:tab w:val="left" w:pos="2437"/>
+        </w:tabs>
+        <w:rPr>
+          <w:b/>
+          <w:bCs/>
+          <w:sz w:val="32"/>
+          <w:szCs w:val="32"/>
+          <w:u w:val="single"/>
+        </w:rPr>
+      </w:pPr>
+      <w:r>
+        <w:rPr>
+          <w:b/>
+          <w:bCs/>
+          <w:sz w:val="32"/>
+          <w:szCs w:val="32"/>
+          <w:u w:val="single"/>
+        </w:rPr>
+        <w:lastRenderedPageBreak/>
+        <w:t>CHILDNODE:</w:t>
+      </w:r>
+    </w:p>
+    <w:p>
+      <w:pPr>
+        <w:tabs>
+          <w:tab w:val="left" w:pos="2437"/>
+        </w:tabs>
+      </w:pPr>
+      <w:r>
+        <w:drawing>
+          <wp:inline distT="0" distB="0" distL="0" distR="0" wp14:anchorId="12435A40" wp14:editId="07BF0033">
+            <wp:extent cx="5731510" cy="2008505"/>
+            <wp:effectExtent l="0" t="0" r="2540" b="0"/>
+            <wp:docPr id="1401074977" name="Picture 1"/>
+            <wp:cNvGraphicFramePr>
+              <a:graphicFrameLocks xmlns:a="http://schemas.openxmlformats.org/drawingml/2006/main" noChangeAspect="1"/>
+            </wp:cNvGraphicFramePr>
+            <a:graphic xmlns:a="http://schemas.openxmlformats.org/drawingml/2006/main">
+              <a:graphicData uri="http://schemas.openxmlformats.org/drawingml/2006/picture">
+                <pic:pic xmlns:pic="http://schemas.openxmlformats.org/drawingml/2006/picture">
+                  <pic:nvPicPr>
+                    <pic:cNvPr id="57081055" name=""/>
+                    <pic:cNvPicPr/>
+                  </pic:nvPicPr>
+                  <pic:blipFill>
+                    <a:blip r:embed="rId68"/>
+                    <a:stretch>
+                      <a:fillRect/>
+                    </a:stretch>
+                  </pic:blipFill>
+                  <pic:spPr>
+                    <a:xfrm>
+                      <a:off x="0" y="0"/>
+                      <a:ext cx="5731510" cy="2008505"/>
+                    </a:xfrm>
+                    <a:prstGeom prst="rect">
+                      <a:avLst/>
+                    </a:prstGeom>
+                  </pic:spPr>
+                </pic:pic>
+              </a:graphicData>
+            </a:graphic>
+          </wp:inline>
+        </w:drawing>
+      </w:r>
+      <w:r>
+        <w:pict w14:anchorId="706728FE">
+          <v:rect id="_x0000_i1085" style="width:0;height:1.5pt" o:hralign="center" o:hrstd="t" o:hr="t" fillcolor="#a0a0a0" stroked="f"/>
+        </w:pict>
+      </w:r>
       <w:r>
         <w:rPr>
           <w:b/>
@@ -5673,6 +5902,7 @@
         </w:tabs>
       </w:pPr>
       <w:r>
+        <w:lastRenderedPageBreak/>
         <w:t xml:space="preserve">Tum HTML mein 100 cards nahi likhoge. Tum bas ek </w:t>
       </w:r>
       <w:r>
@@ -5693,7 +5923,6 @@
         </w:tabs>
       </w:pPr>
       <w:r>
-        <w:lastRenderedPageBreak/>
         <w:pict w14:anchorId="6F811F11">
           <v:rect id="_x0000_i1077" style="width:0;height:1.5pt" o:hralign="center" o:hrstd="t" o:hr="t" fillcolor="#a0a0a0" stroked="f"/>
         </w:pict>

</xml_diff>

<commit_message>
started to learn how to create new element in DOM
</commit_message>
<xml_diff>
--- a/JAVASCRIPT NOTES/JAVASCRIPT NOTES (2) AFTER BASICS.docx
+++ b/JAVASCRIPT NOTES/JAVASCRIPT NOTES (2) AFTER BASICS.docx
@@ -5874,7 +5874,10 @@
         </w:tabs>
       </w:pPr>
       <w:r>
-        <w:t>Socho tumhare paas ek array hai jisme 100 doston ke naam hain.</w:t>
+        <w:t>Socho tumhare paas ek array hai jisme 100 doston ke naam hain</w:t>
+      </w:r>
+      <w:r>
+        <w:t>.</w:t>
       </w:r>
     </w:p>
     <w:p>

</xml_diff>

<commit_message>
studied how to create new elements and use functions loops arrays with it
</commit_message>
<xml_diff>
--- a/JAVASCRIPT NOTES/JAVASCRIPT NOTES (2) AFTER BASICS.docx
+++ b/JAVASCRIPT NOTES/JAVASCRIPT NOTES (2) AFTER BASICS.docx
@@ -5650,7 +5650,7 @@
           <w:b/>
           <w:bCs/>
         </w:rPr>
-        <w:t>3. Creating New Elements: Zero se Hero</w:t>
+        <w:t xml:space="preserve">3. Creating New Elements: </w:t>
       </w:r>
     </w:p>
     <w:p>
@@ -5686,6 +5686,50 @@
     </w:p>
     <w:p>
       <w:pPr>
+        <w:tabs>
+          <w:tab w:val="left" w:pos="2437"/>
+        </w:tabs>
+      </w:pPr>
+      <w:r>
+        <w:drawing>
+          <wp:inline distT="0" distB="0" distL="0" distR="0" wp14:anchorId="7D711C68" wp14:editId="668573BD">
+            <wp:extent cx="5731510" cy="1416050"/>
+            <wp:effectExtent l="0" t="0" r="2540" b="0"/>
+            <wp:docPr id="2023987079" name="Picture 1"/>
+            <wp:cNvGraphicFramePr>
+              <a:graphicFrameLocks xmlns:a="http://schemas.openxmlformats.org/drawingml/2006/main" noChangeAspect="1"/>
+            </wp:cNvGraphicFramePr>
+            <a:graphic xmlns:a="http://schemas.openxmlformats.org/drawingml/2006/main">
+              <a:graphicData uri="http://schemas.openxmlformats.org/drawingml/2006/picture">
+                <pic:pic xmlns:pic="http://schemas.openxmlformats.org/drawingml/2006/picture">
+                  <pic:nvPicPr>
+                    <pic:cNvPr id="2023987079" name=""/>
+                    <pic:cNvPicPr/>
+                  </pic:nvPicPr>
+                  <pic:blipFill>
+                    <a:blip r:embed="rId69"/>
+                    <a:stretch>
+                      <a:fillRect/>
+                    </a:stretch>
+                  </pic:blipFill>
+                  <pic:spPr>
+                    <a:xfrm>
+                      <a:off x="0" y="0"/>
+                      <a:ext cx="5731510" cy="1416050"/>
+                    </a:xfrm>
+                    <a:prstGeom prst="rect">
+                      <a:avLst/>
+                    </a:prstGeom>
+                  </pic:spPr>
+                </pic:pic>
+              </a:graphicData>
+            </a:graphic>
+          </wp:inline>
+        </w:drawing>
+      </w:r>
+    </w:p>
+    <w:p>
+      <w:pPr>
         <w:numPr>
           <w:ilvl w:val="0"/>
           <w:numId w:val="19"/>
@@ -5829,9 +5873,497 @@
           <w:tab w:val="left" w:pos="2437"/>
         </w:tabs>
       </w:pPr>
+    </w:p>
+    <w:p>
+      <w:pPr>
+        <w:tabs>
+          <w:tab w:val="left" w:pos="2437"/>
+        </w:tabs>
+      </w:pPr>
+    </w:p>
+    <w:p>
+      <w:pPr>
+        <w:tabs>
+          <w:tab w:val="left" w:pos="2437"/>
+        </w:tabs>
+      </w:pPr>
+    </w:p>
+    <w:p>
+      <w:pPr>
+        <w:tabs>
+          <w:tab w:val="left" w:pos="2437"/>
+        </w:tabs>
+      </w:pPr>
+      <w:r>
+        <w:drawing>
+          <wp:inline distT="0" distB="0" distL="0" distR="0" wp14:anchorId="576D5271" wp14:editId="7050D6C0">
+            <wp:extent cx="5731510" cy="2063115"/>
+            <wp:effectExtent l="0" t="0" r="2540" b="0"/>
+            <wp:docPr id="1706136961" name="Picture 1"/>
+            <wp:cNvGraphicFramePr>
+              <a:graphicFrameLocks xmlns:a="http://schemas.openxmlformats.org/drawingml/2006/main" noChangeAspect="1"/>
+            </wp:cNvGraphicFramePr>
+            <a:graphic xmlns:a="http://schemas.openxmlformats.org/drawingml/2006/main">
+              <a:graphicData uri="http://schemas.openxmlformats.org/drawingml/2006/picture">
+                <pic:pic xmlns:pic="http://schemas.openxmlformats.org/drawingml/2006/picture">
+                  <pic:nvPicPr>
+                    <pic:cNvPr id="1706136961" name=""/>
+                    <pic:cNvPicPr/>
+                  </pic:nvPicPr>
+                  <pic:blipFill>
+                    <a:blip r:embed="rId70"/>
+                    <a:stretch>
+                      <a:fillRect/>
+                    </a:stretch>
+                  </pic:blipFill>
+                  <pic:spPr>
+                    <a:xfrm>
+                      <a:off x="0" y="0"/>
+                      <a:ext cx="5731510" cy="2063115"/>
+                    </a:xfrm>
+                    <a:prstGeom prst="rect">
+                      <a:avLst/>
+                    </a:prstGeom>
+                  </pic:spPr>
+                </pic:pic>
+              </a:graphicData>
+            </a:graphic>
+          </wp:inline>
+        </w:drawing>
+      </w:r>
+    </w:p>
+    <w:p>
+      <w:pPr>
+        <w:tabs>
+          <w:tab w:val="left" w:pos="2437"/>
+        </w:tabs>
+        <w:rPr>
+          <w:lang w:val="en-US"/>
+        </w:rPr>
+      </w:pPr>
+    </w:p>
+    <w:p>
+      <w:pPr>
+        <w:tabs>
+          <w:tab w:val="left" w:pos="2437"/>
+        </w:tabs>
+        <w:rPr>
+          <w:lang w:val="en-US"/>
+        </w:rPr>
+      </w:pPr>
+      <w:r>
+        <w:drawing>
+          <wp:inline distT="0" distB="0" distL="0" distR="0" wp14:anchorId="3062DD79" wp14:editId="2E9DCA19">
+            <wp:extent cx="5731510" cy="4290060"/>
+            <wp:effectExtent l="0" t="0" r="2540" b="0"/>
+            <wp:docPr id="1849953301" name="Picture 1"/>
+            <wp:cNvGraphicFramePr>
+              <a:graphicFrameLocks xmlns:a="http://schemas.openxmlformats.org/drawingml/2006/main" noChangeAspect="1"/>
+            </wp:cNvGraphicFramePr>
+            <a:graphic xmlns:a="http://schemas.openxmlformats.org/drawingml/2006/main">
+              <a:graphicData uri="http://schemas.openxmlformats.org/drawingml/2006/picture">
+                <pic:pic xmlns:pic="http://schemas.openxmlformats.org/drawingml/2006/picture">
+                  <pic:nvPicPr>
+                    <pic:cNvPr id="1849953301" name=""/>
+                    <pic:cNvPicPr/>
+                  </pic:nvPicPr>
+                  <pic:blipFill>
+                    <a:blip r:embed="rId71"/>
+                    <a:stretch>
+                      <a:fillRect/>
+                    </a:stretch>
+                  </pic:blipFill>
+                  <pic:spPr>
+                    <a:xfrm>
+                      <a:off x="0" y="0"/>
+                      <a:ext cx="5731510" cy="4290060"/>
+                    </a:xfrm>
+                    <a:prstGeom prst="rect">
+                      <a:avLst/>
+                    </a:prstGeom>
+                  </pic:spPr>
+                </pic:pic>
+              </a:graphicData>
+            </a:graphic>
+          </wp:inline>
+        </w:drawing>
+      </w:r>
+      <w:r>
+        <w:pict w14:anchorId="5C01C5D6">
+          <v:rect id="_x0000_i1091" style="width:0;height:1.5pt" o:hralign="center" o:hrstd="t" o:hr="t" fillcolor="#a0a0a0" stroked="f"/>
+        </w:pict>
+      </w:r>
+    </w:p>
+    <w:p>
+      <w:pPr>
+        <w:tabs>
+          <w:tab w:val="left" w:pos="2437"/>
+        </w:tabs>
+        <w:rPr>
+          <w:b/>
+          <w:bCs/>
+          <w:sz w:val="32"/>
+          <w:szCs w:val="32"/>
+          <w:lang w:val="en-US"/>
+        </w:rPr>
+      </w:pPr>
+    </w:p>
+    <w:p>
+      <w:pPr>
+        <w:tabs>
+          <w:tab w:val="left" w:pos="2437"/>
+        </w:tabs>
+        <w:rPr>
+          <w:b/>
+          <w:bCs/>
+          <w:sz w:val="32"/>
+          <w:szCs w:val="32"/>
+          <w:lang w:val="en-US"/>
+        </w:rPr>
+      </w:pPr>
+    </w:p>
+    <w:p>
+      <w:pPr>
+        <w:tabs>
+          <w:tab w:val="left" w:pos="2437"/>
+        </w:tabs>
+        <w:rPr>
+          <w:b/>
+          <w:bCs/>
+          <w:sz w:val="32"/>
+          <w:szCs w:val="32"/>
+          <w:lang w:val="en-US"/>
+        </w:rPr>
+      </w:pPr>
+    </w:p>
+    <w:p>
+      <w:pPr>
+        <w:tabs>
+          <w:tab w:val="left" w:pos="2437"/>
+        </w:tabs>
+        <w:rPr>
+          <w:b/>
+          <w:bCs/>
+          <w:sz w:val="32"/>
+          <w:szCs w:val="32"/>
+          <w:u w:val="single"/>
+          <w:lang w:val="en-US"/>
+        </w:rPr>
+      </w:pPr>
+      <w:r>
+        <w:rPr>
+          <w:b/>
+          <w:bCs/>
+          <w:sz w:val="32"/>
+          <w:szCs w:val="32"/>
+          <w:lang w:val="en-US"/>
+        </w:rPr>
+        <w:lastRenderedPageBreak/>
+        <w:t xml:space="preserve"># </w:t>
+      </w:r>
+      <w:r>
+        <w:rPr>
+          <w:b/>
+          <w:bCs/>
+          <w:sz w:val="32"/>
+          <w:szCs w:val="32"/>
+          <w:u w:val="single"/>
+          <w:lang w:val="en-US"/>
+        </w:rPr>
+        <w:t>IMPORTANT -&gt; USING FUNCTIONS</w:t>
+      </w:r>
+      <w:r>
+        <w:rPr>
+          <w:b/>
+          <w:bCs/>
+          <w:sz w:val="32"/>
+          <w:szCs w:val="32"/>
+          <w:u w:val="single"/>
+          <w:lang w:val="en-US"/>
+        </w:rPr>
+        <w:t xml:space="preserve"> AND LOOPS</w:t>
+      </w:r>
+      <w:r>
+        <w:rPr>
+          <w:b/>
+          <w:bCs/>
+          <w:sz w:val="32"/>
+          <w:szCs w:val="32"/>
+          <w:u w:val="single"/>
+          <w:lang w:val="en-US"/>
+        </w:rPr>
+        <w:t>:-</w:t>
+      </w:r>
+    </w:p>
+    <w:p>
+      <w:pPr>
+        <w:tabs>
+          <w:tab w:val="left" w:pos="2437"/>
+        </w:tabs>
+        <w:rPr>
+          <w:lang w:val="en-US"/>
+        </w:rPr>
+      </w:pPr>
+      <w:r>
+        <w:rPr>
+          <w:lang w:val="en-US"/>
+        </w:rPr>
+        <w:drawing>
+          <wp:inline distT="0" distB="0" distL="0" distR="0" wp14:anchorId="50747371" wp14:editId="4BA12E1D">
+            <wp:extent cx="5731510" cy="3859530"/>
+            <wp:effectExtent l="0" t="0" r="2540" b="7620"/>
+            <wp:docPr id="468346687" name="Picture 1"/>
+            <wp:cNvGraphicFramePr>
+              <a:graphicFrameLocks xmlns:a="http://schemas.openxmlformats.org/drawingml/2006/main" noChangeAspect="1"/>
+            </wp:cNvGraphicFramePr>
+            <a:graphic xmlns:a="http://schemas.openxmlformats.org/drawingml/2006/main">
+              <a:graphicData uri="http://schemas.openxmlformats.org/drawingml/2006/picture">
+                <pic:pic xmlns:pic="http://schemas.openxmlformats.org/drawingml/2006/picture">
+                  <pic:nvPicPr>
+                    <pic:cNvPr id="468346687" name=""/>
+                    <pic:cNvPicPr/>
+                  </pic:nvPicPr>
+                  <pic:blipFill>
+                    <a:blip r:embed="rId72"/>
+                    <a:stretch>
+                      <a:fillRect/>
+                    </a:stretch>
+                  </pic:blipFill>
+                  <pic:spPr>
+                    <a:xfrm>
+                      <a:off x="0" y="0"/>
+                      <a:ext cx="5731510" cy="3859530"/>
+                    </a:xfrm>
+                    <a:prstGeom prst="rect">
+                      <a:avLst/>
+                    </a:prstGeom>
+                  </pic:spPr>
+                </pic:pic>
+              </a:graphicData>
+            </a:graphic>
+          </wp:inline>
+        </w:drawing>
+      </w:r>
+    </w:p>
+    <w:p>
+      <w:pPr>
+        <w:tabs>
+          <w:tab w:val="left" w:pos="2437"/>
+        </w:tabs>
+      </w:pPr>
+      <w:r>
+        <w:drawing>
+          <wp:inline distT="0" distB="0" distL="0" distR="0" wp14:anchorId="3FE141E2" wp14:editId="1F47F036">
+            <wp:extent cx="5731510" cy="3194685"/>
+            <wp:effectExtent l="0" t="0" r="2540" b="5715"/>
+            <wp:docPr id="599790647" name="Picture 1"/>
+            <wp:cNvGraphicFramePr>
+              <a:graphicFrameLocks xmlns:a="http://schemas.openxmlformats.org/drawingml/2006/main" noChangeAspect="1"/>
+            </wp:cNvGraphicFramePr>
+            <a:graphic xmlns:a="http://schemas.openxmlformats.org/drawingml/2006/main">
+              <a:graphicData uri="http://schemas.openxmlformats.org/drawingml/2006/picture">
+                <pic:pic xmlns:pic="http://schemas.openxmlformats.org/drawingml/2006/picture">
+                  <pic:nvPicPr>
+                    <pic:cNvPr id="599790647" name=""/>
+                    <pic:cNvPicPr/>
+                  </pic:nvPicPr>
+                  <pic:blipFill>
+                    <a:blip r:embed="rId73"/>
+                    <a:stretch>
+                      <a:fillRect/>
+                    </a:stretch>
+                  </pic:blipFill>
+                  <pic:spPr>
+                    <a:xfrm>
+                      <a:off x="0" y="0"/>
+                      <a:ext cx="5731510" cy="3194685"/>
+                    </a:xfrm>
+                    <a:prstGeom prst="rect">
+                      <a:avLst/>
+                    </a:prstGeom>
+                  </pic:spPr>
+                </pic:pic>
+              </a:graphicData>
+            </a:graphic>
+          </wp:inline>
+        </w:drawing>
+      </w:r>
+      <w:r>
+        <w:pict w14:anchorId="2D3A6BB0">
+          <v:rect id="_x0000_i1093" style="width:0;height:1.5pt" o:hralign="center" o:hrstd="t" o:hr="t" fillcolor="#a0a0a0" stroked="f"/>
+        </w:pict>
+      </w:r>
+    </w:p>
+    <w:p>
+      <w:pPr>
+        <w:tabs>
+          <w:tab w:val="left" w:pos="2437"/>
+        </w:tabs>
+      </w:pPr>
+    </w:p>
+    <w:p>
+      <w:pPr>
+        <w:tabs>
+          <w:tab w:val="left" w:pos="2437"/>
+        </w:tabs>
+      </w:pPr>
+    </w:p>
+    <w:p>
+      <w:pPr>
+        <w:tabs>
+          <w:tab w:val="left" w:pos="2437"/>
+        </w:tabs>
+      </w:pPr>
+    </w:p>
+    <w:p>
+      <w:pPr>
+        <w:tabs>
+          <w:tab w:val="left" w:pos="2437"/>
+        </w:tabs>
+        <w:rPr>
+          <w:b/>
+          <w:bCs/>
+          <w:sz w:val="32"/>
+          <w:szCs w:val="32"/>
+          <w:u w:val="single"/>
+          <w:lang w:val="en-US"/>
+        </w:rPr>
+      </w:pPr>
+      <w:r>
+        <w:rPr>
+          <w:b/>
+          <w:bCs/>
+          <w:sz w:val="32"/>
+          <w:szCs w:val="32"/>
+          <w:lang w:val="en-US"/>
+        </w:rPr>
+        <w:lastRenderedPageBreak/>
+        <w:t xml:space="preserve"># </w:t>
+      </w:r>
+      <w:r>
+        <w:rPr>
+          <w:b/>
+          <w:bCs/>
+          <w:sz w:val="32"/>
+          <w:szCs w:val="32"/>
+          <w:u w:val="single"/>
+          <w:lang w:val="en-US"/>
+        </w:rPr>
+        <w:t xml:space="preserve">IMPORTANT -&gt; </w:t>
+      </w:r>
+      <w:r>
+        <w:rPr>
+          <w:b/>
+          <w:bCs/>
+          <w:sz w:val="32"/>
+          <w:szCs w:val="32"/>
+          <w:u w:val="single"/>
+          <w:lang w:val="en-US"/>
+        </w:rPr>
+        <w:t>USING ARRAYS, FUNCTIONS AND LOOPS</w:t>
+      </w:r>
+      <w:r>
+        <w:rPr>
+          <w:b/>
+          <w:bCs/>
+          <w:sz w:val="32"/>
+          <w:szCs w:val="32"/>
+          <w:u w:val="single"/>
+          <w:lang w:val="en-US"/>
+        </w:rPr>
+        <w:t>:-</w:t>
+      </w:r>
+    </w:p>
+    <w:p>
+      <w:pPr>
+        <w:tabs>
+          <w:tab w:val="left" w:pos="2437"/>
+        </w:tabs>
+      </w:pPr>
+      <w:r>
+        <w:drawing>
+          <wp:inline distT="0" distB="0" distL="0" distR="0" wp14:anchorId="2AAE68A7" wp14:editId="78731AEA">
+            <wp:extent cx="5731510" cy="2967355"/>
+            <wp:effectExtent l="0" t="0" r="2540" b="4445"/>
+            <wp:docPr id="774707153" name="Picture 1"/>
+            <wp:cNvGraphicFramePr>
+              <a:graphicFrameLocks xmlns:a="http://schemas.openxmlformats.org/drawingml/2006/main" noChangeAspect="1"/>
+            </wp:cNvGraphicFramePr>
+            <a:graphic xmlns:a="http://schemas.openxmlformats.org/drawingml/2006/main">
+              <a:graphicData uri="http://schemas.openxmlformats.org/drawingml/2006/picture">
+                <pic:pic xmlns:pic="http://schemas.openxmlformats.org/drawingml/2006/picture">
+                  <pic:nvPicPr>
+                    <pic:cNvPr id="774707153" name=""/>
+                    <pic:cNvPicPr/>
+                  </pic:nvPicPr>
+                  <pic:blipFill>
+                    <a:blip r:embed="rId74"/>
+                    <a:stretch>
+                      <a:fillRect/>
+                    </a:stretch>
+                  </pic:blipFill>
+                  <pic:spPr>
+                    <a:xfrm>
+                      <a:off x="0" y="0"/>
+                      <a:ext cx="5731510" cy="2967355"/>
+                    </a:xfrm>
+                    <a:prstGeom prst="rect">
+                      <a:avLst/>
+                    </a:prstGeom>
+                  </pic:spPr>
+                </pic:pic>
+              </a:graphicData>
+            </a:graphic>
+          </wp:inline>
+        </w:drawing>
+      </w:r>
+    </w:p>
+    <w:p>
+      <w:pPr>
+        <w:tabs>
+          <w:tab w:val="left" w:pos="2437"/>
+        </w:tabs>
+      </w:pPr>
+      <w:r>
+        <w:drawing>
+          <wp:inline distT="0" distB="0" distL="0" distR="0" wp14:anchorId="17B96FBC" wp14:editId="45D10026">
+            <wp:extent cx="5731510" cy="3094355"/>
+            <wp:effectExtent l="0" t="0" r="2540" b="0"/>
+            <wp:docPr id="942489840" name="Picture 1"/>
+            <wp:cNvGraphicFramePr>
+              <a:graphicFrameLocks xmlns:a="http://schemas.openxmlformats.org/drawingml/2006/main" noChangeAspect="1"/>
+            </wp:cNvGraphicFramePr>
+            <a:graphic xmlns:a="http://schemas.openxmlformats.org/drawingml/2006/main">
+              <a:graphicData uri="http://schemas.openxmlformats.org/drawingml/2006/picture">
+                <pic:pic xmlns:pic="http://schemas.openxmlformats.org/drawingml/2006/picture">
+                  <pic:nvPicPr>
+                    <pic:cNvPr id="942489840" name=""/>
+                    <pic:cNvPicPr/>
+                  </pic:nvPicPr>
+                  <pic:blipFill>
+                    <a:blip r:embed="rId75"/>
+                    <a:stretch>
+                      <a:fillRect/>
+                    </a:stretch>
+                  </pic:blipFill>
+                  <pic:spPr>
+                    <a:xfrm>
+                      <a:off x="0" y="0"/>
+                      <a:ext cx="5731510" cy="3094355"/>
+                    </a:xfrm>
+                    <a:prstGeom prst="rect">
+                      <a:avLst/>
+                    </a:prstGeom>
+                  </pic:spPr>
+                </pic:pic>
+              </a:graphicData>
+            </a:graphic>
+          </wp:inline>
+        </w:drawing>
+      </w:r>
       <w:r>
         <w:pict w14:anchorId="7C7637C4">
-          <v:rect id="_x0000_i1073" style="width:0;height:1.5pt" o:hralign="center" o:hrstd="t" o:hr="t" fillcolor="#a0a0a0" stroked="f"/>
+          <v:rect id="_x0000_i1090" style="width:0;height:1.5pt" o:hralign="center" o:hrstd="t" o:hr="t" fillcolor="#a0a0a0" stroked="f"/>
         </w:pict>
       </w:r>
     </w:p>
@@ -5850,15 +6382,29 @@
           <w:b/>
           <w:bCs/>
         </w:rPr>
-        <w:t>Surjo, ab ye dhyan se sun (Logic Connect):</w:t>
-      </w:r>
-    </w:p>
-    <w:p>
-      <w:pPr>
-        <w:tabs>
-          <w:tab w:val="left" w:pos="2437"/>
-        </w:tabs>
-      </w:pPr>
+        <w:t>S</w:t>
+      </w:r>
+      <w:r>
+        <w:rPr>
+          <w:b/>
+          <w:bCs/>
+        </w:rPr>
+        <w:t>ummary</w:t>
+      </w:r>
+      <w:r>
+        <w:rPr>
+          <w:b/>
+          <w:bCs/>
+        </w:rPr>
+        <w:t>:</w:t>
+      </w:r>
+      <w:r>
+        <w:rPr>
+          <w:b/>
+          <w:bCs/>
+        </w:rPr>
+        <w:t xml:space="preserve"> </w:t>
+      </w:r>
       <w:r>
         <w:t>Bhai, sir ne ye samjhaya ki ye coding kyu zaroori hai:</w:t>
       </w:r>
@@ -5905,7 +6451,6 @@
         </w:tabs>
       </w:pPr>
       <w:r>
-        <w:lastRenderedPageBreak/>
         <w:t xml:space="preserve">Tum HTML mein 100 cards nahi likhoge. Tum bas ek </w:t>
       </w:r>
       <w:r>

</xml_diff>